<commit_message>
Finalize Intro and DUT sections & integrate run_parallel
</commit_message>
<xml_diff>
--- a/Report/Final_Report.docx
+++ b/Report/Final_Report.docx
@@ -781,7 +781,76 @@
       </w:r>
       <w:bookmarkEnd w:id="0"/>
     </w:p>
-    <w:p/>
+    <w:p>
+      <w:pPr>
+        <w:ind w:firstLine="432"/>
+        <w:jc w:val="both"/>
+      </w:pPr>
+      <w:r>
+        <w:t xml:space="preserve">This report documents the verification environment developed for the SPI Master Controller IP as part of the Digital Design Verification final project at Ain Shams University, Spring 2026. The DUT mimics the register layout of production-grade SPI masters found in ARM MCUs, making the verification lessons directly transferable to industry practice. </w:t>
+      </w:r>
+    </w:p>
+    <w:p>
+      <w:pPr>
+        <w:ind w:firstLine="432"/>
+        <w:jc w:val="both"/>
+      </w:pPr>
+      <w:r>
+        <w:t>The verification methodology adopted is SystemVerilog-only, utilizing constrained-random stimulus, functional coverage, a reference model-based scoreboard, and SystemVerilog Assertions (SVA). The grading contract requires a minimum of 10 mandatory tests, ≥</w:t>
+      </w:r>
+      <w:r>
+        <w:t xml:space="preserve"> </w:t>
+      </w:r>
+      <w:r>
+        <w:t xml:space="preserve">85% functional coverage, and ≥5 SVA assertions bound into the DUT hierarchy. The bug detection target is 20 of 28 scored bugs; two bugs (BUG_E03/BUG_E04) were retired from scoring as they self-heal within one </w:t>
+      </w:r>
+      <w:r>
+        <w:rPr>
+          <w:b/>
+          <w:bCs/>
+        </w:rPr>
+        <w:t>PCLK</w:t>
+      </w:r>
+      <w:r>
+        <w:t xml:space="preserve"> cycle and are not observable from any APB stimulus path. Critically, the verification environment must remain functional when the golden RTL is replaced by any of the 28 buggy variants without modification.</w:t>
+      </w:r>
+    </w:p>
+    <w:p>
+      <w:pPr>
+        <w:ind w:firstLine="432"/>
+        <w:jc w:val="both"/>
+      </w:pPr>
+      <w:r>
+        <w:t>The objective of this project is to design and implement a comprehensive SystemVerilog verification environment capable of detecting functional bugs in the DUT against a defined specification.</w:t>
+      </w:r>
+    </w:p>
+    <w:p>
+      <w:pPr>
+        <w:ind w:firstLine="432"/>
+        <w:jc w:val="both"/>
+      </w:pPr>
+      <w:r>
+        <w:t>The report is organized as follows: Section 2 describes the DUT architecture and key requirements, Section 3 details the verification environment components, Section 4 presents simulation results, Section 5 discusses bugs found, and Section 6 concludes with lessons learned.</w:t>
+      </w:r>
+    </w:p>
+    <w:p>
+      <w:pPr>
+        <w:ind w:firstLine="432"/>
+        <w:jc w:val="both"/>
+      </w:pPr>
+    </w:p>
+    <w:p>
+      <w:pPr>
+        <w:ind w:firstLine="432"/>
+        <w:jc w:val="both"/>
+      </w:pPr>
+    </w:p>
+    <w:p>
+      <w:pPr>
+        <w:ind w:firstLine="432"/>
+        <w:jc w:val="both"/>
+      </w:pPr>
+    </w:p>
     <w:p>
       <w:pPr>
         <w:spacing w:line="259" w:lineRule="auto"/>
@@ -801,6 +870,196 @@
       </w:r>
       <w:bookmarkEnd w:id="1"/>
     </w:p>
+    <w:p>
+      <w:pPr>
+        <w:ind w:firstLine="432"/>
+        <w:jc w:val="both"/>
+      </w:pPr>
+      <w:r>
+        <w:t>The DUT is an SPI Master Controller IP implemented in SystemVerilog. It is structured as a three-file hierarchy: spi_master.sv serves as a thin top-level wrapper instantiating two sub-blocks</w:t>
+      </w:r>
+      <w:r>
+        <w:t xml:space="preserve">; </w:t>
+      </w:r>
+      <w:r>
+        <w:t xml:space="preserve">apb_regfile.sv, which implements the APB v2.0 slave interface, nine programmable registers, TX and RX FIFOs (8 entries, 32-bit wide each), and interrupt logic; and spi_core.sv, which implements the SPI shift FSM, SCLK generation, and MOSI drive logic. </w:t>
+      </w:r>
+    </w:p>
+    <w:p>
+      <w:pPr>
+        <w:ind w:firstLine="432"/>
+        <w:jc w:val="both"/>
+      </w:pPr>
+      <w:r>
+        <w:t xml:space="preserve">The DUT operates in a single PCLK domain, with SCLK derived as a divided and gated version of PCLK. Active-low </w:t>
+      </w:r>
+      <w:proofErr w:type="spellStart"/>
+      <w:r>
+        <w:t>PRESETn</w:t>
+      </w:r>
+      <w:proofErr w:type="spellEnd"/>
+      <w:r>
+        <w:t xml:space="preserve"> with synchronous </w:t>
+      </w:r>
+      <w:proofErr w:type="spellStart"/>
+      <w:r>
+        <w:t>deassertion</w:t>
+      </w:r>
+      <w:proofErr w:type="spellEnd"/>
+      <w:r>
+        <w:t xml:space="preserve"> is assumed, and all flops carry explicit reset values, eliminating X-optimism.</w:t>
+      </w:r>
+    </w:p>
+    <w:p>
+      <w:pPr>
+        <w:ind w:firstLine="432"/>
+        <w:jc w:val="both"/>
+      </w:pPr>
+      <w:r>
+        <w:t xml:space="preserve">The </w:t>
+      </w:r>
+      <w:proofErr w:type="spellStart"/>
+      <w:r>
+        <w:t>spi_core</w:t>
+      </w:r>
+      <w:proofErr w:type="spellEnd"/>
+      <w:r>
+        <w:t xml:space="preserve"> FSM operates across four states: S_IDLE, S_SHIFT, S_FINISH, and S_GAP. The S_GAP state activates only when DELAY ≠ 0 and another TX word is waiting, inserting idle cycles equal to (2 + DELAY) × (DIV+1) PCLK cycles between consecutive transfers. For CPHA=0, the first bit is presented on MOSI before the first SCLK edge; for CPHA=1, the first bit is launched on the first SCLK edge. Configuration registers </w:t>
+      </w:r>
+      <w:proofErr w:type="spellStart"/>
+      <w:r>
+        <w:t>cfg_mode</w:t>
+      </w:r>
+      <w:proofErr w:type="spellEnd"/>
+      <w:r>
+        <w:t xml:space="preserve">, </w:t>
+      </w:r>
+      <w:proofErr w:type="spellStart"/>
+      <w:r>
+        <w:t>cfg_lsb_first</w:t>
+      </w:r>
+      <w:proofErr w:type="spellEnd"/>
+      <w:r>
+        <w:t xml:space="preserve">, </w:t>
+      </w:r>
+      <w:proofErr w:type="spellStart"/>
+      <w:r>
+        <w:t>cfg_width</w:t>
+      </w:r>
+      <w:proofErr w:type="spellEnd"/>
+      <w:r>
+        <w:t xml:space="preserve">, and </w:t>
+      </w:r>
+      <w:proofErr w:type="spellStart"/>
+      <w:r>
+        <w:t>cfg_clk_div</w:t>
+      </w:r>
+      <w:proofErr w:type="spellEnd"/>
+      <w:r>
+        <w:t xml:space="preserve"> are latched into transfer-local xfer_* registers at the S_IDLE to S_SHIFT transition per R25, meaning mid-transfer register writes take effect only on the next transfer.</w:t>
+      </w:r>
+    </w:p>
+    <w:p>
+      <w:pPr>
+        <w:ind w:firstLine="432"/>
+        <w:jc w:val="both"/>
+      </w:pPr>
+      <w:proofErr w:type="spellStart"/>
+      <w:r>
+        <w:t>SS_n</w:t>
+      </w:r>
+      <w:proofErr w:type="spellEnd"/>
+      <w:r>
+        <w:t xml:space="preserve"> is driven </w:t>
+      </w:r>
+      <w:proofErr w:type="spellStart"/>
+      <w:r>
+        <w:t>combinationally</w:t>
+      </w:r>
+      <w:proofErr w:type="spellEnd"/>
+      <w:r>
+        <w:t xml:space="preserve"> by </w:t>
+      </w:r>
+      <w:proofErr w:type="spellStart"/>
+      <w:r>
+        <w:t>apb_regfile</w:t>
+      </w:r>
+      <w:proofErr w:type="spellEnd"/>
+      <w:r>
+        <w:t xml:space="preserve"> using the formula ~</w:t>
+      </w:r>
+      <w:proofErr w:type="spellStart"/>
+      <w:r>
+        <w:t>ss_en</w:t>
+      </w:r>
+      <w:proofErr w:type="spellEnd"/>
+      <w:r>
+        <w:t xml:space="preserve"> | </w:t>
+      </w:r>
+      <w:proofErr w:type="spellStart"/>
+      <w:r>
+        <w:t>ss_val</w:t>
+      </w:r>
+      <w:proofErr w:type="spellEnd"/>
+      <w:r>
+        <w:t xml:space="preserve">. The core observes </w:t>
+      </w:r>
+      <w:proofErr w:type="spellStart"/>
+      <w:r>
+        <w:t>SS_n</w:t>
+      </w:r>
+      <w:proofErr w:type="spellEnd"/>
+      <w:r>
+        <w:t xml:space="preserve"> through </w:t>
+      </w:r>
+      <w:proofErr w:type="spellStart"/>
+      <w:r>
+        <w:t>ss_n_drive</w:t>
+      </w:r>
+      <w:proofErr w:type="spellEnd"/>
+      <w:r>
+        <w:t xml:space="preserve"> and starts a transfer only when at least one SS lane is driven </w:t>
+      </w:r>
+      <w:r>
+        <w:t>low,</w:t>
+      </w:r>
+      <w:r>
+        <w:t xml:space="preserve"> and the TX FIFO is non-empty. Both the TX and RX FIFO pointers are reset not only on </w:t>
+      </w:r>
+      <w:proofErr w:type="spellStart"/>
+      <w:r>
+        <w:t>PRESETn</w:t>
+      </w:r>
+      <w:proofErr w:type="spellEnd"/>
+      <w:r>
+        <w:t xml:space="preserve"> </w:t>
+      </w:r>
+      <w:proofErr w:type="spellStart"/>
+      <w:r>
+        <w:t>deassertion</w:t>
+      </w:r>
+      <w:proofErr w:type="spellEnd"/>
+      <w:r>
+        <w:t xml:space="preserve"> but also whenever CTRL.EN is </w:t>
+      </w:r>
+      <w:proofErr w:type="spellStart"/>
+      <w:r>
+        <w:t>deasserted</w:t>
+      </w:r>
+      <w:proofErr w:type="spellEnd"/>
+      <w:r>
+        <w:t>, ensuring a clean state on every enable cycle.</w:t>
+      </w:r>
+    </w:p>
+    <w:p>
+      <w:pPr>
+        <w:ind w:firstLine="432"/>
+        <w:jc w:val="both"/>
+      </w:pPr>
+      <w:r>
+        <w:t>The five interrupt sources are TX_EMPTY (bit 0), RX_FULL (bit 1), TX_OVF (bit 2), RX_OVF (bit 3), and TRANSFER_DONE (bit 4). The IRQ output is the bitwise AND of INT_STAT and INT_EN. The STATUS register is read-only, TX_DATA is write-only with reads returning zero, and INT_STAT implements W1C semantics per R18.</w:t>
+      </w:r>
+    </w:p>
     <w:p/>
     <w:p>
       <w:r>
@@ -818,7 +1077,1082 @@
       </w:r>
       <w:bookmarkEnd w:id="2"/>
     </w:p>
-    <w:p/>
+    <w:p>
+      <w:pPr>
+        <w:ind w:firstLine="432"/>
+        <w:jc w:val="both"/>
+      </w:pPr>
+      <w:r>
+        <w:t xml:space="preserve">The verification environment is implemented in plain SystemVerilog following the SV-only track defined in the grading interface. The testbench top-level module, </w:t>
+      </w:r>
+      <w:proofErr w:type="spellStart"/>
+      <w:r>
+        <w:t>tb_top</w:t>
+      </w:r>
+      <w:proofErr w:type="spellEnd"/>
+      <w:r>
+        <w:t xml:space="preserve">, instantiates the DUT through a wrapper module </w:t>
+      </w:r>
+      <w:proofErr w:type="spellStart"/>
+      <w:r>
+        <w:t>dut_wrapper</w:t>
+      </w:r>
+      <w:proofErr w:type="spellEnd"/>
+      <w:r>
+        <w:t xml:space="preserve">, which exposes the APB and SPI interfaces and binds the SVA module into the DUT hierarchy. Test dispatch is controlled via the +TESTNAME=&lt;name&gt; </w:t>
+      </w:r>
+      <w:proofErr w:type="spellStart"/>
+      <w:r>
+        <w:t>plusarg</w:t>
+      </w:r>
+      <w:proofErr w:type="spellEnd"/>
+      <w:r>
+        <w:t xml:space="preserve">, with the </w:t>
+      </w:r>
+      <w:proofErr w:type="spellStart"/>
+      <w:r>
+        <w:t>Makefile</w:t>
+      </w:r>
+      <w:proofErr w:type="spellEnd"/>
+      <w:r>
+        <w:t xml:space="preserve"> passing both +TESTNAME and +UVM_TESTNAME for compatibility.</w:t>
+      </w:r>
+    </w:p>
+    <w:p>
+      <w:pPr>
+        <w:ind w:firstLine="432"/>
+        <w:jc w:val="both"/>
+      </w:pPr>
+      <w:r>
+        <w:t>The environment consists of four principal components: APB Master BFM, SPI Slave BFM, Reference Model, and the Coverage Collector.</w:t>
+      </w:r>
+    </w:p>
+    <w:p>
+      <w:pPr>
+        <w:ind w:firstLine="432"/>
+        <w:jc w:val="both"/>
+      </w:pPr>
+      <w:r>
+        <w:t>The APB Master BFM drives the APB interface to perform register read and write transactions, abstracting protocol timing from the test layer.</w:t>
+      </w:r>
+      <w:r>
+        <w:t xml:space="preserve"> </w:t>
+      </w:r>
+      <w:r>
+        <w:t xml:space="preserve">The SPI Slave BFM monitors and drives the SPI bus, capturing MOSI data and responding on MISO according to the configured mode, width, and bit order. </w:t>
+      </w:r>
+    </w:p>
+    <w:p>
+      <w:pPr>
+        <w:ind w:firstLine="432"/>
+        <w:jc w:val="both"/>
+      </w:pPr>
+      <w:r>
+        <w:t xml:space="preserve">The reference model maintains a predicted state of the DUT, including TX and RX FIFO occupancy, interrupt status, and expected RX data for each transfer, emitting [SCOREBOARD_ERROR] messages on any mismatch between prediction and observation. The reference model enforces a strict contract: </w:t>
+      </w:r>
+      <w:proofErr w:type="spellStart"/>
+      <w:r>
+        <w:t>predict_transfer</w:t>
+      </w:r>
+      <w:proofErr w:type="spellEnd"/>
+      <w:r>
+        <w:t xml:space="preserve">() must be called before every TX push, and </w:t>
+      </w:r>
+      <w:proofErr w:type="spellStart"/>
+      <w:r>
+        <w:t>verify_rx_drain</w:t>
+      </w:r>
+      <w:proofErr w:type="spellEnd"/>
+      <w:r>
+        <w:t>() must be called after every RX read, maintaining queue balance at all times.</w:t>
+      </w:r>
+    </w:p>
+    <w:p>
+      <w:pPr>
+        <w:ind w:firstLine="432"/>
+        <w:jc w:val="both"/>
+      </w:pPr>
+      <w:r>
+        <w:t xml:space="preserve">The coverage collector implements fourteen </w:t>
+      </w:r>
+      <w:proofErr w:type="spellStart"/>
+      <w:r>
+        <w:t>covergroups</w:t>
+      </w:r>
+      <w:proofErr w:type="spellEnd"/>
+      <w:r>
+        <w:t xml:space="preserve"> targeting the full configuration space, including SPI mode, transfer width, bit order, CLK_DIV corners, FIFO occupancy, interrupt sources, W1C behavior, loopback, delay, and slave select control. Notably, </w:t>
+      </w:r>
+      <w:proofErr w:type="spellStart"/>
+      <w:r>
+        <w:t>cg_irq</w:t>
+      </w:r>
+      <w:proofErr w:type="spellEnd"/>
+      <w:r>
+        <w:t xml:space="preserve"> </w:t>
+      </w:r>
+      <w:r>
+        <w:t xml:space="preserve">covers the W1C race condition defined in </w:t>
+      </w:r>
+      <w:r>
+        <w:rPr>
+          <w:b/>
+          <w:bCs/>
+        </w:rPr>
+        <w:t>R18</w:t>
+      </w:r>
+      <w:r>
+        <w:t>, where a hardware event sets a bit on the exact same cycle that software writes a W1C clear</w:t>
+      </w:r>
+      <w:r>
+        <w:t xml:space="preserve">, </w:t>
+      </w:r>
+      <w:r>
+        <w:t xml:space="preserve">the specification requires the set to win. </w:t>
+      </w:r>
+    </w:p>
+    <w:p>
+      <w:pPr>
+        <w:ind w:firstLine="432"/>
+        <w:jc w:val="both"/>
+      </w:pPr>
+      <w:r>
+        <w:t xml:space="preserve">APB protocol correctness is captured in </w:t>
+      </w:r>
+      <w:proofErr w:type="spellStart"/>
+      <w:r>
+        <w:t>cg_apb_protocol</w:t>
+      </w:r>
+      <w:proofErr w:type="spellEnd"/>
+      <w:r>
+        <w:t xml:space="preserve">, which enforces that </w:t>
+      </w:r>
+      <w:r>
+        <w:rPr>
+          <w:b/>
+          <w:bCs/>
+        </w:rPr>
+        <w:t>PSLVERR</w:t>
+      </w:r>
+      <w:r>
+        <w:t xml:space="preserve"> remains low and </w:t>
+      </w:r>
+      <w:r>
+        <w:rPr>
+          <w:b/>
+          <w:bCs/>
+        </w:rPr>
+        <w:t>PREADY</w:t>
+      </w:r>
+      <w:r>
+        <w:t xml:space="preserve"> remains high on every access. The </w:t>
+      </w:r>
+      <w:proofErr w:type="spellStart"/>
+      <w:r>
+        <w:t>cg_ctrl_en</w:t>
+      </w:r>
+      <w:proofErr w:type="spellEnd"/>
+      <w:r>
+        <w:t xml:space="preserve"> </w:t>
+      </w:r>
+      <w:proofErr w:type="spellStart"/>
+      <w:r>
+        <w:t>covergroup</w:t>
+      </w:r>
+      <w:proofErr w:type="spellEnd"/>
+      <w:r>
+        <w:t xml:space="preserve"> specifically targets the non-trivial case where EN=0 must override an active SS_CTRL configuration, closing the </w:t>
+      </w:r>
+      <w:proofErr w:type="spellStart"/>
+      <w:r>
+        <w:t>cp_ss_high</w:t>
+      </w:r>
+      <w:proofErr w:type="spellEnd"/>
+      <w:r>
+        <w:t xml:space="preserve"> bin. Reserved address accesses at offsets ≥ 0x24 are covered by </w:t>
+      </w:r>
+      <w:proofErr w:type="spellStart"/>
+      <w:r>
+        <w:t>cg_reserved</w:t>
+      </w:r>
+      <w:proofErr w:type="spellEnd"/>
+      <w:r>
+        <w:t xml:space="preserve">, verifying that reads return zero and writes are silently ignored per </w:t>
+      </w:r>
+      <w:r>
+        <w:rPr>
+          <w:b/>
+          <w:bCs/>
+        </w:rPr>
+        <w:t>R23</w:t>
+      </w:r>
+      <w:r>
+        <w:t>.</w:t>
+      </w:r>
+    </w:p>
+    <w:p>
+      <w:pPr>
+        <w:ind w:firstLine="432"/>
+        <w:jc w:val="both"/>
+      </w:pPr>
+      <w:r>
+        <w:lastRenderedPageBreak/>
+        <w:t xml:space="preserve">In summary: </w:t>
+      </w:r>
+      <w:r>
+        <w:t>Thirty Seven</w:t>
+      </w:r>
+      <w:r>
+        <w:t xml:space="preserve"> SVA assertions are bound into the DUT hierarchy via </w:t>
+      </w:r>
+      <w:proofErr w:type="spellStart"/>
+      <w:r>
+        <w:t>u_wrap.u_dut.u_regfile</w:t>
+      </w:r>
+      <w:proofErr w:type="spellEnd"/>
+      <w:r>
+        <w:t xml:space="preserve"> and </w:t>
+      </w:r>
+      <w:proofErr w:type="spellStart"/>
+      <w:r>
+        <w:t>u_wrap.u_dut.u_core</w:t>
+      </w:r>
+      <w:proofErr w:type="spellEnd"/>
+      <w:r>
+        <w:t xml:space="preserve">, checking properties including SCLK idle level, </w:t>
+      </w:r>
+      <w:proofErr w:type="spellStart"/>
+      <w:r>
+        <w:t>SS_n</w:t>
+      </w:r>
+      <w:proofErr w:type="spellEnd"/>
+      <w:r>
+        <w:t xml:space="preserve"> behavior when EN=0, and BUSY assertion during active transfers. These hierarchical paths are also used for backdoor register reads during reset value verification.</w:t>
+      </w:r>
+    </w:p>
+    <w:p>
+      <w:pPr>
+        <w:pStyle w:val="Heading2"/>
+      </w:pPr>
+      <w:r>
+        <w:t>Regression Infrastructure</w:t>
+      </w:r>
+    </w:p>
+    <w:p>
+      <w:pPr>
+        <w:pStyle w:val="Heading3"/>
+      </w:pPr>
+      <w:r>
+        <w:t>What Does This Script Do?</w:t>
+      </w:r>
+    </w:p>
+    <w:p>
+      <w:pPr>
+        <w:ind w:firstLine="720"/>
+      </w:pPr>
+      <w:r>
+        <w:t>run_parallel.py is a regression runner for SystemVerilog hardware simulations. It runs many test/seed combinations at the same time using multiple threads, collects pass/fail results, prints a summary table, and optionally merges Questa coverage databases</w:t>
+      </w:r>
+      <w:r>
+        <w:t xml:space="preserve">, </w:t>
+      </w:r>
+      <w:r>
+        <w:t>all driven from a single command-line call.</w:t>
+      </w:r>
+    </w:p>
+    <w:p>
+      <w:pPr>
+        <w:pStyle w:val="Heading3"/>
+      </w:pPr>
+      <w:r>
+        <w:t>Block-by-Block Explanation</w:t>
+      </w:r>
+    </w:p>
+    <w:p>
+      <w:pPr>
+        <w:pStyle w:val="Heading4"/>
+      </w:pPr>
+      <w:r>
+        <w:t>Imports &amp; Constants</w:t>
+      </w:r>
+      <w:r>
+        <w:t>:</w:t>
+      </w:r>
+      <w:r>
+        <w:t xml:space="preserve"> </w:t>
+      </w:r>
+    </w:p>
+    <w:p>
+      <w:r>
+        <w:t>Loads Python's standard libraries (argument parsing, file system, subprocesses, threading, timing) and defines fixed values used throughout: default seeds (just seed 1), up to 10 parallel workers, the build folder, and the full list of 11 test names.</w:t>
+      </w:r>
+    </w:p>
+    <w:p>
+      <w:r>
+        <w:t>DEFAULT_SEEDS = list(range(1, 2))   MAX_WORKERS = 10   BUILD_DIR = Path("build")</w:t>
+      </w:r>
+    </w:p>
+    <w:p>
+      <w:pPr>
+        <w:pStyle w:val="Heading4"/>
+      </w:pPr>
+      <w:r>
+        <w:t>Data Classes</w:t>
+      </w:r>
+      <w:r>
+        <w:t>:</w:t>
+      </w:r>
+      <w:r>
+        <w:t xml:space="preserve"> </w:t>
+      </w:r>
+    </w:p>
+    <w:p>
+      <w:r>
+        <w:t>Two lightweight data containers. Job holds a test name + seed and auto-computes the log file path. Result stores the outcome: passed or not, elapsed time in seconds, and any error message from a crashed subprocess.</w:t>
+      </w:r>
+    </w:p>
+    <w:p>
+      <w:r>
+        <w:t>@dataclass Job(test, seed)  →  log = build/log_&lt;test&gt;_&lt;seed&gt;.log</w:t>
+      </w:r>
+    </w:p>
+    <w:p>
+      <w:pPr>
+        <w:pStyle w:val="Heading4"/>
+      </w:pPr>
+      <w:proofErr w:type="spellStart"/>
+      <w:r>
+        <w:t>compile_project</w:t>
+      </w:r>
+      <w:proofErr w:type="spellEnd"/>
+      <w:r>
+        <w:t>()</w:t>
+      </w:r>
+      <w:r>
+        <w:t>:</w:t>
+      </w:r>
+      <w:r>
+        <w:t xml:space="preserve"> </w:t>
+      </w:r>
+    </w:p>
+    <w:p>
+      <w:r>
+        <w:t>Runs 'make compile' once before any tests start. Streams the compiler output to the terminal so you can watch for errors in real time. Returns True on success or False on failure so main() can abort early.</w:t>
+      </w:r>
+    </w:p>
+    <w:p>
+      <w:proofErr w:type="spellStart"/>
+      <w:r>
+        <w:t>subprocess.run</w:t>
+      </w:r>
+      <w:proofErr w:type="spellEnd"/>
+      <w:r>
+        <w:t xml:space="preserve">(["make", "compile"], </w:t>
+      </w:r>
+      <w:proofErr w:type="spellStart"/>
+      <w:r>
+        <w:t>cwd</w:t>
+      </w:r>
+      <w:proofErr w:type="spellEnd"/>
+      <w:r>
+        <w:t>=</w:t>
+      </w:r>
+      <w:proofErr w:type="spellStart"/>
+      <w:r>
+        <w:t>makefile_dir</w:t>
+      </w:r>
+      <w:proofErr w:type="spellEnd"/>
+      <w:r>
+        <w:t>)</w:t>
+      </w:r>
+    </w:p>
+    <w:p>
+      <w:pPr>
+        <w:pStyle w:val="Heading4"/>
+      </w:pPr>
+      <w:proofErr w:type="spellStart"/>
+      <w:r>
+        <w:lastRenderedPageBreak/>
+        <w:t>run_job</w:t>
+      </w:r>
+      <w:proofErr w:type="spellEnd"/>
+      <w:r>
+        <w:t>()</w:t>
+      </w:r>
+      <w:r>
+        <w:t>:</w:t>
+      </w:r>
+      <w:r>
+        <w:t xml:space="preserve"> </w:t>
+      </w:r>
+    </w:p>
+    <w:p>
+      <w:pPr>
+        <w:ind w:firstLine="720"/>
+        <w:jc w:val="both"/>
+      </w:pPr>
+      <w:r>
+        <w:t xml:space="preserve">Runs a single simulation: calls 'make run TEST=… SEED=… WAVES=0', captures </w:t>
+      </w:r>
+      <w:proofErr w:type="spellStart"/>
+      <w:r>
+        <w:t>stdout+stderr</w:t>
+      </w:r>
+      <w:proofErr w:type="spellEnd"/>
+      <w:r>
+        <w:t>, saves them to the job's log file, then calls _</w:t>
+      </w:r>
+      <w:proofErr w:type="spellStart"/>
+      <w:r>
+        <w:t>detect_pass</w:t>
+      </w:r>
+      <w:proofErr w:type="spellEnd"/>
+      <w:r>
+        <w:t>() to decide pass or fail. Wrapped in try/except so a crashed subprocess still produces a Result.</w:t>
+      </w:r>
+    </w:p>
+    <w:p>
+      <w:pPr>
+        <w:pStyle w:val="Monospace"/>
+        <w:jc w:val="both"/>
+      </w:pPr>
+      <w:proofErr w:type="spellStart"/>
+      <w:r>
+        <w:t>cmd</w:t>
+      </w:r>
+      <w:proofErr w:type="spellEnd"/>
+      <w:r>
+        <w:t xml:space="preserve"> = ["make", "-s", "run", </w:t>
+      </w:r>
+      <w:proofErr w:type="spellStart"/>
+      <w:r>
+        <w:t>f"TEST</w:t>
+      </w:r>
+      <w:proofErr w:type="spellEnd"/>
+      <w:r>
+        <w:t>={</w:t>
+      </w:r>
+      <w:proofErr w:type="spellStart"/>
+      <w:r>
+        <w:t>job.test</w:t>
+      </w:r>
+      <w:proofErr w:type="spellEnd"/>
+      <w:r>
+        <w:t xml:space="preserve">}", </w:t>
+      </w:r>
+      <w:proofErr w:type="spellStart"/>
+      <w:r>
+        <w:t>f"SEED</w:t>
+      </w:r>
+      <w:proofErr w:type="spellEnd"/>
+      <w:r>
+        <w:t>={</w:t>
+      </w:r>
+      <w:proofErr w:type="spellStart"/>
+      <w:r>
+        <w:t>job.seed</w:t>
+      </w:r>
+      <w:proofErr w:type="spellEnd"/>
+      <w:r>
+        <w:t>}", "WAVES=0"]</w:t>
+      </w:r>
+    </w:p>
+    <w:p>
+      <w:pPr>
+        <w:pStyle w:val="Heading4"/>
+        <w:jc w:val="both"/>
+      </w:pPr>
+      <w:r>
+        <w:t>_</w:t>
+      </w:r>
+      <w:proofErr w:type="spellStart"/>
+      <w:r>
+        <w:t>detect_pass</w:t>
+      </w:r>
+      <w:proofErr w:type="spellEnd"/>
+      <w:r>
+        <w:t>()</w:t>
+      </w:r>
+      <w:r>
+        <w:t>:</w:t>
+      </w:r>
+      <w:r>
+        <w:t xml:space="preserve"> </w:t>
+      </w:r>
+    </w:p>
+    <w:p>
+      <w:pPr>
+        <w:ind w:firstLine="720"/>
+        <w:jc w:val="both"/>
+      </w:pPr>
+      <w:r>
+        <w:t>Scans log text for Questa/UVM keywords. Failure markers are checked first (TEST FAILED, ** ERROR, ASSERTION FAILED). If none found, checks for pass markers (TEST PASSED, SIMULATION PASSED). Falls back to the make exit code if neither pattern appears.</w:t>
+      </w:r>
+    </w:p>
+    <w:p>
+      <w:pPr>
+        <w:pStyle w:val="Monospace"/>
+        <w:jc w:val="both"/>
+      </w:pPr>
+      <w:r>
+        <w:t>if "TEST FAILED" in upper: return False   if "TEST PASSED" in upper: return True</w:t>
+      </w:r>
+    </w:p>
+    <w:p>
+      <w:pPr>
+        <w:pStyle w:val="Heading4"/>
+        <w:jc w:val="both"/>
+      </w:pPr>
+      <w:r>
+        <w:t>_</w:t>
+      </w:r>
+      <w:proofErr w:type="spellStart"/>
+      <w:r>
+        <w:t>extract_errors</w:t>
+      </w:r>
+      <w:proofErr w:type="spellEnd"/>
+      <w:r>
+        <w:t>()</w:t>
+      </w:r>
+      <w:r>
+        <w:t>:</w:t>
+      </w:r>
+      <w:r>
+        <w:t xml:space="preserve"> </w:t>
+      </w:r>
+    </w:p>
+    <w:p>
+      <w:pPr>
+        <w:ind w:firstLine="720"/>
+        <w:jc w:val="both"/>
+      </w:pPr>
+      <w:r>
+        <w:t xml:space="preserve">Opens a failed job's log and returns up to 5 distinct lines that contain error-related keywords (** error, </w:t>
+      </w:r>
+      <w:proofErr w:type="spellStart"/>
+      <w:r>
+        <w:t>uvm_fatal</w:t>
+      </w:r>
+      <w:proofErr w:type="spellEnd"/>
+      <w:r>
+        <w:t>, assertion failed, traceback, etc.). These lines are shown in the summary so you don't need to open the full log to understand why a test failed.</w:t>
+      </w:r>
+    </w:p>
+    <w:p>
+      <w:pPr>
+        <w:pStyle w:val="Monospace"/>
+        <w:jc w:val="both"/>
+      </w:pPr>
+      <w:r>
+        <w:t>keywords = ["** error", "</w:t>
+      </w:r>
+      <w:proofErr w:type="spellStart"/>
+      <w:r>
+        <w:t>uvm_fatal</w:t>
+      </w:r>
+      <w:proofErr w:type="spellEnd"/>
+      <w:r>
+        <w:t>", "assertion failed", "traceback", ...]</w:t>
+      </w:r>
+    </w:p>
+    <w:p>
+      <w:pPr>
+        <w:pStyle w:val="Heading4"/>
+        <w:jc w:val="both"/>
+      </w:pPr>
+      <w:proofErr w:type="spellStart"/>
+      <w:r>
+        <w:t>print_summary</w:t>
+      </w:r>
+      <w:proofErr w:type="spellEnd"/>
+      <w:r>
+        <w:t>()</w:t>
+      </w:r>
+      <w:r>
+        <w:t>:</w:t>
+      </w:r>
+      <w:r>
+        <w:t xml:space="preserve"> </w:t>
+      </w:r>
+    </w:p>
+    <w:p>
+      <w:pPr>
+        <w:ind w:firstLine="720"/>
+        <w:jc w:val="both"/>
+      </w:pPr>
+      <w:r>
+        <w:t>P</w:t>
+      </w:r>
+      <w:r>
+        <w:t xml:space="preserve">rints a nicely aligned table of every result (sorted by test + seed) showing a </w:t>
+      </w:r>
+      <w:r>
+        <w:rPr>
+          <w:rFonts w:ascii="Segoe UI Symbol" w:hAnsi="Segoe UI Symbol" w:cs="Segoe UI Symbol"/>
+        </w:rPr>
+        <w:t>✔</w:t>
+      </w:r>
+      <w:r>
+        <w:t>/</w:t>
+      </w:r>
+      <w:r>
+        <w:rPr>
+          <w:rFonts w:ascii="Segoe UI Symbol" w:hAnsi="Segoe UI Symbol" w:cs="Segoe UI Symbol"/>
+        </w:rPr>
+        <w:t>✗</w:t>
+      </w:r>
+      <w:r>
+        <w:t xml:space="preserve"> mark, PASS/FAIL status, elapsed time, and log path. Below the table, failed runs are listed individually with their extracted error lines. Returns the failure count for use as the exit code.</w:t>
+      </w:r>
+    </w:p>
+    <w:p>
+      <w:pPr>
+        <w:pStyle w:val="Monospace"/>
+        <w:jc w:val="both"/>
+      </w:pPr>
+      <w:r>
+        <w:rPr>
+          <w:rFonts w:ascii="Segoe UI Symbol" w:hAnsi="Segoe UI Symbol" w:cs="Segoe UI Symbol"/>
+        </w:rPr>
+        <w:t>✔</w:t>
+      </w:r>
+      <w:r>
+        <w:t xml:space="preserve"> </w:t>
+      </w:r>
+      <w:proofErr w:type="spellStart"/>
+      <w:r>
+        <w:t>sanity_test</w:t>
+      </w:r>
+      <w:proofErr w:type="spellEnd"/>
+      <w:r>
+        <w:t xml:space="preserve">   seed=1   PASS   12.3s   build/log_sanity_test_1.log</w:t>
+      </w:r>
+    </w:p>
+    <w:p>
+      <w:pPr>
+        <w:pStyle w:val="Heading4"/>
+        <w:jc w:val="both"/>
+      </w:pPr>
+      <w:proofErr w:type="spellStart"/>
+      <w:r>
+        <w:t>parse_args</w:t>
+      </w:r>
+      <w:proofErr w:type="spellEnd"/>
+      <w:r>
+        <w:t>()</w:t>
+      </w:r>
+      <w:r>
+        <w:t>:</w:t>
+      </w:r>
+      <w:r>
+        <w:t xml:space="preserve"> </w:t>
+      </w:r>
+    </w:p>
+    <w:p>
+      <w:pPr>
+        <w:ind w:firstLine="720"/>
+        <w:jc w:val="both"/>
+      </w:pPr>
+      <w:r>
+        <w:t>Defines the command-line interface. Five flags: --seeds (which seeds), --tests (which tests), --workers (parallelism level), --compile (run make compile first), --compile-only (compile and quit), and --</w:t>
+      </w:r>
+      <w:proofErr w:type="spellStart"/>
+      <w:r>
+        <w:t>makefile-dir</w:t>
+      </w:r>
+      <w:proofErr w:type="spellEnd"/>
+      <w:r>
+        <w:t xml:space="preserve"> (where the </w:t>
+      </w:r>
+      <w:proofErr w:type="spellStart"/>
+      <w:r>
+        <w:t>Makefile</w:t>
+      </w:r>
+      <w:proofErr w:type="spellEnd"/>
+      <w:r>
+        <w:t xml:space="preserve"> lives).</w:t>
+      </w:r>
+    </w:p>
+    <w:p>
+      <w:pPr>
+        <w:pStyle w:val="Monospace"/>
+        <w:jc w:val="both"/>
+      </w:pPr>
+      <w:r>
+        <w:t xml:space="preserve">python run_parallel.py --tests </w:t>
+      </w:r>
+      <w:proofErr w:type="spellStart"/>
+      <w:r>
+        <w:t>sanity_test</w:t>
+      </w:r>
+      <w:proofErr w:type="spellEnd"/>
+      <w:r>
+        <w:t xml:space="preserve"> --seeds 1 2 3 --workers 4 </w:t>
+      </w:r>
+      <w:r>
+        <w:t>–</w:t>
+      </w:r>
+      <w:r>
+        <w:t>compile</w:t>
+      </w:r>
+    </w:p>
+    <w:p>
+      <w:pPr>
+        <w:pStyle w:val="Heading4"/>
+      </w:pPr>
+      <w:r>
+        <w:lastRenderedPageBreak/>
+        <w:t>main() — Setup &amp; Job Launch</w:t>
+      </w:r>
+      <w:r>
+        <w:t xml:space="preserve">: </w:t>
+      </w:r>
+    </w:p>
+    <w:p>
+      <w:pPr>
+        <w:ind w:firstLine="720"/>
+      </w:pPr>
+      <w:r>
+        <w:t xml:space="preserve">Entry point. Resolves the </w:t>
+      </w:r>
+      <w:proofErr w:type="spellStart"/>
+      <w:r>
+        <w:t>Makefile</w:t>
+      </w:r>
+      <w:proofErr w:type="spellEnd"/>
+      <w:r>
+        <w:t xml:space="preserve"> path, optionally compiles, builds the full list of (test × seed) Job objects, then submits them all to a </w:t>
+      </w:r>
+      <w:proofErr w:type="spellStart"/>
+      <w:r>
+        <w:t>ThreadPoolExecutor</w:t>
+      </w:r>
+      <w:proofErr w:type="spellEnd"/>
+      <w:r>
+        <w:t>. As each future completes it prints a live progress line showing rank, status, test name, seed, and time.</w:t>
+      </w:r>
+    </w:p>
+    <w:p>
+      <w:pPr>
+        <w:pStyle w:val="Monospace"/>
+      </w:pPr>
+      <w:r>
+        <w:t xml:space="preserve">with </w:t>
+      </w:r>
+      <w:proofErr w:type="spellStart"/>
+      <w:r>
+        <w:t>ThreadPoolExecutor</w:t>
+      </w:r>
+      <w:proofErr w:type="spellEnd"/>
+      <w:r>
+        <w:t>(</w:t>
+      </w:r>
+      <w:proofErr w:type="spellStart"/>
+      <w:r>
+        <w:t>max_workers</w:t>
+      </w:r>
+      <w:proofErr w:type="spellEnd"/>
+      <w:r>
+        <w:t>=workers) as pool:   futures = {</w:t>
+      </w:r>
+      <w:proofErr w:type="spellStart"/>
+      <w:r>
+        <w:t>pool.submit</w:t>
+      </w:r>
+      <w:proofErr w:type="spellEnd"/>
+      <w:r>
+        <w:t>(</w:t>
+      </w:r>
+      <w:proofErr w:type="spellStart"/>
+      <w:r>
+        <w:t>run_job</w:t>
+      </w:r>
+      <w:proofErr w:type="spellEnd"/>
+      <w:r>
+        <w:t>, job, ...) ...}</w:t>
+      </w:r>
+    </w:p>
+    <w:p>
+      <w:pPr>
+        <w:pStyle w:val="Heading4"/>
+      </w:pPr>
+      <w:r>
+        <w:t>main() — Timing Summary</w:t>
+      </w:r>
+      <w:r>
+        <w:t xml:space="preserve">: </w:t>
+      </w:r>
+    </w:p>
+    <w:p>
+      <w:pPr>
+        <w:ind w:firstLine="720"/>
+      </w:pPr>
+      <w:r>
+        <w:t xml:space="preserve">After all threads finish, computes wall-clock duration (h/m/s) and the sequential equivalent (sum of individual run times). Prints a speedup factor so you can see how much parallelism helped, </w:t>
+      </w:r>
+      <w:r>
+        <w:t>e.g.,</w:t>
+      </w:r>
+      <w:r>
+        <w:t xml:space="preserve"> '8.3x (would have taken 450 s sequentially)'.</w:t>
+      </w:r>
+    </w:p>
+    <w:p>
+      <w:pPr>
+        <w:pStyle w:val="Monospace"/>
+        <w:jc w:val="center"/>
+      </w:pPr>
+      <w:r>
+        <w:t>Speedup:</w:t>
+      </w:r>
+      <w:r>
+        <w:t xml:space="preserve"> </w:t>
+      </w:r>
+      <w:r>
+        <w:t>8.3x (</w:t>
+      </w:r>
+      <w:r>
+        <w:t>would have taken 450s sequentially)</w:t>
+      </w:r>
+    </w:p>
+    <w:p>
+      <w:pPr>
+        <w:pStyle w:val="Heading4"/>
+      </w:pPr>
+      <w:r>
+        <w:t>main() — Coverage Merge</w:t>
+      </w:r>
+    </w:p>
+    <w:p>
+      <w:pPr>
+        <w:ind w:firstLine="720"/>
+      </w:pPr>
+      <w:r>
+        <w:t>After results are printed, searches for Questa .</w:t>
+      </w:r>
+      <w:proofErr w:type="spellStart"/>
+      <w:r>
+        <w:t>ucdb</w:t>
+      </w:r>
+      <w:proofErr w:type="spellEnd"/>
+      <w:r>
+        <w:t xml:space="preserve"> coverage database files. If found, merges them with '</w:t>
+      </w:r>
+      <w:proofErr w:type="spellStart"/>
+      <w:r>
+        <w:t>vcover</w:t>
+      </w:r>
+      <w:proofErr w:type="spellEnd"/>
+      <w:r>
+        <w:t xml:space="preserve"> merge' into build/</w:t>
+      </w:r>
+      <w:proofErr w:type="spellStart"/>
+      <w:r>
+        <w:t>merged.ucdb</w:t>
+      </w:r>
+      <w:proofErr w:type="spellEnd"/>
+      <w:r>
+        <w:t>, then generates a human-readable coverage_report.txt with '</w:t>
+      </w:r>
+      <w:proofErr w:type="spellStart"/>
+      <w:r>
+        <w:t>vcover</w:t>
+      </w:r>
+      <w:proofErr w:type="spellEnd"/>
+      <w:r>
+        <w:t xml:space="preserve"> report'. Warns if no .</w:t>
+      </w:r>
+      <w:proofErr w:type="spellStart"/>
+      <w:r>
+        <w:t>ucdb</w:t>
+      </w:r>
+      <w:proofErr w:type="spellEnd"/>
+      <w:r>
+        <w:t xml:space="preserve"> files are found.</w:t>
+      </w:r>
+    </w:p>
+    <w:p>
+      <w:pPr>
+        <w:pStyle w:val="Monospace"/>
+      </w:pPr>
+      <w:proofErr w:type="spellStart"/>
+      <w:r>
+        <w:t>vcover</w:t>
+      </w:r>
+      <w:proofErr w:type="spellEnd"/>
+      <w:r>
+        <w:t xml:space="preserve"> merge -out build/</w:t>
+      </w:r>
+      <w:proofErr w:type="spellStart"/>
+      <w:r>
+        <w:t>merged.ucdb</w:t>
+      </w:r>
+      <w:proofErr w:type="spellEnd"/>
+      <w:r>
+        <w:t xml:space="preserve"> *.</w:t>
+      </w:r>
+      <w:proofErr w:type="spellStart"/>
+      <w:r>
+        <w:t>ucdb</w:t>
+      </w:r>
+      <w:proofErr w:type="spellEnd"/>
+      <w:r>
+        <w:t xml:space="preserve">   </w:t>
+      </w:r>
+      <w:r>
+        <w:rPr>
+          <w:rFonts w:ascii="Arial" w:hAnsi="Arial" w:cs="Arial"/>
+        </w:rPr>
+        <w:t>→</w:t>
+      </w:r>
+      <w:r>
+        <w:t xml:space="preserve">   coverage_report.txt</w:t>
+      </w:r>
+    </w:p>
+    <w:p>
+      <w:pPr>
+        <w:pStyle w:val="Monospace"/>
+      </w:pPr>
+    </w:p>
+    <w:p>
+      <w:pPr>
+        <w:pStyle w:val="Heading3"/>
+      </w:pPr>
+      <w:r>
+        <w:t>How the Blocks Connect</w:t>
+      </w:r>
+    </w:p>
+    <w:p>
+      <w:pPr>
+        <w:pStyle w:val="ListParagraph"/>
+        <w:numPr>
+          <w:ilvl w:val="0"/>
+          <w:numId w:val="7"/>
+        </w:numPr>
+      </w:pPr>
+      <w:proofErr w:type="spellStart"/>
+      <w:r>
+        <w:t>parse_args</w:t>
+      </w:r>
+      <w:proofErr w:type="spellEnd"/>
+      <w:r>
+        <w:t>() reads your command-line flags.</w:t>
+      </w:r>
+    </w:p>
+    <w:p>
+      <w:pPr>
+        <w:pStyle w:val="ListParagraph"/>
+        <w:numPr>
+          <w:ilvl w:val="0"/>
+          <w:numId w:val="7"/>
+        </w:numPr>
+      </w:pPr>
+      <w:proofErr w:type="spellStart"/>
+      <w:r>
+        <w:t>compile_project</w:t>
+      </w:r>
+      <w:proofErr w:type="spellEnd"/>
+      <w:r>
+        <w:t>() optionally builds the design under test.</w:t>
+      </w:r>
+    </w:p>
+    <w:p>
+      <w:pPr>
+        <w:pStyle w:val="ListParagraph"/>
+        <w:numPr>
+          <w:ilvl w:val="0"/>
+          <w:numId w:val="7"/>
+        </w:numPr>
+      </w:pPr>
+      <w:r>
+        <w:t>main() creates Job objects and dispatches them all to a thread pool.</w:t>
+      </w:r>
+    </w:p>
+    <w:p>
+      <w:pPr>
+        <w:pStyle w:val="ListParagraph"/>
+        <w:numPr>
+          <w:ilvl w:val="0"/>
+          <w:numId w:val="7"/>
+        </w:numPr>
+      </w:pPr>
+      <w:r>
+        <w:t xml:space="preserve">Each worker thread calls </w:t>
+      </w:r>
+      <w:proofErr w:type="spellStart"/>
+      <w:r>
+        <w:t>run_job</w:t>
+      </w:r>
+      <w:proofErr w:type="spellEnd"/>
+      <w:r>
+        <w:t>() then _</w:t>
+      </w:r>
+      <w:proofErr w:type="spellStart"/>
+      <w:r>
+        <w:t>detect_pass</w:t>
+      </w:r>
+      <w:proofErr w:type="spellEnd"/>
+      <w:r>
+        <w:t>().</w:t>
+      </w:r>
+    </w:p>
+    <w:p>
+      <w:pPr>
+        <w:pStyle w:val="ListParagraph"/>
+        <w:numPr>
+          <w:ilvl w:val="0"/>
+          <w:numId w:val="7"/>
+        </w:numPr>
+      </w:pPr>
+      <w:proofErr w:type="spellStart"/>
+      <w:r>
+        <w:t>print_summary</w:t>
+      </w:r>
+      <w:proofErr w:type="spellEnd"/>
+      <w:r>
+        <w:t>() prints the results table; _</w:t>
+      </w:r>
+      <w:proofErr w:type="spellStart"/>
+      <w:r>
+        <w:t>extract_errors</w:t>
+      </w:r>
+      <w:proofErr w:type="spellEnd"/>
+      <w:r>
+        <w:t>() shows why failures happened.</w:t>
+      </w:r>
+    </w:p>
+    <w:p>
+      <w:pPr>
+        <w:pStyle w:val="ListParagraph"/>
+        <w:numPr>
+          <w:ilvl w:val="0"/>
+          <w:numId w:val="7"/>
+        </w:numPr>
+      </w:pPr>
+      <w:r>
+        <w:t>Coverage .</w:t>
+      </w:r>
+      <w:proofErr w:type="spellStart"/>
+      <w:r>
+        <w:t>ucdb</w:t>
+      </w:r>
+      <w:proofErr w:type="spellEnd"/>
+      <w:r>
+        <w:t xml:space="preserve"> files are merged and a report is saved.</w:t>
+      </w:r>
+    </w:p>
+    <w:p>
+      <w:pPr>
+        <w:pStyle w:val="ListParagraph"/>
+        <w:numPr>
+          <w:ilvl w:val="0"/>
+          <w:numId w:val="7"/>
+        </w:numPr>
+      </w:pPr>
+      <w:r>
+        <w:t>The process exits with code 0 (all pass) or 1 (any failure) — CI-friendly.</w:t>
+      </w:r>
+    </w:p>
     <w:p>
       <w:r>
         <w:br w:type="page"/>
@@ -871,11 +2205,7 @@
       <w:bookmarkEnd w:id="5"/>
     </w:p>
     <w:p/>
-    <w:p>
-      <w:r>
-        <w:t>a</w:t>
-      </w:r>
-    </w:p>
+    <w:p/>
     <w:sectPr>
       <w:footerReference w:type="default" r:id="rId10"/>
       <w:pgSz w:w="12240" w:h="15840"/>
@@ -1149,6 +2479,321 @@
     </w:lvl>
   </w:abstractNum>
   <w:abstractNum w:abstractNumId="1" w15:restartNumberingAfterBreak="0">
+    <w:nsid w:val="39FD673D"/>
+    <w:multiLevelType w:val="hybridMultilevel"/>
+    <w:tmpl w:val="6C3A845A"/>
+    <w:lvl w:ilvl="0" w:tplc="0409000F">
+      <w:start w:val="1"/>
+      <w:numFmt w:val="decimal"/>
+      <w:lvlText w:val="%1."/>
+      <w:lvlJc w:val="left"/>
+      <w:pPr>
+        <w:ind w:left="360" w:hanging="360"/>
+      </w:pPr>
+      <w:rPr>
+        <w:rFonts w:hint="default"/>
+      </w:rPr>
+    </w:lvl>
+    <w:lvl w:ilvl="1" w:tplc="04090019" w:tentative="1">
+      <w:start w:val="1"/>
+      <w:numFmt w:val="lowerLetter"/>
+      <w:lvlText w:val="%2."/>
+      <w:lvlJc w:val="left"/>
+      <w:pPr>
+        <w:ind w:left="1080" w:hanging="360"/>
+      </w:pPr>
+    </w:lvl>
+    <w:lvl w:ilvl="2" w:tplc="0409001B" w:tentative="1">
+      <w:start w:val="1"/>
+      <w:numFmt w:val="lowerRoman"/>
+      <w:lvlText w:val="%3."/>
+      <w:lvlJc w:val="right"/>
+      <w:pPr>
+        <w:ind w:left="1800" w:hanging="180"/>
+      </w:pPr>
+    </w:lvl>
+    <w:lvl w:ilvl="3" w:tplc="0409000F" w:tentative="1">
+      <w:start w:val="1"/>
+      <w:numFmt w:val="decimal"/>
+      <w:lvlText w:val="%4."/>
+      <w:lvlJc w:val="left"/>
+      <w:pPr>
+        <w:ind w:left="2520" w:hanging="360"/>
+      </w:pPr>
+    </w:lvl>
+    <w:lvl w:ilvl="4" w:tplc="04090019" w:tentative="1">
+      <w:start w:val="1"/>
+      <w:numFmt w:val="lowerLetter"/>
+      <w:lvlText w:val="%5."/>
+      <w:lvlJc w:val="left"/>
+      <w:pPr>
+        <w:ind w:left="3240" w:hanging="360"/>
+      </w:pPr>
+    </w:lvl>
+    <w:lvl w:ilvl="5" w:tplc="0409001B" w:tentative="1">
+      <w:start w:val="1"/>
+      <w:numFmt w:val="lowerRoman"/>
+      <w:lvlText w:val="%6."/>
+      <w:lvlJc w:val="right"/>
+      <w:pPr>
+        <w:ind w:left="3960" w:hanging="180"/>
+      </w:pPr>
+    </w:lvl>
+    <w:lvl w:ilvl="6" w:tplc="0409000F" w:tentative="1">
+      <w:start w:val="1"/>
+      <w:numFmt w:val="decimal"/>
+      <w:lvlText w:val="%7."/>
+      <w:lvlJc w:val="left"/>
+      <w:pPr>
+        <w:ind w:left="4680" w:hanging="360"/>
+      </w:pPr>
+    </w:lvl>
+    <w:lvl w:ilvl="7" w:tplc="04090019" w:tentative="1">
+      <w:start w:val="1"/>
+      <w:numFmt w:val="lowerLetter"/>
+      <w:lvlText w:val="%8."/>
+      <w:lvlJc w:val="left"/>
+      <w:pPr>
+        <w:ind w:left="5400" w:hanging="360"/>
+      </w:pPr>
+    </w:lvl>
+    <w:lvl w:ilvl="8" w:tplc="0409001B" w:tentative="1">
+      <w:start w:val="1"/>
+      <w:numFmt w:val="lowerRoman"/>
+      <w:lvlText w:val="%9."/>
+      <w:lvlJc w:val="right"/>
+      <w:pPr>
+        <w:ind w:left="6120" w:hanging="180"/>
+      </w:pPr>
+    </w:lvl>
+  </w:abstractNum>
+  <w:abstractNum w:abstractNumId="2" w15:restartNumberingAfterBreak="0">
+    <w:nsid w:val="40B359DE"/>
+    <w:multiLevelType w:val="hybridMultilevel"/>
+    <w:tmpl w:val="FF5043E6"/>
+    <w:lvl w:ilvl="0" w:tplc="82CAF134">
+      <w:start w:val="2"/>
+      <w:numFmt w:val="bullet"/>
+      <w:lvlText w:val="-"/>
+      <w:lvlJc w:val="left"/>
+      <w:pPr>
+        <w:ind w:left="792" w:hanging="360"/>
+      </w:pPr>
+      <w:rPr>
+        <w:rFonts w:ascii="Times New Roman" w:eastAsiaTheme="minorEastAsia" w:hAnsi="Times New Roman" w:cs="Times New Roman" w:hint="default"/>
+      </w:rPr>
+    </w:lvl>
+    <w:lvl w:ilvl="1" w:tplc="04090003" w:tentative="1">
+      <w:start w:val="1"/>
+      <w:numFmt w:val="bullet"/>
+      <w:lvlText w:val="o"/>
+      <w:lvlJc w:val="left"/>
+      <w:pPr>
+        <w:ind w:left="1512" w:hanging="360"/>
+      </w:pPr>
+      <w:rPr>
+        <w:rFonts w:ascii="Courier New" w:hAnsi="Courier New" w:cs="Courier New" w:hint="default"/>
+      </w:rPr>
+    </w:lvl>
+    <w:lvl w:ilvl="2" w:tplc="04090005" w:tentative="1">
+      <w:start w:val="1"/>
+      <w:numFmt w:val="bullet"/>
+      <w:lvlText w:val=""/>
+      <w:lvlJc w:val="left"/>
+      <w:pPr>
+        <w:ind w:left="2232" w:hanging="360"/>
+      </w:pPr>
+      <w:rPr>
+        <w:rFonts w:ascii="Wingdings" w:hAnsi="Wingdings" w:hint="default"/>
+      </w:rPr>
+    </w:lvl>
+    <w:lvl w:ilvl="3" w:tplc="04090001" w:tentative="1">
+      <w:start w:val="1"/>
+      <w:numFmt w:val="bullet"/>
+      <w:lvlText w:val=""/>
+      <w:lvlJc w:val="left"/>
+      <w:pPr>
+        <w:ind w:left="2952" w:hanging="360"/>
+      </w:pPr>
+      <w:rPr>
+        <w:rFonts w:ascii="Symbol" w:hAnsi="Symbol" w:hint="default"/>
+      </w:rPr>
+    </w:lvl>
+    <w:lvl w:ilvl="4" w:tplc="04090003" w:tentative="1">
+      <w:start w:val="1"/>
+      <w:numFmt w:val="bullet"/>
+      <w:lvlText w:val="o"/>
+      <w:lvlJc w:val="left"/>
+      <w:pPr>
+        <w:ind w:left="3672" w:hanging="360"/>
+      </w:pPr>
+      <w:rPr>
+        <w:rFonts w:ascii="Courier New" w:hAnsi="Courier New" w:cs="Courier New" w:hint="default"/>
+      </w:rPr>
+    </w:lvl>
+    <w:lvl w:ilvl="5" w:tplc="04090005" w:tentative="1">
+      <w:start w:val="1"/>
+      <w:numFmt w:val="bullet"/>
+      <w:lvlText w:val=""/>
+      <w:lvlJc w:val="left"/>
+      <w:pPr>
+        <w:ind w:left="4392" w:hanging="360"/>
+      </w:pPr>
+      <w:rPr>
+        <w:rFonts w:ascii="Wingdings" w:hAnsi="Wingdings" w:hint="default"/>
+      </w:rPr>
+    </w:lvl>
+    <w:lvl w:ilvl="6" w:tplc="04090001" w:tentative="1">
+      <w:start w:val="1"/>
+      <w:numFmt w:val="bullet"/>
+      <w:lvlText w:val=""/>
+      <w:lvlJc w:val="left"/>
+      <w:pPr>
+        <w:ind w:left="5112" w:hanging="360"/>
+      </w:pPr>
+      <w:rPr>
+        <w:rFonts w:ascii="Symbol" w:hAnsi="Symbol" w:hint="default"/>
+      </w:rPr>
+    </w:lvl>
+    <w:lvl w:ilvl="7" w:tplc="04090003" w:tentative="1">
+      <w:start w:val="1"/>
+      <w:numFmt w:val="bullet"/>
+      <w:lvlText w:val="o"/>
+      <w:lvlJc w:val="left"/>
+      <w:pPr>
+        <w:ind w:left="5832" w:hanging="360"/>
+      </w:pPr>
+      <w:rPr>
+        <w:rFonts w:ascii="Courier New" w:hAnsi="Courier New" w:cs="Courier New" w:hint="default"/>
+      </w:rPr>
+    </w:lvl>
+    <w:lvl w:ilvl="8" w:tplc="04090005" w:tentative="1">
+      <w:start w:val="1"/>
+      <w:numFmt w:val="bullet"/>
+      <w:lvlText w:val=""/>
+      <w:lvlJc w:val="left"/>
+      <w:pPr>
+        <w:ind w:left="6552" w:hanging="360"/>
+      </w:pPr>
+      <w:rPr>
+        <w:rFonts w:ascii="Wingdings" w:hAnsi="Wingdings" w:hint="default"/>
+      </w:rPr>
+    </w:lvl>
+  </w:abstractNum>
+  <w:abstractNum w:abstractNumId="3" w15:restartNumberingAfterBreak="0">
+    <w:nsid w:val="48A814E8"/>
+    <w:multiLevelType w:val="hybridMultilevel"/>
+    <w:tmpl w:val="6AE2E9D4"/>
+    <w:lvl w:ilvl="0" w:tplc="04090001">
+      <w:start w:val="1"/>
+      <w:numFmt w:val="bullet"/>
+      <w:lvlText w:val=""/>
+      <w:lvlJc w:val="left"/>
+      <w:pPr>
+        <w:ind w:left="792" w:hanging="360"/>
+      </w:pPr>
+      <w:rPr>
+        <w:rFonts w:ascii="Symbol" w:hAnsi="Symbol" w:hint="default"/>
+      </w:rPr>
+    </w:lvl>
+    <w:lvl w:ilvl="1" w:tplc="04090003" w:tentative="1">
+      <w:start w:val="1"/>
+      <w:numFmt w:val="bullet"/>
+      <w:lvlText w:val="o"/>
+      <w:lvlJc w:val="left"/>
+      <w:pPr>
+        <w:ind w:left="1512" w:hanging="360"/>
+      </w:pPr>
+      <w:rPr>
+        <w:rFonts w:ascii="Courier New" w:hAnsi="Courier New" w:cs="Courier New" w:hint="default"/>
+      </w:rPr>
+    </w:lvl>
+    <w:lvl w:ilvl="2" w:tplc="04090005" w:tentative="1">
+      <w:start w:val="1"/>
+      <w:numFmt w:val="bullet"/>
+      <w:lvlText w:val=""/>
+      <w:lvlJc w:val="left"/>
+      <w:pPr>
+        <w:ind w:left="2232" w:hanging="360"/>
+      </w:pPr>
+      <w:rPr>
+        <w:rFonts w:ascii="Wingdings" w:hAnsi="Wingdings" w:hint="default"/>
+      </w:rPr>
+    </w:lvl>
+    <w:lvl w:ilvl="3" w:tplc="04090001" w:tentative="1">
+      <w:start w:val="1"/>
+      <w:numFmt w:val="bullet"/>
+      <w:lvlText w:val=""/>
+      <w:lvlJc w:val="left"/>
+      <w:pPr>
+        <w:ind w:left="2952" w:hanging="360"/>
+      </w:pPr>
+      <w:rPr>
+        <w:rFonts w:ascii="Symbol" w:hAnsi="Symbol" w:hint="default"/>
+      </w:rPr>
+    </w:lvl>
+    <w:lvl w:ilvl="4" w:tplc="04090003" w:tentative="1">
+      <w:start w:val="1"/>
+      <w:numFmt w:val="bullet"/>
+      <w:lvlText w:val="o"/>
+      <w:lvlJc w:val="left"/>
+      <w:pPr>
+        <w:ind w:left="3672" w:hanging="360"/>
+      </w:pPr>
+      <w:rPr>
+        <w:rFonts w:ascii="Courier New" w:hAnsi="Courier New" w:cs="Courier New" w:hint="default"/>
+      </w:rPr>
+    </w:lvl>
+    <w:lvl w:ilvl="5" w:tplc="04090005" w:tentative="1">
+      <w:start w:val="1"/>
+      <w:numFmt w:val="bullet"/>
+      <w:lvlText w:val=""/>
+      <w:lvlJc w:val="left"/>
+      <w:pPr>
+        <w:ind w:left="4392" w:hanging="360"/>
+      </w:pPr>
+      <w:rPr>
+        <w:rFonts w:ascii="Wingdings" w:hAnsi="Wingdings" w:hint="default"/>
+      </w:rPr>
+    </w:lvl>
+    <w:lvl w:ilvl="6" w:tplc="04090001" w:tentative="1">
+      <w:start w:val="1"/>
+      <w:numFmt w:val="bullet"/>
+      <w:lvlText w:val=""/>
+      <w:lvlJc w:val="left"/>
+      <w:pPr>
+        <w:ind w:left="5112" w:hanging="360"/>
+      </w:pPr>
+      <w:rPr>
+        <w:rFonts w:ascii="Symbol" w:hAnsi="Symbol" w:hint="default"/>
+      </w:rPr>
+    </w:lvl>
+    <w:lvl w:ilvl="7" w:tplc="04090003" w:tentative="1">
+      <w:start w:val="1"/>
+      <w:numFmt w:val="bullet"/>
+      <w:lvlText w:val="o"/>
+      <w:lvlJc w:val="left"/>
+      <w:pPr>
+        <w:ind w:left="5832" w:hanging="360"/>
+      </w:pPr>
+      <w:rPr>
+        <w:rFonts w:ascii="Courier New" w:hAnsi="Courier New" w:cs="Courier New" w:hint="default"/>
+      </w:rPr>
+    </w:lvl>
+    <w:lvl w:ilvl="8" w:tplc="04090005" w:tentative="1">
+      <w:start w:val="1"/>
+      <w:numFmt w:val="bullet"/>
+      <w:lvlText w:val=""/>
+      <w:lvlJc w:val="left"/>
+      <w:pPr>
+        <w:ind w:left="6552" w:hanging="360"/>
+      </w:pPr>
+      <w:rPr>
+        <w:rFonts w:ascii="Wingdings" w:hAnsi="Wingdings" w:hint="default"/>
+      </w:rPr>
+    </w:lvl>
+  </w:abstractNum>
+  <w:abstractNum w:abstractNumId="4" w15:restartNumberingAfterBreak="0">
     <w:nsid w:val="58BF5A4F"/>
     <w:multiLevelType w:val="hybridMultilevel"/>
     <w:tmpl w:val="C4EE9BD2"/>
@@ -1237,11 +2882,252 @@
       </w:pPr>
     </w:lvl>
   </w:abstractNum>
+  <w:abstractNum w:abstractNumId="5" w15:restartNumberingAfterBreak="0">
+    <w:nsid w:val="6C91328C"/>
+    <w:multiLevelType w:val="hybridMultilevel"/>
+    <w:tmpl w:val="BBA661D0"/>
+    <w:lvl w:ilvl="0" w:tplc="04090001">
+      <w:start w:val="1"/>
+      <w:numFmt w:val="bullet"/>
+      <w:lvlText w:val=""/>
+      <w:lvlJc w:val="left"/>
+      <w:pPr>
+        <w:ind w:left="792" w:hanging="360"/>
+      </w:pPr>
+      <w:rPr>
+        <w:rFonts w:ascii="Symbol" w:hAnsi="Symbol" w:hint="default"/>
+      </w:rPr>
+    </w:lvl>
+    <w:lvl w:ilvl="1" w:tplc="04090003" w:tentative="1">
+      <w:start w:val="1"/>
+      <w:numFmt w:val="bullet"/>
+      <w:lvlText w:val="o"/>
+      <w:lvlJc w:val="left"/>
+      <w:pPr>
+        <w:ind w:left="1512" w:hanging="360"/>
+      </w:pPr>
+      <w:rPr>
+        <w:rFonts w:ascii="Courier New" w:hAnsi="Courier New" w:cs="Courier New" w:hint="default"/>
+      </w:rPr>
+    </w:lvl>
+    <w:lvl w:ilvl="2" w:tplc="04090005" w:tentative="1">
+      <w:start w:val="1"/>
+      <w:numFmt w:val="bullet"/>
+      <w:lvlText w:val=""/>
+      <w:lvlJc w:val="left"/>
+      <w:pPr>
+        <w:ind w:left="2232" w:hanging="360"/>
+      </w:pPr>
+      <w:rPr>
+        <w:rFonts w:ascii="Wingdings" w:hAnsi="Wingdings" w:hint="default"/>
+      </w:rPr>
+    </w:lvl>
+    <w:lvl w:ilvl="3" w:tplc="04090001" w:tentative="1">
+      <w:start w:val="1"/>
+      <w:numFmt w:val="bullet"/>
+      <w:lvlText w:val=""/>
+      <w:lvlJc w:val="left"/>
+      <w:pPr>
+        <w:ind w:left="2952" w:hanging="360"/>
+      </w:pPr>
+      <w:rPr>
+        <w:rFonts w:ascii="Symbol" w:hAnsi="Symbol" w:hint="default"/>
+      </w:rPr>
+    </w:lvl>
+    <w:lvl w:ilvl="4" w:tplc="04090003" w:tentative="1">
+      <w:start w:val="1"/>
+      <w:numFmt w:val="bullet"/>
+      <w:lvlText w:val="o"/>
+      <w:lvlJc w:val="left"/>
+      <w:pPr>
+        <w:ind w:left="3672" w:hanging="360"/>
+      </w:pPr>
+      <w:rPr>
+        <w:rFonts w:ascii="Courier New" w:hAnsi="Courier New" w:cs="Courier New" w:hint="default"/>
+      </w:rPr>
+    </w:lvl>
+    <w:lvl w:ilvl="5" w:tplc="04090005" w:tentative="1">
+      <w:start w:val="1"/>
+      <w:numFmt w:val="bullet"/>
+      <w:lvlText w:val=""/>
+      <w:lvlJc w:val="left"/>
+      <w:pPr>
+        <w:ind w:left="4392" w:hanging="360"/>
+      </w:pPr>
+      <w:rPr>
+        <w:rFonts w:ascii="Wingdings" w:hAnsi="Wingdings" w:hint="default"/>
+      </w:rPr>
+    </w:lvl>
+    <w:lvl w:ilvl="6" w:tplc="04090001" w:tentative="1">
+      <w:start w:val="1"/>
+      <w:numFmt w:val="bullet"/>
+      <w:lvlText w:val=""/>
+      <w:lvlJc w:val="left"/>
+      <w:pPr>
+        <w:ind w:left="5112" w:hanging="360"/>
+      </w:pPr>
+      <w:rPr>
+        <w:rFonts w:ascii="Symbol" w:hAnsi="Symbol" w:hint="default"/>
+      </w:rPr>
+    </w:lvl>
+    <w:lvl w:ilvl="7" w:tplc="04090003" w:tentative="1">
+      <w:start w:val="1"/>
+      <w:numFmt w:val="bullet"/>
+      <w:lvlText w:val="o"/>
+      <w:lvlJc w:val="left"/>
+      <w:pPr>
+        <w:ind w:left="5832" w:hanging="360"/>
+      </w:pPr>
+      <w:rPr>
+        <w:rFonts w:ascii="Courier New" w:hAnsi="Courier New" w:cs="Courier New" w:hint="default"/>
+      </w:rPr>
+    </w:lvl>
+    <w:lvl w:ilvl="8" w:tplc="04090005" w:tentative="1">
+      <w:start w:val="1"/>
+      <w:numFmt w:val="bullet"/>
+      <w:lvlText w:val=""/>
+      <w:lvlJc w:val="left"/>
+      <w:pPr>
+        <w:ind w:left="6552" w:hanging="360"/>
+      </w:pPr>
+      <w:rPr>
+        <w:rFonts w:ascii="Wingdings" w:hAnsi="Wingdings" w:hint="default"/>
+      </w:rPr>
+    </w:lvl>
+  </w:abstractNum>
+  <w:abstractNum w:abstractNumId="6" w15:restartNumberingAfterBreak="0">
+    <w:nsid w:val="75A8079F"/>
+    <w:multiLevelType w:val="hybridMultilevel"/>
+    <w:tmpl w:val="8B4A159A"/>
+    <w:lvl w:ilvl="0" w:tplc="04090001">
+      <w:start w:val="1"/>
+      <w:numFmt w:val="bullet"/>
+      <w:lvlText w:val=""/>
+      <w:lvlJc w:val="left"/>
+      <w:pPr>
+        <w:ind w:left="792" w:hanging="360"/>
+      </w:pPr>
+      <w:rPr>
+        <w:rFonts w:ascii="Symbol" w:hAnsi="Symbol" w:hint="default"/>
+      </w:rPr>
+    </w:lvl>
+    <w:lvl w:ilvl="1" w:tplc="04090003" w:tentative="1">
+      <w:start w:val="1"/>
+      <w:numFmt w:val="bullet"/>
+      <w:lvlText w:val="o"/>
+      <w:lvlJc w:val="left"/>
+      <w:pPr>
+        <w:ind w:left="1440" w:hanging="360"/>
+      </w:pPr>
+      <w:rPr>
+        <w:rFonts w:ascii="Courier New" w:hAnsi="Courier New" w:cs="Courier New" w:hint="default"/>
+      </w:rPr>
+    </w:lvl>
+    <w:lvl w:ilvl="2" w:tplc="04090005" w:tentative="1">
+      <w:start w:val="1"/>
+      <w:numFmt w:val="bullet"/>
+      <w:lvlText w:val=""/>
+      <w:lvlJc w:val="left"/>
+      <w:pPr>
+        <w:ind w:left="2160" w:hanging="360"/>
+      </w:pPr>
+      <w:rPr>
+        <w:rFonts w:ascii="Wingdings" w:hAnsi="Wingdings" w:hint="default"/>
+      </w:rPr>
+    </w:lvl>
+    <w:lvl w:ilvl="3" w:tplc="04090001" w:tentative="1">
+      <w:start w:val="1"/>
+      <w:numFmt w:val="bullet"/>
+      <w:lvlText w:val=""/>
+      <w:lvlJc w:val="left"/>
+      <w:pPr>
+        <w:ind w:left="2880" w:hanging="360"/>
+      </w:pPr>
+      <w:rPr>
+        <w:rFonts w:ascii="Symbol" w:hAnsi="Symbol" w:hint="default"/>
+      </w:rPr>
+    </w:lvl>
+    <w:lvl w:ilvl="4" w:tplc="04090003" w:tentative="1">
+      <w:start w:val="1"/>
+      <w:numFmt w:val="bullet"/>
+      <w:lvlText w:val="o"/>
+      <w:lvlJc w:val="left"/>
+      <w:pPr>
+        <w:ind w:left="3600" w:hanging="360"/>
+      </w:pPr>
+      <w:rPr>
+        <w:rFonts w:ascii="Courier New" w:hAnsi="Courier New" w:cs="Courier New" w:hint="default"/>
+      </w:rPr>
+    </w:lvl>
+    <w:lvl w:ilvl="5" w:tplc="04090005" w:tentative="1">
+      <w:start w:val="1"/>
+      <w:numFmt w:val="bullet"/>
+      <w:lvlText w:val=""/>
+      <w:lvlJc w:val="left"/>
+      <w:pPr>
+        <w:ind w:left="4320" w:hanging="360"/>
+      </w:pPr>
+      <w:rPr>
+        <w:rFonts w:ascii="Wingdings" w:hAnsi="Wingdings" w:hint="default"/>
+      </w:rPr>
+    </w:lvl>
+    <w:lvl w:ilvl="6" w:tplc="04090001" w:tentative="1">
+      <w:start w:val="1"/>
+      <w:numFmt w:val="bullet"/>
+      <w:lvlText w:val=""/>
+      <w:lvlJc w:val="left"/>
+      <w:pPr>
+        <w:ind w:left="5040" w:hanging="360"/>
+      </w:pPr>
+      <w:rPr>
+        <w:rFonts w:ascii="Symbol" w:hAnsi="Symbol" w:hint="default"/>
+      </w:rPr>
+    </w:lvl>
+    <w:lvl w:ilvl="7" w:tplc="04090003" w:tentative="1">
+      <w:start w:val="1"/>
+      <w:numFmt w:val="bullet"/>
+      <w:lvlText w:val="o"/>
+      <w:lvlJc w:val="left"/>
+      <w:pPr>
+        <w:ind w:left="5760" w:hanging="360"/>
+      </w:pPr>
+      <w:rPr>
+        <w:rFonts w:ascii="Courier New" w:hAnsi="Courier New" w:cs="Courier New" w:hint="default"/>
+      </w:rPr>
+    </w:lvl>
+    <w:lvl w:ilvl="8" w:tplc="04090005" w:tentative="1">
+      <w:start w:val="1"/>
+      <w:numFmt w:val="bullet"/>
+      <w:lvlText w:val=""/>
+      <w:lvlJc w:val="left"/>
+      <w:pPr>
+        <w:ind w:left="6480" w:hanging="360"/>
+      </w:pPr>
+      <w:rPr>
+        <w:rFonts w:ascii="Wingdings" w:hAnsi="Wingdings" w:hint="default"/>
+      </w:rPr>
+    </w:lvl>
+  </w:abstractNum>
   <w:num w:numId="1" w16cid:durableId="1759327127">
-    <w:abstractNumId w:val="1"/>
+    <w:abstractNumId w:val="4"/>
   </w:num>
   <w:num w:numId="2" w16cid:durableId="1809282866">
     <w:abstractNumId w:val="0"/>
+  </w:num>
+  <w:num w:numId="3" w16cid:durableId="603924814">
+    <w:abstractNumId w:val="3"/>
+  </w:num>
+  <w:num w:numId="4" w16cid:durableId="779573118">
+    <w:abstractNumId w:val="2"/>
+  </w:num>
+  <w:num w:numId="5" w16cid:durableId="1929774900">
+    <w:abstractNumId w:val="6"/>
+  </w:num>
+  <w:num w:numId="6" w16cid:durableId="1673411647">
+    <w:abstractNumId w:val="5"/>
+  </w:num>
+  <w:num w:numId="7" w16cid:durableId="1854757471">
+    <w:abstractNumId w:val="1"/>
   </w:num>
 </w:numbering>
 </file>
@@ -1644,9 +3530,9 @@
   <w:style w:type="paragraph" w:default="1" w:styleId="Normal">
     <w:name w:val="Normal"/>
     <w:qFormat/>
-    <w:rsid w:val="000F0527"/>
+    <w:rsid w:val="00FE74B9"/>
     <w:pPr>
-      <w:spacing w:line="480" w:lineRule="auto"/>
+      <w:spacing w:line="360" w:lineRule="auto"/>
     </w:pPr>
     <w:rPr>
       <w:rFonts w:ascii="Times New Roman" w:eastAsiaTheme="minorEastAsia" w:hAnsi="Times New Roman" w:cstheme="minorHAnsi"/>
@@ -1674,7 +3560,7 @@
     <w:rPr>
       <w:rFonts w:asciiTheme="majorBidi" w:eastAsiaTheme="majorEastAsia" w:hAnsiTheme="majorBidi" w:cstheme="majorHAnsi"/>
       <w:b/>
-      <w:color w:val="AA610D" w:themeColor="accent1" w:themeShade="BF"/>
+      <w:color w:val="2F5496" w:themeColor="accent1" w:themeShade="BF"/>
       <w:sz w:val="32"/>
       <w:szCs w:val="36"/>
     </w:rPr>
@@ -1701,7 +3587,7 @@
     <w:rPr>
       <w:rFonts w:asciiTheme="majorBidi" w:eastAsiaTheme="majorEastAsia" w:hAnsiTheme="majorBidi" w:cstheme="majorHAnsi"/>
       <w:b/>
-      <w:color w:val="AA610D" w:themeColor="accent1" w:themeShade="BF"/>
+      <w:color w:val="2F5496" w:themeColor="accent1" w:themeShade="BF"/>
       <w:sz w:val="28"/>
       <w:szCs w:val="32"/>
     </w:rPr>
@@ -1712,7 +3598,6 @@
     <w:next w:val="Normal"/>
     <w:link w:val="Heading3Char"/>
     <w:uiPriority w:val="9"/>
-    <w:semiHidden/>
     <w:unhideWhenUsed/>
     <w:qFormat/>
     <w:rsid w:val="000F0527"/>
@@ -1730,7 +3615,7 @@
       <w:rFonts w:asciiTheme="majorBidi" w:eastAsiaTheme="majorEastAsia" w:hAnsiTheme="majorBidi" w:cstheme="majorHAnsi"/>
       <w:b/>
       <w:i/>
-      <w:color w:val="714109" w:themeColor="accent1" w:themeShade="7F"/>
+      <w:color w:val="1F3763" w:themeColor="accent1" w:themeShade="7F"/>
     </w:rPr>
   </w:style>
   <w:style w:type="paragraph" w:styleId="Heading4">
@@ -1739,7 +3624,6 @@
     <w:next w:val="Normal"/>
     <w:link w:val="Heading4Char"/>
     <w:uiPriority w:val="9"/>
-    <w:semiHidden/>
     <w:unhideWhenUsed/>
     <w:qFormat/>
     <w:rsid w:val="00D72E43"/>
@@ -1757,7 +3641,7 @@
       <w:rFonts w:asciiTheme="majorHAnsi" w:eastAsiaTheme="majorEastAsia" w:hAnsiTheme="majorHAnsi" w:cstheme="majorBidi"/>
       <w:i/>
       <w:iCs/>
-      <w:color w:val="AA610D" w:themeColor="accent1" w:themeShade="BF"/>
+      <w:color w:val="2F5496" w:themeColor="accent1" w:themeShade="BF"/>
     </w:rPr>
   </w:style>
   <w:style w:type="paragraph" w:styleId="Heading5">
@@ -1782,7 +3666,7 @@
     </w:pPr>
     <w:rPr>
       <w:rFonts w:asciiTheme="majorHAnsi" w:eastAsiaTheme="majorEastAsia" w:hAnsiTheme="majorHAnsi" w:cstheme="majorBidi"/>
-      <w:color w:val="AA610D" w:themeColor="accent1" w:themeShade="BF"/>
+      <w:color w:val="2F5496" w:themeColor="accent1" w:themeShade="BF"/>
     </w:rPr>
   </w:style>
   <w:style w:type="paragraph" w:styleId="Heading6">
@@ -1807,7 +3691,7 @@
     </w:pPr>
     <w:rPr>
       <w:rFonts w:asciiTheme="majorHAnsi" w:eastAsiaTheme="majorEastAsia" w:hAnsiTheme="majorHAnsi" w:cstheme="majorBidi"/>
-      <w:color w:val="714109" w:themeColor="accent1" w:themeShade="7F"/>
+      <w:color w:val="1F3763" w:themeColor="accent1" w:themeShade="7F"/>
     </w:rPr>
   </w:style>
   <w:style w:type="paragraph" w:styleId="Heading7">
@@ -1834,7 +3718,7 @@
       <w:rFonts w:asciiTheme="majorHAnsi" w:eastAsiaTheme="majorEastAsia" w:hAnsiTheme="majorHAnsi" w:cstheme="majorBidi"/>
       <w:i/>
       <w:iCs/>
-      <w:color w:val="714109" w:themeColor="accent1" w:themeShade="7F"/>
+      <w:color w:val="1F3763" w:themeColor="accent1" w:themeShade="7F"/>
     </w:rPr>
   </w:style>
   <w:style w:type="paragraph" w:styleId="Heading8">
@@ -1929,7 +3813,7 @@
     <w:rPr>
       <w:rFonts w:asciiTheme="majorBidi" w:eastAsiaTheme="majorEastAsia" w:hAnsiTheme="majorBidi" w:cstheme="majorHAnsi"/>
       <w:b/>
-      <w:color w:val="AA610D" w:themeColor="accent1" w:themeShade="BF"/>
+      <w:color w:val="2F5496" w:themeColor="accent1" w:themeShade="BF"/>
       <w:sz w:val="32"/>
       <w:szCs w:val="36"/>
     </w:rPr>
@@ -1943,7 +3827,7 @@
     <w:rPr>
       <w:rFonts w:asciiTheme="majorBidi" w:eastAsiaTheme="majorEastAsia" w:hAnsiTheme="majorBidi" w:cstheme="majorHAnsi"/>
       <w:b/>
-      <w:color w:val="AA610D" w:themeColor="accent1" w:themeShade="BF"/>
+      <w:color w:val="2F5496" w:themeColor="accent1" w:themeShade="BF"/>
       <w:sz w:val="28"/>
       <w:szCs w:val="32"/>
     </w:rPr>
@@ -1953,13 +3837,12 @@
     <w:basedOn w:val="DefaultParagraphFont"/>
     <w:link w:val="Heading3"/>
     <w:uiPriority w:val="9"/>
-    <w:semiHidden/>
     <w:rsid w:val="000F0527"/>
     <w:rPr>
       <w:rFonts w:asciiTheme="majorBidi" w:eastAsiaTheme="majorEastAsia" w:hAnsiTheme="majorBidi" w:cstheme="majorHAnsi"/>
       <w:b/>
       <w:i/>
-      <w:color w:val="714109" w:themeColor="accent1" w:themeShade="7F"/>
+      <w:color w:val="1F3763" w:themeColor="accent1" w:themeShade="7F"/>
       <w:sz w:val="24"/>
       <w:szCs w:val="28"/>
     </w:rPr>
@@ -2009,7 +3892,7 @@
     <w:unhideWhenUsed/>
     <w:rsid w:val="00144069"/>
     <w:rPr>
-      <w:color w:val="2998E3" w:themeColor="hyperlink"/>
+      <w:color w:val="0563C1" w:themeColor="hyperlink"/>
       <w:u w:val="single"/>
     </w:rPr>
   </w:style>
@@ -2072,13 +3955,12 @@
     <w:basedOn w:val="DefaultParagraphFont"/>
     <w:link w:val="Heading4"/>
     <w:uiPriority w:val="9"/>
-    <w:semiHidden/>
     <w:rsid w:val="00D72E43"/>
     <w:rPr>
       <w:rFonts w:asciiTheme="majorHAnsi" w:eastAsiaTheme="majorEastAsia" w:hAnsiTheme="majorHAnsi" w:cstheme="majorBidi"/>
       <w:i/>
       <w:iCs/>
-      <w:color w:val="AA610D" w:themeColor="accent1" w:themeShade="BF"/>
+      <w:color w:val="2F5496" w:themeColor="accent1" w:themeShade="BF"/>
       <w:sz w:val="24"/>
       <w:szCs w:val="28"/>
     </w:rPr>
@@ -2092,7 +3974,7 @@
     <w:rsid w:val="00D72E43"/>
     <w:rPr>
       <w:rFonts w:asciiTheme="majorHAnsi" w:eastAsiaTheme="majorEastAsia" w:hAnsiTheme="majorHAnsi" w:cstheme="majorBidi"/>
-      <w:color w:val="AA610D" w:themeColor="accent1" w:themeShade="BF"/>
+      <w:color w:val="2F5496" w:themeColor="accent1" w:themeShade="BF"/>
       <w:sz w:val="24"/>
       <w:szCs w:val="28"/>
     </w:rPr>
@@ -2106,7 +3988,7 @@
     <w:rsid w:val="00D72E43"/>
     <w:rPr>
       <w:rFonts w:asciiTheme="majorHAnsi" w:eastAsiaTheme="majorEastAsia" w:hAnsiTheme="majorHAnsi" w:cstheme="majorBidi"/>
-      <w:color w:val="714109" w:themeColor="accent1" w:themeShade="7F"/>
+      <w:color w:val="1F3763" w:themeColor="accent1" w:themeShade="7F"/>
       <w:sz w:val="24"/>
       <w:szCs w:val="28"/>
     </w:rPr>
@@ -2122,7 +4004,7 @@
       <w:rFonts w:asciiTheme="majorHAnsi" w:eastAsiaTheme="majorEastAsia" w:hAnsiTheme="majorHAnsi" w:cstheme="majorBidi"/>
       <w:i/>
       <w:iCs/>
-      <w:color w:val="714109" w:themeColor="accent1" w:themeShade="7F"/>
+      <w:color w:val="1F3763" w:themeColor="accent1" w:themeShade="7F"/>
       <w:sz w:val="24"/>
       <w:szCs w:val="28"/>
     </w:rPr>
@@ -2155,6 +4037,63 @@
       <w:color w:val="272727" w:themeColor="text1" w:themeTint="D8"/>
       <w:sz w:val="21"/>
       <w:szCs w:val="21"/>
+    </w:rPr>
+  </w:style>
+  <w:style w:type="paragraph" w:styleId="ListParagraph">
+    <w:name w:val="List Paragraph"/>
+    <w:basedOn w:val="Normal"/>
+    <w:uiPriority w:val="34"/>
+    <w:qFormat/>
+    <w:rsid w:val="008D0436"/>
+    <w:pPr>
+      <w:ind w:left="720"/>
+      <w:contextualSpacing/>
+    </w:pPr>
+  </w:style>
+  <w:style w:type="paragraph" w:styleId="Subtitle">
+    <w:name w:val="Subtitle"/>
+    <w:basedOn w:val="Normal"/>
+    <w:next w:val="Normal"/>
+    <w:link w:val="SubtitleChar"/>
+    <w:uiPriority w:val="11"/>
+    <w:qFormat/>
+    <w:rsid w:val="0092611B"/>
+    <w:pPr>
+      <w:numPr>
+        <w:ilvl w:val="1"/>
+      </w:numPr>
+    </w:pPr>
+    <w:rPr>
+      <w:rFonts w:asciiTheme="minorHAnsi" w:hAnsiTheme="minorHAnsi" w:cstheme="minorBidi"/>
+      <w:color w:val="5A5A5A" w:themeColor="text1" w:themeTint="A5"/>
+      <w:spacing w:val="15"/>
+      <w:sz w:val="20"/>
+      <w:szCs w:val="22"/>
+    </w:rPr>
+  </w:style>
+  <w:style w:type="character" w:customStyle="1" w:styleId="SubtitleChar">
+    <w:name w:val="Subtitle Char"/>
+    <w:basedOn w:val="DefaultParagraphFont"/>
+    <w:link w:val="Subtitle"/>
+    <w:uiPriority w:val="11"/>
+    <w:rsid w:val="0092611B"/>
+    <w:rPr>
+      <w:rFonts w:eastAsiaTheme="minorEastAsia"/>
+      <w:color w:val="5A5A5A" w:themeColor="text1" w:themeTint="A5"/>
+      <w:spacing w:val="15"/>
+      <w:sz w:val="20"/>
+    </w:rPr>
+  </w:style>
+  <w:style w:type="paragraph" w:customStyle="1" w:styleId="Monospace">
+    <w:name w:val="Monospace"/>
+    <w:basedOn w:val="Normal"/>
+    <w:qFormat/>
+    <w:rsid w:val="0092611B"/>
+    <w:rPr>
+      <w:rFonts w:ascii="Monospac821 BT" w:eastAsia="Courier New" w:hAnsi="Monospac821 BT" w:cs="Courier New"/>
+      <w:color w:val="555555"/>
+      <w:sz w:val="19"/>
+      <w:szCs w:val="19"/>
     </w:rPr>
   </w:style>
 </w:styles>
@@ -2234,6 +4173,27 @@
     <w:pitch w:val="variable"/>
     <w:sig w:usb0="E0002EFF" w:usb1="C000785B" w:usb2="00000009" w:usb3="00000000" w:csb0="000001FF" w:csb1="00000000"/>
   </w:font>
+  <w:font w:name="Courier New">
+    <w:panose1 w:val="02070309020205020404"/>
+    <w:charset w:val="00"/>
+    <w:family w:val="modern"/>
+    <w:pitch w:val="fixed"/>
+    <w:sig w:usb0="E0002EFF" w:usb1="C0007843" w:usb2="00000009" w:usb3="00000000" w:csb0="000001FF" w:csb1="00000000"/>
+  </w:font>
+  <w:font w:name="Wingdings">
+    <w:panose1 w:val="05000000000000000000"/>
+    <w:charset w:val="02"/>
+    <w:family w:val="auto"/>
+    <w:pitch w:val="variable"/>
+    <w:sig w:usb0="00000000" w:usb1="10000000" w:usb2="00000000" w:usb3="00000000" w:csb0="80000000" w:csb1="00000000"/>
+  </w:font>
+  <w:font w:name="Symbol">
+    <w:panose1 w:val="05050102010706020507"/>
+    <w:charset w:val="02"/>
+    <w:family w:val="roman"/>
+    <w:pitch w:val="variable"/>
+    <w:sig w:usb0="00000000" w:usb1="10000000" w:usb2="00000000" w:usb3="00000000" w:csb0="80000000" w:csb1="00000000"/>
+  </w:font>
   <w:font w:name="Calibri">
     <w:panose1 w:val="020F0502020204030204"/>
     <w:charset w:val="00"/>
@@ -2255,6 +4215,20 @@
     <w:pitch w:val="variable"/>
     <w:sig w:usb0="E4002EFF" w:usb1="C000247B" w:usb2="00000009" w:usb3="00000000" w:csb0="000001FF" w:csb1="00000000"/>
   </w:font>
+  <w:font w:name="Monospac821 BT">
+    <w:panose1 w:val="020B0609020202020204"/>
+    <w:charset w:val="00"/>
+    <w:family w:val="modern"/>
+    <w:pitch w:val="fixed"/>
+    <w:sig w:usb0="00000087" w:usb1="00000000" w:usb2="00000000" w:usb3="00000000" w:csb0="0000001B" w:csb1="00000000"/>
+  </w:font>
+  <w:font w:name="Segoe UI Symbol">
+    <w:panose1 w:val="020B0502040204020203"/>
+    <w:charset w:val="00"/>
+    <w:family w:val="swiss"/>
+    <w:pitch w:val="variable"/>
+    <w:sig w:usb0="800001E3" w:usb1="1200FFEF" w:usb2="00040000" w:usb3="00000000" w:csb0="00000001" w:csb1="00000000"/>
+  </w:font>
 </w:fonts>
 </file>
 
@@ -2273,8 +4247,8 @@
     <w:compatSetting w:name="useWord2013TrackBottomHyphenation" w:uri="http://schemas.microsoft.com/office/word" w:val="0"/>
   </w:compat>
   <w:rsids>
-    <w:rsidRoot w:val="00D626E8"/>
-    <w:rsid w:val="00D626E8"/>
+    <w:rsidRoot w:val="00FD7210"/>
+    <w:rsid w:val="00FD7210"/>
   </w:rsids>
   <m:mathPr>
     <m:mathFont m:val="Cambria Math"/>
@@ -2749,54 +4723,54 @@
 </file>
 
 <file path=word/theme/theme1.xml><?xml version="1.0" encoding="utf-8"?>
-<a:theme xmlns:a="http://schemas.openxmlformats.org/drawingml/2006/main" name="Retrospect">
+<a:theme xmlns:a="http://schemas.openxmlformats.org/drawingml/2006/main" name="Office Theme">
   <a:themeElements>
-    <a:clrScheme name="Retrospect">
+    <a:clrScheme name="Office">
       <a:dk1>
-        <a:srgbClr val="000000"/>
+        <a:sysClr val="windowText" lastClr="000000"/>
       </a:dk1>
       <a:lt1>
         <a:sysClr val="window" lastClr="FFFFFF"/>
       </a:lt1>
       <a:dk2>
-        <a:srgbClr val="637052"/>
+        <a:srgbClr val="44546A"/>
       </a:dk2>
       <a:lt2>
-        <a:srgbClr val="CCDDEA"/>
+        <a:srgbClr val="E7E6E6"/>
       </a:lt2>
       <a:accent1>
-        <a:srgbClr val="E48312"/>
+        <a:srgbClr val="4472C4"/>
       </a:accent1>
       <a:accent2>
-        <a:srgbClr val="BD582C"/>
+        <a:srgbClr val="ED7D31"/>
       </a:accent2>
       <a:accent3>
-        <a:srgbClr val="865640"/>
+        <a:srgbClr val="A5A5A5"/>
       </a:accent3>
       <a:accent4>
-        <a:srgbClr val="9B8357"/>
+        <a:srgbClr val="FFC000"/>
       </a:accent4>
       <a:accent5>
-        <a:srgbClr val="C2BC80"/>
+        <a:srgbClr val="5B9BD5"/>
       </a:accent5>
       <a:accent6>
-        <a:srgbClr val="94A088"/>
+        <a:srgbClr val="70AD47"/>
       </a:accent6>
       <a:hlink>
-        <a:srgbClr val="2998E3"/>
+        <a:srgbClr val="0563C1"/>
       </a:hlink>
       <a:folHlink>
-        <a:srgbClr val="8C8C8C"/>
+        <a:srgbClr val="954F72"/>
       </a:folHlink>
     </a:clrScheme>
-    <a:fontScheme name="Retrospect">
+    <a:fontScheme name="Office">
       <a:majorFont>
         <a:latin typeface="Calibri Light" panose="020F0302020204030204"/>
         <a:ea typeface=""/>
         <a:cs typeface=""/>
-        <a:font script="Jpan" typeface="ＭＳ Ｐゴシック"/>
+        <a:font script="Jpan" typeface="游ゴシック Light"/>
         <a:font script="Hang" typeface="맑은 고딕"/>
-        <a:font script="Hans" typeface="宋体"/>
+        <a:font script="Hans" typeface="等线 Light"/>
         <a:font script="Hant" typeface="新細明體"/>
         <a:font script="Arab" typeface="Times New Roman"/>
         <a:font script="Hebr" typeface="Times New Roman"/>
@@ -2824,14 +4798,31 @@
         <a:font script="Viet" typeface="Times New Roman"/>
         <a:font script="Uigh" typeface="Microsoft Uighur"/>
         <a:font script="Geor" typeface="Sylfaen"/>
+        <a:font script="Armn" typeface="Arial"/>
+        <a:font script="Bugi" typeface="Leelawadee UI"/>
+        <a:font script="Bopo" typeface="Microsoft JhengHei"/>
+        <a:font script="Java" typeface="Javanese Text"/>
+        <a:font script="Lisu" typeface="Segoe UI"/>
+        <a:font script="Mymr" typeface="Myanmar Text"/>
+        <a:font script="Nkoo" typeface="Ebrima"/>
+        <a:font script="Olck" typeface="Nirmala UI"/>
+        <a:font script="Osma" typeface="Ebrima"/>
+        <a:font script="Phag" typeface="Phagspa"/>
+        <a:font script="Syrn" typeface="Estrangelo Edessa"/>
+        <a:font script="Syrj" typeface="Estrangelo Edessa"/>
+        <a:font script="Syre" typeface="Estrangelo Edessa"/>
+        <a:font script="Sora" typeface="Nirmala UI"/>
+        <a:font script="Tale" typeface="Microsoft Tai Le"/>
+        <a:font script="Talu" typeface="Microsoft New Tai Lue"/>
+        <a:font script="Tfng" typeface="Ebrima"/>
       </a:majorFont>
       <a:minorFont>
         <a:latin typeface="Calibri" panose="020F0502020204030204"/>
         <a:ea typeface=""/>
         <a:cs typeface=""/>
-        <a:font script="Jpan" typeface="ＭＳ Ｐゴシック"/>
+        <a:font script="Jpan" typeface="游明朝"/>
         <a:font script="Hang" typeface="맑은 고딕"/>
-        <a:font script="Hans" typeface="宋体"/>
+        <a:font script="Hans" typeface="等线"/>
         <a:font script="Hant" typeface="新細明體"/>
         <a:font script="Arab" typeface="Arial"/>
         <a:font script="Hebr" typeface="Arial"/>
@@ -2859,9 +4850,26 @@
         <a:font script="Viet" typeface="Arial"/>
         <a:font script="Uigh" typeface="Microsoft Uighur"/>
         <a:font script="Geor" typeface="Sylfaen"/>
+        <a:font script="Armn" typeface="Arial"/>
+        <a:font script="Bugi" typeface="Leelawadee UI"/>
+        <a:font script="Bopo" typeface="Microsoft JhengHei"/>
+        <a:font script="Java" typeface="Javanese Text"/>
+        <a:font script="Lisu" typeface="Segoe UI"/>
+        <a:font script="Mymr" typeface="Myanmar Text"/>
+        <a:font script="Nkoo" typeface="Ebrima"/>
+        <a:font script="Olck" typeface="Nirmala UI"/>
+        <a:font script="Osma" typeface="Ebrima"/>
+        <a:font script="Phag" typeface="Phagspa"/>
+        <a:font script="Syrn" typeface="Estrangelo Edessa"/>
+        <a:font script="Syrj" typeface="Estrangelo Edessa"/>
+        <a:font script="Syre" typeface="Estrangelo Edessa"/>
+        <a:font script="Sora" typeface="Nirmala UI"/>
+        <a:font script="Tale" typeface="Microsoft Tai Le"/>
+        <a:font script="Talu" typeface="Microsoft New Tai Lue"/>
+        <a:font script="Tfng" typeface="Ebrima"/>
       </a:minorFont>
     </a:fontScheme>
-    <a:fmtScheme name="Retrospect">
+    <a:fmtScheme name="Office">
       <a:fillStyleLst>
         <a:solidFill>
           <a:schemeClr val="phClr"/>
@@ -2870,81 +4878,76 @@
           <a:gsLst>
             <a:gs pos="0">
               <a:schemeClr val="phClr">
-                <a:tint val="65000"/>
-                <a:shade val="92000"/>
-                <a:satMod val="130000"/>
+                <a:lumMod val="110000"/>
+                <a:satMod val="105000"/>
+                <a:tint val="67000"/>
               </a:schemeClr>
             </a:gs>
-            <a:gs pos="45000">
+            <a:gs pos="50000">
               <a:schemeClr val="phClr">
-                <a:tint val="60000"/>
-                <a:shade val="99000"/>
-                <a:satMod val="120000"/>
+                <a:lumMod val="105000"/>
+                <a:satMod val="103000"/>
+                <a:tint val="73000"/>
               </a:schemeClr>
             </a:gs>
             <a:gs pos="100000">
               <a:schemeClr val="phClr">
-                <a:tint val="55000"/>
-                <a:satMod val="140000"/>
+                <a:lumMod val="105000"/>
+                <a:satMod val="109000"/>
+                <a:tint val="81000"/>
               </a:schemeClr>
             </a:gs>
           </a:gsLst>
-          <a:path path="circle">
-            <a:fillToRect l="100000" t="100000" r="100000" b="100000"/>
-          </a:path>
+          <a:lin ang="5400000" scaled="0"/>
         </a:gradFill>
         <a:gradFill rotWithShape="1">
           <a:gsLst>
             <a:gs pos="0">
               <a:schemeClr val="phClr">
-                <a:shade val="85000"/>
-                <a:satMod val="130000"/>
+                <a:satMod val="103000"/>
+                <a:lumMod val="102000"/>
+                <a:tint val="94000"/>
               </a:schemeClr>
             </a:gs>
-            <a:gs pos="34000">
+            <a:gs pos="50000">
               <a:schemeClr val="phClr">
-                <a:shade val="87000"/>
-                <a:satMod val="125000"/>
-              </a:schemeClr>
-            </a:gs>
-            <a:gs pos="70000">
-              <a:schemeClr val="phClr">
-                <a:tint val="100000"/>
-                <a:shade val="90000"/>
-                <a:satMod val="130000"/>
+                <a:satMod val="110000"/>
+                <a:lumMod val="100000"/>
+                <a:shade val="100000"/>
               </a:schemeClr>
             </a:gs>
             <a:gs pos="100000">
               <a:schemeClr val="phClr">
-                <a:tint val="100000"/>
-                <a:shade val="100000"/>
-                <a:satMod val="110000"/>
+                <a:lumMod val="99000"/>
+                <a:satMod val="120000"/>
+                <a:shade val="78000"/>
               </a:schemeClr>
             </a:gs>
           </a:gsLst>
-          <a:path path="circle">
-            <a:fillToRect l="100000" t="100000" r="100000" b="100000"/>
-          </a:path>
+          <a:lin ang="5400000" scaled="0"/>
         </a:gradFill>
       </a:fillStyleLst>
       <a:lnStyleLst>
+        <a:ln w="6350" cap="flat" cmpd="sng" algn="ctr">
+          <a:solidFill>
+            <a:schemeClr val="phClr"/>
+          </a:solidFill>
+          <a:prstDash val="solid"/>
+          <a:miter lim="800000"/>
+        </a:ln>
         <a:ln w="12700" cap="flat" cmpd="sng" algn="ctr">
           <a:solidFill>
             <a:schemeClr val="phClr"/>
           </a:solidFill>
           <a:prstDash val="solid"/>
+          <a:miter lim="800000"/>
         </a:ln>
-        <a:ln w="15875" cap="flat" cmpd="sng" algn="ctr">
+        <a:ln w="19050" cap="flat" cmpd="sng" algn="ctr">
           <a:solidFill>
             <a:schemeClr val="phClr"/>
           </a:solidFill>
           <a:prstDash val="solid"/>
-        </a:ln>
-        <a:ln w="25400" cap="flat" cmpd="sng" algn="ctr">
-          <a:solidFill>
-            <a:schemeClr val="phClr"/>
-          </a:solidFill>
-          <a:prstDash val="solid"/>
+          <a:miter lim="800000"/>
         </a:ln>
       </a:lnStyleLst>
       <a:effectStyleLst>
@@ -2952,33 +4955,16 @@
           <a:effectLst/>
         </a:effectStyle>
         <a:effectStyle>
+          <a:effectLst/>
+        </a:effectStyle>
+        <a:effectStyle>
           <a:effectLst>
-            <a:outerShdw blurRad="38100" dist="25400" dir="2700000" algn="br" rotWithShape="0">
+            <a:outerShdw blurRad="57150" dist="19050" dir="5400000" algn="ctr" rotWithShape="0">
               <a:srgbClr val="000000">
-                <a:alpha val="60000"/>
+                <a:alpha val="63000"/>
               </a:srgbClr>
             </a:outerShdw>
           </a:effectLst>
-        </a:effectStyle>
-        <a:effectStyle>
-          <a:effectLst>
-            <a:outerShdw blurRad="44450" dist="25400" dir="2700000" algn="br" rotWithShape="0">
-              <a:srgbClr val="000000">
-                <a:alpha val="60000"/>
-              </a:srgbClr>
-            </a:outerShdw>
-          </a:effectLst>
-          <a:scene3d>
-            <a:camera prst="orthographicFront">
-              <a:rot lat="0" lon="0" rev="0"/>
-            </a:camera>
-            <a:lightRig rig="threePt" dir="t">
-              <a:rot lat="0" lon="0" rev="19800000"/>
-            </a:lightRig>
-          </a:scene3d>
-          <a:sp3d prstMaterial="flat">
-            <a:bevelT w="25400" h="31750"/>
-          </a:sp3d>
         </a:effectStyle>
       </a:effectStyleLst>
       <a:bgFillStyleLst>
@@ -2987,36 +4973,36 @@
         </a:solidFill>
         <a:solidFill>
           <a:schemeClr val="phClr">
-            <a:tint val="90000"/>
-            <a:shade val="97000"/>
-            <a:satMod val="130000"/>
+            <a:tint val="95000"/>
+            <a:satMod val="170000"/>
           </a:schemeClr>
         </a:solidFill>
         <a:gradFill rotWithShape="1">
           <a:gsLst>
             <a:gs pos="0">
               <a:schemeClr val="phClr">
-                <a:tint val="96000"/>
-                <a:shade val="99000"/>
-                <a:satMod val="140000"/>
+                <a:tint val="93000"/>
+                <a:satMod val="150000"/>
+                <a:shade val="98000"/>
+                <a:lumMod val="102000"/>
               </a:schemeClr>
             </a:gs>
-            <a:gs pos="65000">
+            <a:gs pos="50000">
               <a:schemeClr val="phClr">
-                <a:tint val="100000"/>
-                <a:shade val="80000"/>
+                <a:tint val="98000"/>
                 <a:satMod val="130000"/>
+                <a:shade val="90000"/>
+                <a:lumMod val="103000"/>
               </a:schemeClr>
             </a:gs>
             <a:gs pos="100000">
               <a:schemeClr val="phClr">
-                <a:tint val="100000"/>
-                <a:shade val="48000"/>
+                <a:shade val="63000"/>
                 <a:satMod val="120000"/>
               </a:schemeClr>
             </a:gs>
           </a:gsLst>
-          <a:lin ang="16200000" scaled="0"/>
+          <a:lin ang="5400000" scaled="0"/>
         </a:gradFill>
       </a:bgFillStyleLst>
     </a:fmtScheme>
@@ -3025,7 +5011,7 @@
   <a:extraClrSchemeLst/>
   <a:extLst>
     <a:ext uri="{05A4C25C-085E-4340-85A3-A5531E510DB2}">
-      <thm15:themeFamily xmlns:thm15="http://schemas.microsoft.com/office/thememl/2012/main" name="Retrospect" id="{5F128B03-DCCA-4EEB-AB3B-CF2899314A46}" vid="{3F1AAB62-24C6-49D2-8E01-B56FAC9A3DCD}"/>
+      <thm15:themeFamily xmlns:thm15="http://schemas.microsoft.com/office/thememl/2012/main" name="Office Theme" id="{62F939B6-93AF-4DB8-9C6B-D6C7DFDC589F}" vid="{4A3C46E8-61CC-4603-A589-7422A47A8E4A}"/>
     </a:ext>
   </a:extLst>
 </a:theme>

</xml_diff>

<commit_message>
Finalize Verification Environment section
</commit_message>
<xml_diff>
--- a/Report/Final_Report.docx
+++ b/Report/Final_Report.docx
@@ -223,7 +223,7 @@
           <w:r>
             <w:fldChar w:fldCharType="separate"/>
           </w:r>
-          <w:hyperlink w:anchor="_Toc230306878" w:history="1">
+          <w:hyperlink w:anchor="_Toc230310646" w:history="1">
             <w:r>
               <w:rPr>
                 <w:rStyle w:val="Hyperlink"/>
@@ -266,7 +266,253 @@
                 <w:noProof/>
                 <w:webHidden/>
               </w:rPr>
-              <w:instrText xml:space="preserve"> PAGEREF _Toc230306878 \h </w:instrText>
+              <w:instrText xml:space="preserve"> PAGEREF _Toc230310646 \h </w:instrText>
+            </w:r>
+            <w:r>
+              <w:rPr>
+                <w:noProof/>
+                <w:webHidden/>
+              </w:rPr>
+            </w:r>
+            <w:r>
+              <w:rPr>
+                <w:noProof/>
+                <w:webHidden/>
+              </w:rPr>
+              <w:fldChar w:fldCharType="separate"/>
+            </w:r>
+            <w:r>
+              <w:rPr>
+                <w:noProof/>
+                <w:webHidden/>
+              </w:rPr>
+              <w:t>1</w:t>
+            </w:r>
+            <w:r>
+              <w:rPr>
+                <w:noProof/>
+                <w:webHidden/>
+              </w:rPr>
+              <w:fldChar w:fldCharType="end"/>
+            </w:r>
+          </w:hyperlink>
+        </w:p>
+        <w:p>
+          <w:pPr>
+            <w:pStyle w:val="TOC2"/>
+            <w:tabs>
+              <w:tab w:val="left" w:pos="880"/>
+              <w:tab w:val="right" w:leader="dot" w:pos="9350"/>
+            </w:tabs>
+            <w:rPr>
+              <w:noProof/>
+            </w:rPr>
+          </w:pPr>
+          <w:hyperlink w:anchor="_Toc230310647" w:history="1">
+            <w:r>
+              <w:rPr>
+                <w:rStyle w:val="Hyperlink"/>
+                <w:noProof/>
+              </w:rPr>
+              <w:t>1.1</w:t>
+            </w:r>
+            <w:r>
+              <w:rPr>
+                <w:noProof/>
+              </w:rPr>
+              <w:tab/>
+            </w:r>
+            <w:r>
+              <w:rPr>
+                <w:rStyle w:val="Hyperlink"/>
+                <w:noProof/>
+              </w:rPr>
+              <w:t>Project overview</w:t>
+            </w:r>
+            <w:r>
+              <w:rPr>
+                <w:noProof/>
+                <w:webHidden/>
+              </w:rPr>
+              <w:tab/>
+            </w:r>
+            <w:r>
+              <w:rPr>
+                <w:noProof/>
+                <w:webHidden/>
+              </w:rPr>
+              <w:fldChar w:fldCharType="begin"/>
+            </w:r>
+            <w:r>
+              <w:rPr>
+                <w:noProof/>
+                <w:webHidden/>
+              </w:rPr>
+              <w:instrText xml:space="preserve"> PAGEREF _Toc230310647 \h </w:instrText>
+            </w:r>
+            <w:r>
+              <w:rPr>
+                <w:noProof/>
+                <w:webHidden/>
+              </w:rPr>
+            </w:r>
+            <w:r>
+              <w:rPr>
+                <w:noProof/>
+                <w:webHidden/>
+              </w:rPr>
+              <w:fldChar w:fldCharType="separate"/>
+            </w:r>
+            <w:r>
+              <w:rPr>
+                <w:noProof/>
+                <w:webHidden/>
+              </w:rPr>
+              <w:t>1</w:t>
+            </w:r>
+            <w:r>
+              <w:rPr>
+                <w:noProof/>
+                <w:webHidden/>
+              </w:rPr>
+              <w:fldChar w:fldCharType="end"/>
+            </w:r>
+          </w:hyperlink>
+        </w:p>
+        <w:p>
+          <w:pPr>
+            <w:pStyle w:val="TOC2"/>
+            <w:tabs>
+              <w:tab w:val="left" w:pos="880"/>
+              <w:tab w:val="right" w:leader="dot" w:pos="9350"/>
+            </w:tabs>
+            <w:rPr>
+              <w:noProof/>
+            </w:rPr>
+          </w:pPr>
+          <w:hyperlink w:anchor="_Toc230310648" w:history="1">
+            <w:r>
+              <w:rPr>
+                <w:rStyle w:val="Hyperlink"/>
+                <w:noProof/>
+              </w:rPr>
+              <w:t>1.2</w:t>
+            </w:r>
+            <w:r>
+              <w:rPr>
+                <w:noProof/>
+              </w:rPr>
+              <w:tab/>
+            </w:r>
+            <w:r>
+              <w:rPr>
+                <w:rStyle w:val="Hyperlink"/>
+                <w:noProof/>
+              </w:rPr>
+              <w:t>Verification methodology</w:t>
+            </w:r>
+            <w:r>
+              <w:rPr>
+                <w:noProof/>
+                <w:webHidden/>
+              </w:rPr>
+              <w:tab/>
+            </w:r>
+            <w:r>
+              <w:rPr>
+                <w:noProof/>
+                <w:webHidden/>
+              </w:rPr>
+              <w:fldChar w:fldCharType="begin"/>
+            </w:r>
+            <w:r>
+              <w:rPr>
+                <w:noProof/>
+                <w:webHidden/>
+              </w:rPr>
+              <w:instrText xml:space="preserve"> PAGEREF _Toc230310648 \h </w:instrText>
+            </w:r>
+            <w:r>
+              <w:rPr>
+                <w:noProof/>
+                <w:webHidden/>
+              </w:rPr>
+            </w:r>
+            <w:r>
+              <w:rPr>
+                <w:noProof/>
+                <w:webHidden/>
+              </w:rPr>
+              <w:fldChar w:fldCharType="separate"/>
+            </w:r>
+            <w:r>
+              <w:rPr>
+                <w:noProof/>
+                <w:webHidden/>
+              </w:rPr>
+              <w:t>1</w:t>
+            </w:r>
+            <w:r>
+              <w:rPr>
+                <w:noProof/>
+                <w:webHidden/>
+              </w:rPr>
+              <w:fldChar w:fldCharType="end"/>
+            </w:r>
+          </w:hyperlink>
+        </w:p>
+        <w:p>
+          <w:pPr>
+            <w:pStyle w:val="TOC2"/>
+            <w:tabs>
+              <w:tab w:val="left" w:pos="880"/>
+              <w:tab w:val="right" w:leader="dot" w:pos="9350"/>
+            </w:tabs>
+            <w:rPr>
+              <w:noProof/>
+            </w:rPr>
+          </w:pPr>
+          <w:hyperlink w:anchor="_Toc230310649" w:history="1">
+            <w:r>
+              <w:rPr>
+                <w:rStyle w:val="Hyperlink"/>
+                <w:noProof/>
+              </w:rPr>
+              <w:t>1.3</w:t>
+            </w:r>
+            <w:r>
+              <w:rPr>
+                <w:noProof/>
+              </w:rPr>
+              <w:tab/>
+            </w:r>
+            <w:r>
+              <w:rPr>
+                <w:rStyle w:val="Hyperlink"/>
+                <w:noProof/>
+              </w:rPr>
+              <w:t>Report rganization</w:t>
+            </w:r>
+            <w:r>
+              <w:rPr>
+                <w:noProof/>
+                <w:webHidden/>
+              </w:rPr>
+              <w:tab/>
+            </w:r>
+            <w:r>
+              <w:rPr>
+                <w:noProof/>
+                <w:webHidden/>
+              </w:rPr>
+              <w:fldChar w:fldCharType="begin"/>
+            </w:r>
+            <w:r>
+              <w:rPr>
+                <w:noProof/>
+                <w:webHidden/>
+              </w:rPr>
+              <w:instrText xml:space="preserve"> PAGEREF _Toc230310649 \h </w:instrText>
             </w:r>
             <w:r>
               <w:rPr>
@@ -311,7 +557,7 @@
               <w:szCs w:val="22"/>
             </w:rPr>
           </w:pPr>
-          <w:hyperlink w:anchor="_Toc230306879" w:history="1">
+          <w:hyperlink w:anchor="_Toc230310650" w:history="1">
             <w:r>
               <w:rPr>
                 <w:rStyle w:val="Hyperlink"/>
@@ -354,7 +600,335 @@
                 <w:noProof/>
                 <w:webHidden/>
               </w:rPr>
-              <w:instrText xml:space="preserve"> PAGEREF _Toc230306879 \h </w:instrText>
+              <w:instrText xml:space="preserve"> PAGEREF _Toc230310650 \h </w:instrText>
+            </w:r>
+            <w:r>
+              <w:rPr>
+                <w:noProof/>
+                <w:webHidden/>
+              </w:rPr>
+            </w:r>
+            <w:r>
+              <w:rPr>
+                <w:noProof/>
+                <w:webHidden/>
+              </w:rPr>
+              <w:fldChar w:fldCharType="separate"/>
+            </w:r>
+            <w:r>
+              <w:rPr>
+                <w:noProof/>
+                <w:webHidden/>
+              </w:rPr>
+              <w:t>2</w:t>
+            </w:r>
+            <w:r>
+              <w:rPr>
+                <w:noProof/>
+                <w:webHidden/>
+              </w:rPr>
+              <w:fldChar w:fldCharType="end"/>
+            </w:r>
+          </w:hyperlink>
+        </w:p>
+        <w:p>
+          <w:pPr>
+            <w:pStyle w:val="TOC2"/>
+            <w:tabs>
+              <w:tab w:val="left" w:pos="880"/>
+              <w:tab w:val="right" w:leader="dot" w:pos="9350"/>
+            </w:tabs>
+            <w:rPr>
+              <w:noProof/>
+            </w:rPr>
+          </w:pPr>
+          <w:hyperlink w:anchor="_Toc230310651" w:history="1">
+            <w:r>
+              <w:rPr>
+                <w:rStyle w:val="Hyperlink"/>
+                <w:noProof/>
+              </w:rPr>
+              <w:t>2.1</w:t>
+            </w:r>
+            <w:r>
+              <w:rPr>
+                <w:noProof/>
+              </w:rPr>
+              <w:tab/>
+            </w:r>
+            <w:r>
+              <w:rPr>
+                <w:rStyle w:val="Hyperlink"/>
+                <w:noProof/>
+              </w:rPr>
+              <w:t>Architecture</w:t>
+            </w:r>
+            <w:r>
+              <w:rPr>
+                <w:noProof/>
+                <w:webHidden/>
+              </w:rPr>
+              <w:tab/>
+            </w:r>
+            <w:r>
+              <w:rPr>
+                <w:noProof/>
+                <w:webHidden/>
+              </w:rPr>
+              <w:fldChar w:fldCharType="begin"/>
+            </w:r>
+            <w:r>
+              <w:rPr>
+                <w:noProof/>
+                <w:webHidden/>
+              </w:rPr>
+              <w:instrText xml:space="preserve"> PAGEREF _Toc230310651 \h </w:instrText>
+            </w:r>
+            <w:r>
+              <w:rPr>
+                <w:noProof/>
+                <w:webHidden/>
+              </w:rPr>
+            </w:r>
+            <w:r>
+              <w:rPr>
+                <w:noProof/>
+                <w:webHidden/>
+              </w:rPr>
+              <w:fldChar w:fldCharType="separate"/>
+            </w:r>
+            <w:r>
+              <w:rPr>
+                <w:noProof/>
+                <w:webHidden/>
+              </w:rPr>
+              <w:t>2</w:t>
+            </w:r>
+            <w:r>
+              <w:rPr>
+                <w:noProof/>
+                <w:webHidden/>
+              </w:rPr>
+              <w:fldChar w:fldCharType="end"/>
+            </w:r>
+          </w:hyperlink>
+        </w:p>
+        <w:p>
+          <w:pPr>
+            <w:pStyle w:val="TOC2"/>
+            <w:tabs>
+              <w:tab w:val="left" w:pos="880"/>
+              <w:tab w:val="right" w:leader="dot" w:pos="9350"/>
+            </w:tabs>
+            <w:rPr>
+              <w:noProof/>
+            </w:rPr>
+          </w:pPr>
+          <w:hyperlink w:anchor="_Toc230310652" w:history="1">
+            <w:r>
+              <w:rPr>
+                <w:rStyle w:val="Hyperlink"/>
+                <w:noProof/>
+              </w:rPr>
+              <w:t>2.2</w:t>
+            </w:r>
+            <w:r>
+              <w:rPr>
+                <w:noProof/>
+              </w:rPr>
+              <w:tab/>
+            </w:r>
+            <w:r>
+              <w:rPr>
+                <w:rStyle w:val="Hyperlink"/>
+                <w:noProof/>
+              </w:rPr>
+              <w:t>FSM and transfer behavior</w:t>
+            </w:r>
+            <w:r>
+              <w:rPr>
+                <w:noProof/>
+                <w:webHidden/>
+              </w:rPr>
+              <w:tab/>
+            </w:r>
+            <w:r>
+              <w:rPr>
+                <w:noProof/>
+                <w:webHidden/>
+              </w:rPr>
+              <w:fldChar w:fldCharType="begin"/>
+            </w:r>
+            <w:r>
+              <w:rPr>
+                <w:noProof/>
+                <w:webHidden/>
+              </w:rPr>
+              <w:instrText xml:space="preserve"> PAGEREF _Toc230310652 \h </w:instrText>
+            </w:r>
+            <w:r>
+              <w:rPr>
+                <w:noProof/>
+                <w:webHidden/>
+              </w:rPr>
+            </w:r>
+            <w:r>
+              <w:rPr>
+                <w:noProof/>
+                <w:webHidden/>
+              </w:rPr>
+              <w:fldChar w:fldCharType="separate"/>
+            </w:r>
+            <w:r>
+              <w:rPr>
+                <w:noProof/>
+                <w:webHidden/>
+              </w:rPr>
+              <w:t>2</w:t>
+            </w:r>
+            <w:r>
+              <w:rPr>
+                <w:noProof/>
+                <w:webHidden/>
+              </w:rPr>
+              <w:fldChar w:fldCharType="end"/>
+            </w:r>
+          </w:hyperlink>
+        </w:p>
+        <w:p>
+          <w:pPr>
+            <w:pStyle w:val="TOC2"/>
+            <w:tabs>
+              <w:tab w:val="left" w:pos="880"/>
+              <w:tab w:val="right" w:leader="dot" w:pos="9350"/>
+            </w:tabs>
+            <w:rPr>
+              <w:noProof/>
+            </w:rPr>
+          </w:pPr>
+          <w:hyperlink w:anchor="_Toc230310653" w:history="1">
+            <w:r>
+              <w:rPr>
+                <w:rStyle w:val="Hyperlink"/>
+                <w:noProof/>
+              </w:rPr>
+              <w:t>2.3</w:t>
+            </w:r>
+            <w:r>
+              <w:rPr>
+                <w:noProof/>
+              </w:rPr>
+              <w:tab/>
+            </w:r>
+            <w:r>
+              <w:rPr>
+                <w:rStyle w:val="Hyperlink"/>
+                <w:noProof/>
+              </w:rPr>
+              <w:t>Slave select and FIFO control</w:t>
+            </w:r>
+            <w:r>
+              <w:rPr>
+                <w:noProof/>
+                <w:webHidden/>
+              </w:rPr>
+              <w:tab/>
+            </w:r>
+            <w:r>
+              <w:rPr>
+                <w:noProof/>
+                <w:webHidden/>
+              </w:rPr>
+              <w:fldChar w:fldCharType="begin"/>
+            </w:r>
+            <w:r>
+              <w:rPr>
+                <w:noProof/>
+                <w:webHidden/>
+              </w:rPr>
+              <w:instrText xml:space="preserve"> PAGEREF _Toc230310653 \h </w:instrText>
+            </w:r>
+            <w:r>
+              <w:rPr>
+                <w:noProof/>
+                <w:webHidden/>
+              </w:rPr>
+            </w:r>
+            <w:r>
+              <w:rPr>
+                <w:noProof/>
+                <w:webHidden/>
+              </w:rPr>
+              <w:fldChar w:fldCharType="separate"/>
+            </w:r>
+            <w:r>
+              <w:rPr>
+                <w:noProof/>
+                <w:webHidden/>
+              </w:rPr>
+              <w:t>2</w:t>
+            </w:r>
+            <w:r>
+              <w:rPr>
+                <w:noProof/>
+                <w:webHidden/>
+              </w:rPr>
+              <w:fldChar w:fldCharType="end"/>
+            </w:r>
+          </w:hyperlink>
+        </w:p>
+        <w:p>
+          <w:pPr>
+            <w:pStyle w:val="TOC2"/>
+            <w:tabs>
+              <w:tab w:val="left" w:pos="880"/>
+              <w:tab w:val="right" w:leader="dot" w:pos="9350"/>
+            </w:tabs>
+            <w:rPr>
+              <w:noProof/>
+            </w:rPr>
+          </w:pPr>
+          <w:hyperlink w:anchor="_Toc230310654" w:history="1">
+            <w:r>
+              <w:rPr>
+                <w:rStyle w:val="Hyperlink"/>
+                <w:noProof/>
+              </w:rPr>
+              <w:t>2.4</w:t>
+            </w:r>
+            <w:r>
+              <w:rPr>
+                <w:noProof/>
+              </w:rPr>
+              <w:tab/>
+            </w:r>
+            <w:r>
+              <w:rPr>
+                <w:rStyle w:val="Hyperlink"/>
+                <w:noProof/>
+              </w:rPr>
+              <w:t>Interrupt logic</w:t>
+            </w:r>
+            <w:r>
+              <w:rPr>
+                <w:noProof/>
+                <w:webHidden/>
+              </w:rPr>
+              <w:tab/>
+            </w:r>
+            <w:r>
+              <w:rPr>
+                <w:noProof/>
+                <w:webHidden/>
+              </w:rPr>
+              <w:fldChar w:fldCharType="begin"/>
+            </w:r>
+            <w:r>
+              <w:rPr>
+                <w:noProof/>
+                <w:webHidden/>
+              </w:rPr>
+              <w:instrText xml:space="preserve"> PAGEREF _Toc230310654 \h </w:instrText>
             </w:r>
             <w:r>
               <w:rPr>
@@ -399,7 +973,7 @@
               <w:szCs w:val="22"/>
             </w:rPr>
           </w:pPr>
-          <w:hyperlink w:anchor="_Toc230306880" w:history="1">
+          <w:hyperlink w:anchor="_Toc230310655" w:history="1">
             <w:r>
               <w:rPr>
                 <w:rStyle w:val="Hyperlink"/>
@@ -442,7 +1016,7 @@
                 <w:noProof/>
                 <w:webHidden/>
               </w:rPr>
-              <w:instrText xml:space="preserve"> PAGEREF _Toc230306880 \h </w:instrText>
+              <w:instrText xml:space="preserve"> PAGEREF _Toc230310655 \h </w:instrText>
             </w:r>
             <w:r>
               <w:rPr>
@@ -462,7 +1036,417 @@
                 <w:noProof/>
                 <w:webHidden/>
               </w:rPr>
-              <w:t>3</w:t>
+              <w:t>4</w:t>
+            </w:r>
+            <w:r>
+              <w:rPr>
+                <w:noProof/>
+                <w:webHidden/>
+              </w:rPr>
+              <w:fldChar w:fldCharType="end"/>
+            </w:r>
+          </w:hyperlink>
+        </w:p>
+        <w:p>
+          <w:pPr>
+            <w:pStyle w:val="TOC2"/>
+            <w:tabs>
+              <w:tab w:val="left" w:pos="880"/>
+              <w:tab w:val="right" w:leader="dot" w:pos="9350"/>
+            </w:tabs>
+            <w:rPr>
+              <w:noProof/>
+            </w:rPr>
+          </w:pPr>
+          <w:hyperlink w:anchor="_Toc230310656" w:history="1">
+            <w:r>
+              <w:rPr>
+                <w:rStyle w:val="Hyperlink"/>
+                <w:noProof/>
+              </w:rPr>
+              <w:t>3.1</w:t>
+            </w:r>
+            <w:r>
+              <w:rPr>
+                <w:noProof/>
+              </w:rPr>
+              <w:tab/>
+            </w:r>
+            <w:r>
+              <w:rPr>
+                <w:rStyle w:val="Hyperlink"/>
+                <w:noProof/>
+              </w:rPr>
+              <w:t>Testbench architecture</w:t>
+            </w:r>
+            <w:r>
+              <w:rPr>
+                <w:noProof/>
+                <w:webHidden/>
+              </w:rPr>
+              <w:tab/>
+            </w:r>
+            <w:r>
+              <w:rPr>
+                <w:noProof/>
+                <w:webHidden/>
+              </w:rPr>
+              <w:fldChar w:fldCharType="begin"/>
+            </w:r>
+            <w:r>
+              <w:rPr>
+                <w:noProof/>
+                <w:webHidden/>
+              </w:rPr>
+              <w:instrText xml:space="preserve"> PAGEREF _Toc230310656 \h </w:instrText>
+            </w:r>
+            <w:r>
+              <w:rPr>
+                <w:noProof/>
+                <w:webHidden/>
+              </w:rPr>
+            </w:r>
+            <w:r>
+              <w:rPr>
+                <w:noProof/>
+                <w:webHidden/>
+              </w:rPr>
+              <w:fldChar w:fldCharType="separate"/>
+            </w:r>
+            <w:r>
+              <w:rPr>
+                <w:noProof/>
+                <w:webHidden/>
+              </w:rPr>
+              <w:t>4</w:t>
+            </w:r>
+            <w:r>
+              <w:rPr>
+                <w:noProof/>
+                <w:webHidden/>
+              </w:rPr>
+              <w:fldChar w:fldCharType="end"/>
+            </w:r>
+          </w:hyperlink>
+        </w:p>
+        <w:p>
+          <w:pPr>
+            <w:pStyle w:val="TOC2"/>
+            <w:tabs>
+              <w:tab w:val="left" w:pos="880"/>
+              <w:tab w:val="right" w:leader="dot" w:pos="9350"/>
+            </w:tabs>
+            <w:rPr>
+              <w:noProof/>
+            </w:rPr>
+          </w:pPr>
+          <w:hyperlink w:anchor="_Toc230310657" w:history="1">
+            <w:r>
+              <w:rPr>
+                <w:rStyle w:val="Hyperlink"/>
+                <w:noProof/>
+              </w:rPr>
+              <w:t>3.2</w:t>
+            </w:r>
+            <w:r>
+              <w:rPr>
+                <w:noProof/>
+              </w:rPr>
+              <w:tab/>
+            </w:r>
+            <w:r>
+              <w:rPr>
+                <w:rStyle w:val="Hyperlink"/>
+                <w:noProof/>
+              </w:rPr>
+              <w:t>Environment components</w:t>
+            </w:r>
+            <w:r>
+              <w:rPr>
+                <w:noProof/>
+                <w:webHidden/>
+              </w:rPr>
+              <w:tab/>
+            </w:r>
+            <w:r>
+              <w:rPr>
+                <w:noProof/>
+                <w:webHidden/>
+              </w:rPr>
+              <w:fldChar w:fldCharType="begin"/>
+            </w:r>
+            <w:r>
+              <w:rPr>
+                <w:noProof/>
+                <w:webHidden/>
+              </w:rPr>
+              <w:instrText xml:space="preserve"> PAGEREF _Toc230310657 \h </w:instrText>
+            </w:r>
+            <w:r>
+              <w:rPr>
+                <w:noProof/>
+                <w:webHidden/>
+              </w:rPr>
+            </w:r>
+            <w:r>
+              <w:rPr>
+                <w:noProof/>
+                <w:webHidden/>
+              </w:rPr>
+              <w:fldChar w:fldCharType="separate"/>
+            </w:r>
+            <w:r>
+              <w:rPr>
+                <w:noProof/>
+                <w:webHidden/>
+              </w:rPr>
+              <w:t>4</w:t>
+            </w:r>
+            <w:r>
+              <w:rPr>
+                <w:noProof/>
+                <w:webHidden/>
+              </w:rPr>
+              <w:fldChar w:fldCharType="end"/>
+            </w:r>
+          </w:hyperlink>
+        </w:p>
+        <w:p>
+          <w:pPr>
+            <w:pStyle w:val="TOC2"/>
+            <w:tabs>
+              <w:tab w:val="left" w:pos="880"/>
+              <w:tab w:val="right" w:leader="dot" w:pos="9350"/>
+            </w:tabs>
+            <w:rPr>
+              <w:noProof/>
+            </w:rPr>
+          </w:pPr>
+          <w:hyperlink w:anchor="_Toc230310658" w:history="1">
+            <w:r>
+              <w:rPr>
+                <w:rStyle w:val="Hyperlink"/>
+                <w:noProof/>
+              </w:rPr>
+              <w:t>3.3</w:t>
+            </w:r>
+            <w:r>
+              <w:rPr>
+                <w:noProof/>
+              </w:rPr>
+              <w:tab/>
+            </w:r>
+            <w:r>
+              <w:rPr>
+                <w:rStyle w:val="Hyperlink"/>
+                <w:noProof/>
+              </w:rPr>
+              <w:t>Coverage model</w:t>
+            </w:r>
+            <w:r>
+              <w:rPr>
+                <w:noProof/>
+                <w:webHidden/>
+              </w:rPr>
+              <w:tab/>
+            </w:r>
+            <w:r>
+              <w:rPr>
+                <w:noProof/>
+                <w:webHidden/>
+              </w:rPr>
+              <w:fldChar w:fldCharType="begin"/>
+            </w:r>
+            <w:r>
+              <w:rPr>
+                <w:noProof/>
+                <w:webHidden/>
+              </w:rPr>
+              <w:instrText xml:space="preserve"> PAGEREF _Toc230310658 \h </w:instrText>
+            </w:r>
+            <w:r>
+              <w:rPr>
+                <w:noProof/>
+                <w:webHidden/>
+              </w:rPr>
+            </w:r>
+            <w:r>
+              <w:rPr>
+                <w:noProof/>
+                <w:webHidden/>
+              </w:rPr>
+              <w:fldChar w:fldCharType="separate"/>
+            </w:r>
+            <w:r>
+              <w:rPr>
+                <w:noProof/>
+                <w:webHidden/>
+              </w:rPr>
+              <w:t>4</w:t>
+            </w:r>
+            <w:r>
+              <w:rPr>
+                <w:noProof/>
+                <w:webHidden/>
+              </w:rPr>
+              <w:fldChar w:fldCharType="end"/>
+            </w:r>
+          </w:hyperlink>
+        </w:p>
+        <w:p>
+          <w:pPr>
+            <w:pStyle w:val="TOC2"/>
+            <w:tabs>
+              <w:tab w:val="left" w:pos="880"/>
+              <w:tab w:val="right" w:leader="dot" w:pos="9350"/>
+            </w:tabs>
+            <w:rPr>
+              <w:noProof/>
+            </w:rPr>
+          </w:pPr>
+          <w:hyperlink w:anchor="_Toc230310659" w:history="1">
+            <w:r>
+              <w:rPr>
+                <w:rStyle w:val="Hyperlink"/>
+                <w:noProof/>
+              </w:rPr>
+              <w:t>3.4</w:t>
+            </w:r>
+            <w:r>
+              <w:rPr>
+                <w:noProof/>
+              </w:rPr>
+              <w:tab/>
+            </w:r>
+            <w:r>
+              <w:rPr>
+                <w:rStyle w:val="Hyperlink"/>
+                <w:noProof/>
+              </w:rPr>
+              <w:t>Regression infrastructure</w:t>
+            </w:r>
+            <w:r>
+              <w:rPr>
+                <w:noProof/>
+                <w:webHidden/>
+              </w:rPr>
+              <w:tab/>
+            </w:r>
+            <w:r>
+              <w:rPr>
+                <w:noProof/>
+                <w:webHidden/>
+              </w:rPr>
+              <w:fldChar w:fldCharType="begin"/>
+            </w:r>
+            <w:r>
+              <w:rPr>
+                <w:noProof/>
+                <w:webHidden/>
+              </w:rPr>
+              <w:instrText xml:space="preserve"> PAGEREF _Toc230310659 \h </w:instrText>
+            </w:r>
+            <w:r>
+              <w:rPr>
+                <w:noProof/>
+                <w:webHidden/>
+              </w:rPr>
+            </w:r>
+            <w:r>
+              <w:rPr>
+                <w:noProof/>
+                <w:webHidden/>
+              </w:rPr>
+              <w:fldChar w:fldCharType="separate"/>
+            </w:r>
+            <w:r>
+              <w:rPr>
+                <w:noProof/>
+                <w:webHidden/>
+              </w:rPr>
+              <w:t>5</w:t>
+            </w:r>
+            <w:r>
+              <w:rPr>
+                <w:noProof/>
+                <w:webHidden/>
+              </w:rPr>
+              <w:fldChar w:fldCharType="end"/>
+            </w:r>
+          </w:hyperlink>
+        </w:p>
+        <w:p>
+          <w:pPr>
+            <w:pStyle w:val="TOC2"/>
+            <w:tabs>
+              <w:tab w:val="left" w:pos="880"/>
+              <w:tab w:val="right" w:leader="dot" w:pos="9350"/>
+            </w:tabs>
+            <w:rPr>
+              <w:noProof/>
+            </w:rPr>
+          </w:pPr>
+          <w:hyperlink w:anchor="_Toc230310660" w:history="1">
+            <w:r>
+              <w:rPr>
+                <w:rStyle w:val="Hyperlink"/>
+                <w:noProof/>
+              </w:rPr>
+              <w:t>3.5</w:t>
+            </w:r>
+            <w:r>
+              <w:rPr>
+                <w:noProof/>
+              </w:rPr>
+              <w:tab/>
+            </w:r>
+            <w:r>
+              <w:rPr>
+                <w:rStyle w:val="Hyperlink"/>
+                <w:noProof/>
+              </w:rPr>
+              <w:t>Parallel regression runner</w:t>
+            </w:r>
+            <w:r>
+              <w:rPr>
+                <w:noProof/>
+                <w:webHidden/>
+              </w:rPr>
+              <w:tab/>
+            </w:r>
+            <w:r>
+              <w:rPr>
+                <w:noProof/>
+                <w:webHidden/>
+              </w:rPr>
+              <w:fldChar w:fldCharType="begin"/>
+            </w:r>
+            <w:r>
+              <w:rPr>
+                <w:noProof/>
+                <w:webHidden/>
+              </w:rPr>
+              <w:instrText xml:space="preserve"> PAGEREF _Toc230310660 \h </w:instrText>
+            </w:r>
+            <w:r>
+              <w:rPr>
+                <w:noProof/>
+                <w:webHidden/>
+              </w:rPr>
+            </w:r>
+            <w:r>
+              <w:rPr>
+                <w:noProof/>
+                <w:webHidden/>
+              </w:rPr>
+              <w:fldChar w:fldCharType="separate"/>
+            </w:r>
+            <w:r>
+              <w:rPr>
+                <w:noProof/>
+                <w:webHidden/>
+              </w:rPr>
+              <w:t>6</w:t>
             </w:r>
             <w:r>
               <w:rPr>
@@ -487,7 +1471,7 @@
               <w:szCs w:val="22"/>
             </w:rPr>
           </w:pPr>
-          <w:hyperlink w:anchor="_Toc230306881" w:history="1">
+          <w:hyperlink w:anchor="_Toc230310661" w:history="1">
             <w:r>
               <w:rPr>
                 <w:rStyle w:val="Hyperlink"/>
@@ -530,7 +1514,7 @@
                 <w:noProof/>
                 <w:webHidden/>
               </w:rPr>
-              <w:instrText xml:space="preserve"> PAGEREF _Toc230306881 \h </w:instrText>
+              <w:instrText xml:space="preserve"> PAGEREF _Toc230310661 \h </w:instrText>
             </w:r>
             <w:r>
               <w:rPr>
@@ -550,7 +1534,7 @@
                 <w:noProof/>
                 <w:webHidden/>
               </w:rPr>
-              <w:t>4</w:t>
+              <w:t>7</w:t>
             </w:r>
             <w:r>
               <w:rPr>
@@ -575,7 +1559,7 @@
               <w:szCs w:val="22"/>
             </w:rPr>
           </w:pPr>
-          <w:hyperlink w:anchor="_Toc230306882" w:history="1">
+          <w:hyperlink w:anchor="_Toc230310662" w:history="1">
             <w:r>
               <w:rPr>
                 <w:rStyle w:val="Hyperlink"/>
@@ -618,7 +1602,7 @@
                 <w:noProof/>
                 <w:webHidden/>
               </w:rPr>
-              <w:instrText xml:space="preserve"> PAGEREF _Toc230306882 \h </w:instrText>
+              <w:instrText xml:space="preserve"> PAGEREF _Toc230310662 \h </w:instrText>
             </w:r>
             <w:r>
               <w:rPr>
@@ -638,7 +1622,7 @@
                 <w:noProof/>
                 <w:webHidden/>
               </w:rPr>
-              <w:t>5</w:t>
+              <w:t>8</w:t>
             </w:r>
             <w:r>
               <w:rPr>
@@ -663,7 +1647,7 @@
               <w:szCs w:val="22"/>
             </w:rPr>
           </w:pPr>
-          <w:hyperlink w:anchor="_Toc230306883" w:history="1">
+          <w:hyperlink w:anchor="_Toc230310663" w:history="1">
             <w:r>
               <w:rPr>
                 <w:rStyle w:val="Hyperlink"/>
@@ -706,7 +1690,7 @@
                 <w:noProof/>
                 <w:webHidden/>
               </w:rPr>
-              <w:instrText xml:space="preserve"> PAGEREF _Toc230306883 \h </w:instrText>
+              <w:instrText xml:space="preserve"> PAGEREF _Toc230310663 \h </w:instrText>
             </w:r>
             <w:r>
               <w:rPr>
@@ -726,7 +1710,7 @@
                 <w:noProof/>
                 <w:webHidden/>
               </w:rPr>
-              <w:t>6</w:t>
+              <w:t>9</w:t>
             </w:r>
             <w:r>
               <w:rPr>
@@ -774,7 +1758,7 @@
       <w:pPr>
         <w:pStyle w:val="Heading1"/>
       </w:pPr>
-      <w:bookmarkStart w:id="0" w:name="_Toc230306878"/>
+      <w:bookmarkStart w:id="0" w:name="_Toc230310646"/>
       <w:r>
         <w:lastRenderedPageBreak/>
         <w:t>Introduction</w:t>
@@ -783,131 +1767,134 @@
     </w:p>
     <w:p>
       <w:pPr>
-        <w:ind w:firstLine="432"/>
-        <w:jc w:val="both"/>
-      </w:pPr>
-      <w:r>
-        <w:t xml:space="preserve">This report documents the verification environment developed for the SPI Master Controller IP as part of the Digital Design Verification final project at Ain Shams University, Spring 2026. The DUT mimics the register layout of production-grade SPI masters found in ARM MCUs, making the verification lessons directly transferable to industry practice. </w:t>
-      </w:r>
-    </w:p>
-    <w:p>
-      <w:pPr>
-        <w:ind w:firstLine="432"/>
-        <w:jc w:val="both"/>
-      </w:pPr>
-      <w:r>
-        <w:t>The verification methodology adopted is SystemVerilog-only, utilizing constrained-random stimulus, functional coverage, a reference model-based scoreboard, and SystemVerilog Assertions (SVA). The grading contract requires a minimum of 10 mandatory tests, ≥</w:t>
-      </w:r>
-      <w:r>
-        <w:t xml:space="preserve"> </w:t>
-      </w:r>
-      <w:r>
-        <w:t xml:space="preserve">85% functional coverage, and ≥5 SVA assertions bound into the DUT hierarchy. The bug detection target is 20 of 28 scored bugs; two bugs (BUG_E03/BUG_E04) were retired from scoring as they self-heal within one </w:t>
-      </w:r>
-      <w:r>
-        <w:rPr>
-          <w:b/>
-          <w:bCs/>
-        </w:rPr>
-        <w:t>PCLK</w:t>
-      </w:r>
-      <w:r>
-        <w:t xml:space="preserve"> cycle and are not observable from any APB stimulus path. Critically, the verification environment must remain functional when the golden RTL is replaced by any of the 28 buggy variants without modification.</w:t>
-      </w:r>
-    </w:p>
-    <w:p>
-      <w:pPr>
-        <w:ind w:firstLine="432"/>
-        <w:jc w:val="both"/>
-      </w:pPr>
-      <w:r>
-        <w:t>The objective of this project is to design and implement a comprehensive SystemVerilog verification environment capable of detecting functional bugs in the DUT against a defined specification.</w:t>
-      </w:r>
-    </w:p>
-    <w:p>
-      <w:pPr>
-        <w:ind w:firstLine="432"/>
-        <w:jc w:val="both"/>
-      </w:pPr>
-      <w:r>
-        <w:t>The report is organized as follows: Section 2 describes the DUT architecture and key requirements, Section 3 details the verification environment components, Section 4 presents simulation results, Section 5 discusses bugs found, and Section 6 concludes with lessons learned.</w:t>
-      </w:r>
-    </w:p>
-    <w:p>
-      <w:pPr>
-        <w:ind w:firstLine="432"/>
-        <w:jc w:val="both"/>
-      </w:pPr>
-    </w:p>
-    <w:p>
-      <w:pPr>
-        <w:ind w:firstLine="432"/>
-        <w:jc w:val="both"/>
-      </w:pPr>
-    </w:p>
-    <w:p>
-      <w:pPr>
-        <w:ind w:firstLine="432"/>
-        <w:jc w:val="both"/>
-      </w:pPr>
-    </w:p>
-    <w:p>
-      <w:pPr>
-        <w:spacing w:line="259" w:lineRule="auto"/>
-      </w:pPr>
-      <w:r>
-        <w:br w:type="page"/>
-      </w:r>
-    </w:p>
-    <w:p>
-      <w:pPr>
-        <w:pStyle w:val="Heading1"/>
-      </w:pPr>
-      <w:bookmarkStart w:id="1" w:name="_Toc230306879"/>
-      <w:r>
-        <w:lastRenderedPageBreak/>
-        <w:t>Design Under Test</w:t>
+        <w:pStyle w:val="Heading2"/>
+      </w:pPr>
+      <w:bookmarkStart w:id="1" w:name="_Toc230310647"/>
+      <w:r>
+        <w:t xml:space="preserve">Project </w:t>
+      </w:r>
+      <w:r>
+        <w:t>o</w:t>
+      </w:r>
+      <w:r>
+        <w:t>verview</w:t>
       </w:r>
       <w:bookmarkEnd w:id="1"/>
     </w:p>
     <w:p>
       <w:pPr>
+        <w:ind w:firstLine="576"/>
+        <w:jc w:val="both"/>
+      </w:pPr>
+      <w:r>
+        <w:t xml:space="preserve">This report documents the verification environment developed for the SPI Master Controller IP as part of the Digital Design Verification final project at Ain Shams University, Spring 2026. The DUT mimics the register layout of production-grade SPI masters found in ARM MCUs, making the verification lessons directly transferable to industry practice. </w:t>
+      </w:r>
+    </w:p>
+    <w:p>
+      <w:pPr>
+        <w:ind w:firstLine="576"/>
+        <w:jc w:val="both"/>
+      </w:pPr>
+      <w:r>
+        <w:t>The objective of this project is to design and implement a comprehensive SystemVerilog verification environment capable of detecting functional bugs in the DUT against a defined specification.</w:t>
+      </w:r>
+    </w:p>
+    <w:p>
+      <w:pPr>
+        <w:pStyle w:val="Heading2"/>
+        <w:jc w:val="both"/>
+      </w:pPr>
+      <w:bookmarkStart w:id="2" w:name="_Toc230310648"/>
+      <w:r>
+        <w:t xml:space="preserve">Verification </w:t>
+      </w:r>
+      <w:r>
+        <w:t>m</w:t>
+      </w:r>
+      <w:r>
+        <w:t>ethodology</w:t>
+      </w:r>
+      <w:bookmarkEnd w:id="2"/>
+    </w:p>
+    <w:p>
+      <w:pPr>
+        <w:ind w:firstLine="576"/>
+        <w:jc w:val="both"/>
+      </w:pPr>
+      <w:r>
+        <w:t>The verification methodology adopted is SystemVerilog-only, utilizing constrained-random stimulus, functional coverage, a reference model-based scoreboard, and SystemVerilog Assertions (SVA). Critically, the verification environment must remain functional when the golden RTL is replaced by any of the 28 buggy variants without modification.</w:t>
+      </w:r>
+    </w:p>
+    <w:p>
+      <w:pPr>
+        <w:pStyle w:val="Heading2"/>
+        <w:jc w:val="both"/>
+      </w:pPr>
+      <w:bookmarkStart w:id="3" w:name="_Toc230310649"/>
+      <w:r>
+        <w:t xml:space="preserve">Report </w:t>
+      </w:r>
+      <w:proofErr w:type="spellStart"/>
+      <w:r>
+        <w:t>rganization</w:t>
+      </w:r>
+      <w:bookmarkEnd w:id="3"/>
+      <w:proofErr w:type="spellEnd"/>
+    </w:p>
+    <w:p>
+      <w:pPr>
         <w:ind w:firstLine="432"/>
         <w:jc w:val="both"/>
       </w:pPr>
       <w:r>
-        <w:t>The DUT is an SPI Master Controller IP implemented in SystemVerilog. It is structured as a three-file hierarchy: spi_master.sv serves as a thin top-level wrapper instantiating two sub-blocks</w:t>
-      </w:r>
-      <w:r>
-        <w:t xml:space="preserve">; </w:t>
-      </w:r>
-      <w:r>
-        <w:t xml:space="preserve">apb_regfile.sv, which implements the APB v2.0 slave interface, nine programmable registers, TX and RX FIFOs (8 entries, 32-bit wide each), and interrupt logic; and spi_core.sv, which implements the SPI shift FSM, SCLK generation, and MOSI drive logic. </w:t>
+        <w:t>The report is organized as follows: Section 2 describes the DUT architecture and key requirements, Section 3 details the verification environment components, Section 4 presents simulation results, Section 5 discusses bugs found, and Section 6 concludes with lessons learned.</w:t>
+      </w:r>
+      <w:r>
+        <w:br w:type="page"/>
       </w:r>
     </w:p>
     <w:p>
       <w:pPr>
+        <w:pStyle w:val="Heading1"/>
+      </w:pPr>
+      <w:bookmarkStart w:id="4" w:name="_Toc230310650"/>
+      <w:r>
+        <w:lastRenderedPageBreak/>
+        <w:t>Design Under Test</w:t>
+      </w:r>
+      <w:bookmarkEnd w:id="4"/>
+    </w:p>
+    <w:p>
+      <w:pPr>
+        <w:pStyle w:val="Heading2"/>
+      </w:pPr>
+      <w:bookmarkStart w:id="5" w:name="_Toc230310651"/>
+      <w:r>
+        <w:t>Architecture</w:t>
+      </w:r>
+      <w:bookmarkEnd w:id="5"/>
+    </w:p>
+    <w:p>
+      <w:pPr>
         <w:ind w:firstLine="432"/>
         <w:jc w:val="both"/>
       </w:pPr>
       <w:r>
-        <w:t xml:space="preserve">The DUT operates in a single PCLK domain, with SCLK derived as a divided and gated version of PCLK. Active-low </w:t>
-      </w:r>
-      <w:proofErr w:type="spellStart"/>
-      <w:r>
-        <w:t>PRESETn</w:t>
-      </w:r>
-      <w:proofErr w:type="spellEnd"/>
-      <w:r>
-        <w:t xml:space="preserve"> with synchronous </w:t>
-      </w:r>
-      <w:proofErr w:type="spellStart"/>
-      <w:r>
-        <w:t>deassertion</w:t>
-      </w:r>
-      <w:proofErr w:type="spellEnd"/>
-      <w:r>
-        <w:t xml:space="preserve"> is assumed, and all flops carry explicit reset values, eliminating X-optimism.</w:t>
+        <w:t>The DUT is an SPI Master Controller IP implemented in SystemVerilog. It is structured as a three-file hierarchy: spi_master.sv serves as a thin top-level wrapper instantiating two sub-blocks</w:t>
+      </w:r>
+      <w:r>
+        <w:t xml:space="preserve">; </w:t>
+      </w:r>
+      <w:r>
+        <w:t xml:space="preserve">apb_regfile.sv, which implements the APB v2.0 slave interface, nine programmable registers, </w:t>
+      </w:r>
+      <w:proofErr w:type="gramStart"/>
+      <w:r>
+        <w:t>TX</w:t>
+      </w:r>
+      <w:proofErr w:type="gramEnd"/>
+      <w:r>
+        <w:t xml:space="preserve"> and RX FIFOs (8 entries, 32-bit wide each), and interrupt logic; and spi_core.sv, which implements the SPI shift FSM, SCLK generation, and MOSI drive logic. </w:t>
       </w:r>
     </w:p>
     <w:p>
@@ -916,148 +1903,242 @@
         <w:jc w:val="both"/>
       </w:pPr>
       <w:r>
-        <w:t xml:space="preserve">The </w:t>
+        <w:t xml:space="preserve">The DUT operates in a single PCLK domain, with SCLK derived as a divided and gated version of PCLK. Active-low </w:t>
       </w:r>
       <w:proofErr w:type="spellStart"/>
       <w:r>
-        <w:t>spi_core</w:t>
+        <w:t>PRESETn</w:t>
       </w:r>
       <w:proofErr w:type="spellEnd"/>
       <w:r>
-        <w:t xml:space="preserve"> FSM operates across four states: S_IDLE, S_SHIFT, S_FINISH, and S_GAP. The S_GAP state activates only when DELAY ≠ 0 and another TX word is waiting, inserting idle cycles equal to (2 + DELAY) × (DIV+1) PCLK cycles between consecutive transfers. For CPHA=0, the first bit is presented on MOSI before the first SCLK edge; for CPHA=1, the first bit is launched on the first SCLK edge. Configuration registers </w:t>
+        <w:t xml:space="preserve"> with synchronous </w:t>
       </w:r>
       <w:proofErr w:type="spellStart"/>
       <w:r>
-        <w:t>cfg_mode</w:t>
+        <w:t>deassertion</w:t>
       </w:r>
       <w:proofErr w:type="spellEnd"/>
       <w:r>
-        <w:t xml:space="preserve">, </w:t>
-      </w:r>
-      <w:proofErr w:type="spellStart"/>
-      <w:r>
-        <w:t>cfg_lsb_first</w:t>
-      </w:r>
-      <w:proofErr w:type="spellEnd"/>
-      <w:r>
-        <w:t xml:space="preserve">, </w:t>
-      </w:r>
-      <w:proofErr w:type="spellStart"/>
-      <w:r>
-        <w:t>cfg_width</w:t>
-      </w:r>
-      <w:proofErr w:type="spellEnd"/>
-      <w:r>
-        <w:t xml:space="preserve">, and </w:t>
-      </w:r>
-      <w:proofErr w:type="spellStart"/>
-      <w:r>
-        <w:t>cfg_clk_div</w:t>
-      </w:r>
-      <w:proofErr w:type="spellEnd"/>
-      <w:r>
-        <w:t xml:space="preserve"> are latched into transfer-local xfer_* registers at the S_IDLE to S_SHIFT transition per R25, meaning mid-transfer register writes take effect only on the next transfer.</w:t>
+        <w:t xml:space="preserve"> is assumed, and all flops carry explicit reset values, eliminating X-optimism.</w:t>
       </w:r>
     </w:p>
     <w:p>
       <w:pPr>
+        <w:pStyle w:val="Heading2"/>
+      </w:pPr>
+      <w:bookmarkStart w:id="6" w:name="_Toc230310652"/>
+      <w:r>
+        <w:t xml:space="preserve">FSM and </w:t>
+      </w:r>
+      <w:r>
+        <w:t>t</w:t>
+      </w:r>
+      <w:r>
+        <w:t xml:space="preserve">ransfer </w:t>
+      </w:r>
+      <w:r>
+        <w:t>b</w:t>
+      </w:r>
+      <w:r>
+        <w:t>ehavior</w:t>
+      </w:r>
+      <w:bookmarkEnd w:id="6"/>
+    </w:p>
+    <w:p>
+      <w:pPr>
         <w:ind w:firstLine="432"/>
         <w:jc w:val="both"/>
       </w:pPr>
+      <w:r>
+        <w:t xml:space="preserve">The </w:t>
+      </w:r>
       <w:proofErr w:type="spellStart"/>
       <w:r>
-        <w:t>SS_n</w:t>
+        <w:t>spi_core</w:t>
       </w:r>
       <w:proofErr w:type="spellEnd"/>
       <w:r>
-        <w:t xml:space="preserve"> is driven </w:t>
+        <w:t xml:space="preserve"> FSM operates across four states: S_IDLE, S_SHIFT, S_FINISH, and S_GAP. The S_GAP state activates only when DELAY ≠ 0 and another TX word is waiting, inserting idle cycles equal to (2 + DELAY) × (DIV+1) PCLK cycles between consecutive transfers. For CPHA=0, the first bit is presented on MOSI before the first SCLK edge; for CPHA=1, the first bit is launched on the first SCLK edge. Configuration registers </w:t>
       </w:r>
       <w:proofErr w:type="spellStart"/>
       <w:r>
-        <w:t>combinationally</w:t>
+        <w:t>cfg_mode</w:t>
       </w:r>
       <w:proofErr w:type="spellEnd"/>
       <w:r>
-        <w:t xml:space="preserve"> by </w:t>
+        <w:t xml:space="preserve">, </w:t>
       </w:r>
       <w:proofErr w:type="spellStart"/>
       <w:r>
-        <w:t>apb_regfile</w:t>
+        <w:t>cfg_lsb_first</w:t>
       </w:r>
       <w:proofErr w:type="spellEnd"/>
       <w:r>
-        <w:t xml:space="preserve"> using the formula ~</w:t>
+        <w:t xml:space="preserve">, </w:t>
       </w:r>
       <w:proofErr w:type="spellStart"/>
       <w:r>
-        <w:t>ss_en</w:t>
+        <w:t>cfg_width</w:t>
       </w:r>
       <w:proofErr w:type="spellEnd"/>
       <w:r>
-        <w:t xml:space="preserve"> | </w:t>
+        <w:t xml:space="preserve">, and </w:t>
       </w:r>
       <w:proofErr w:type="spellStart"/>
       <w:r>
-        <w:t>ss_val</w:t>
+        <w:t>cfg_clk_div</w:t>
       </w:r>
       <w:proofErr w:type="spellEnd"/>
       <w:r>
-        <w:t xml:space="preserve">. The core observes </w:t>
-      </w:r>
-      <w:proofErr w:type="spellStart"/>
-      <w:r>
-        <w:t>SS_n</w:t>
-      </w:r>
-      <w:proofErr w:type="spellEnd"/>
-      <w:r>
-        <w:t xml:space="preserve"> through </w:t>
-      </w:r>
-      <w:proofErr w:type="spellStart"/>
-      <w:r>
-        <w:t>ss_n_drive</w:t>
-      </w:r>
-      <w:proofErr w:type="spellEnd"/>
-      <w:r>
-        <w:t xml:space="preserve"> and starts a transfer only when at least one SS lane is driven </w:t>
-      </w:r>
-      <w:r>
-        <w:t>low,</w:t>
-      </w:r>
-      <w:r>
-        <w:t xml:space="preserve"> and the TX FIFO is non-empty. Both the TX and RX FIFO pointers are reset not only on </w:t>
-      </w:r>
-      <w:proofErr w:type="spellStart"/>
-      <w:r>
-        <w:t>PRESETn</w:t>
-      </w:r>
-      <w:proofErr w:type="spellEnd"/>
-      <w:r>
-        <w:t xml:space="preserve"> </w:t>
-      </w:r>
-      <w:proofErr w:type="spellStart"/>
-      <w:r>
-        <w:t>deassertion</w:t>
-      </w:r>
-      <w:proofErr w:type="spellEnd"/>
-      <w:r>
-        <w:t xml:space="preserve"> but also whenever CTRL.EN is </w:t>
-      </w:r>
-      <w:proofErr w:type="spellStart"/>
-      <w:r>
-        <w:t>deasserted</w:t>
-      </w:r>
-      <w:proofErr w:type="spellEnd"/>
-      <w:r>
-        <w:t>, ensuring a clean state on every enable cycle.</w:t>
+        <w:t xml:space="preserve"> are latched into transfer-local xfer_* registers at the S_IDLE to S_SHIFT transition per R25, meaning mid-transfer register writes take effect only on the next transfer.</w:t>
       </w:r>
     </w:p>
     <w:p>
       <w:pPr>
+        <w:pStyle w:val="Heading2"/>
+      </w:pPr>
+      <w:bookmarkStart w:id="7" w:name="_Toc230310653"/>
+      <w:proofErr w:type="gramStart"/>
+      <w:r>
+        <w:t>Slave</w:t>
+      </w:r>
+      <w:proofErr w:type="gramEnd"/>
+      <w:r>
+        <w:t xml:space="preserve"> </w:t>
+      </w:r>
+      <w:r>
+        <w:t>s</w:t>
+      </w:r>
+      <w:r>
+        <w:t xml:space="preserve">elect and FIFO </w:t>
+      </w:r>
+      <w:r>
+        <w:t>c</w:t>
+      </w:r>
+      <w:r>
+        <w:t>ontrol</w:t>
+      </w:r>
+      <w:bookmarkEnd w:id="7"/>
+    </w:p>
+    <w:p>
+      <w:pPr>
         <w:ind w:firstLine="432"/>
         <w:jc w:val="both"/>
       </w:pPr>
-      <w:r>
-        <w:t>The five interrupt sources are TX_EMPTY (bit 0), RX_FULL (bit 1), TX_OVF (bit 2), RX_OVF (bit 3), and TRANSFER_DONE (bit 4). The IRQ output is the bitwise AND of INT_STAT and INT_EN. The STATUS register is read-only, TX_DATA is write-only with reads returning zero, and INT_STAT implements W1C semantics per R18.</w:t>
+      <w:proofErr w:type="spellStart"/>
+      <w:r>
+        <w:t>SS_n</w:t>
+      </w:r>
+      <w:proofErr w:type="spellEnd"/>
+      <w:r>
+        <w:t xml:space="preserve"> is driven </w:t>
+      </w:r>
+      <w:proofErr w:type="spellStart"/>
+      <w:r>
+        <w:t>combinationally</w:t>
+      </w:r>
+      <w:proofErr w:type="spellEnd"/>
+      <w:r>
+        <w:t xml:space="preserve"> by </w:t>
+      </w:r>
+      <w:proofErr w:type="spellStart"/>
+      <w:r>
+        <w:t>apb_regfile</w:t>
+      </w:r>
+      <w:proofErr w:type="spellEnd"/>
+      <w:r>
+        <w:t xml:space="preserve"> using the formula ~</w:t>
+      </w:r>
+      <w:proofErr w:type="spellStart"/>
+      <w:r>
+        <w:t>ss_en</w:t>
+      </w:r>
+      <w:proofErr w:type="spellEnd"/>
+      <w:r>
+        <w:t xml:space="preserve"> | </w:t>
+      </w:r>
+      <w:proofErr w:type="spellStart"/>
+      <w:r>
+        <w:t>ss_val</w:t>
+      </w:r>
+      <w:proofErr w:type="spellEnd"/>
+      <w:r>
+        <w:t xml:space="preserve">. The core observes </w:t>
+      </w:r>
+      <w:proofErr w:type="spellStart"/>
+      <w:r>
+        <w:t>SS_n</w:t>
+      </w:r>
+      <w:proofErr w:type="spellEnd"/>
+      <w:r>
+        <w:t xml:space="preserve"> through </w:t>
+      </w:r>
+      <w:proofErr w:type="spellStart"/>
+      <w:r>
+        <w:t>ss_n_drive</w:t>
+      </w:r>
+      <w:proofErr w:type="spellEnd"/>
+      <w:r>
+        <w:t xml:space="preserve"> and starts a transfer only when at least one SS lane is driven </w:t>
+      </w:r>
+      <w:r>
+        <w:t>low,</w:t>
+      </w:r>
+      <w:r>
+        <w:t xml:space="preserve"> and the TX FIFO is non-empty. Both the TX and RX FIFO pointers are reset not only on </w:t>
+      </w:r>
+      <w:proofErr w:type="spellStart"/>
+      <w:r>
+        <w:t>PRESETn</w:t>
+      </w:r>
+      <w:proofErr w:type="spellEnd"/>
+      <w:r>
+        <w:t xml:space="preserve"> </w:t>
+      </w:r>
+      <w:proofErr w:type="spellStart"/>
+      <w:r>
+        <w:t>deassertion</w:t>
+      </w:r>
+      <w:proofErr w:type="spellEnd"/>
+      <w:r>
+        <w:t xml:space="preserve"> but also whenever CTRL.EN is </w:t>
+      </w:r>
+      <w:proofErr w:type="spellStart"/>
+      <w:r>
+        <w:t>deasserted</w:t>
+      </w:r>
+      <w:proofErr w:type="spellEnd"/>
+      <w:r>
+        <w:t>, ensuring a clean state on every enable cycle.</w:t>
+      </w:r>
+    </w:p>
+    <w:p>
+      <w:pPr>
+        <w:pStyle w:val="Heading2"/>
+      </w:pPr>
+      <w:bookmarkStart w:id="8" w:name="_Toc230310654"/>
+      <w:r>
+        <w:t xml:space="preserve">Interrupt </w:t>
+      </w:r>
+      <w:r>
+        <w:t>l</w:t>
+      </w:r>
+      <w:r>
+        <w:t>ogic</w:t>
+      </w:r>
+      <w:bookmarkEnd w:id="8"/>
+    </w:p>
+    <w:p>
+      <w:pPr>
+        <w:ind w:firstLine="432"/>
+        <w:jc w:val="both"/>
+      </w:pPr>
+      <w:r>
+        <w:t xml:space="preserve">The five interrupt sources are TX_EMPTY (bit 0), RX_FULL (bit 1), TX_OVF (bit 2), RX_OVF (bit 3), and TRANSFER_DONE (bit 4). The IRQ output is the bitwise AND of </w:t>
+      </w:r>
+      <w:r>
+        <w:lastRenderedPageBreak/>
+        <w:t>INT_STAT and INT_EN. The STATUS register is read-only, TX_DATA is write-only with reads returning zero, and INT_STAT implements W1C semantics per R18.</w:t>
       </w:r>
     </w:p>
     <w:p/>
@@ -1070,15 +2151,31 @@
       <w:pPr>
         <w:pStyle w:val="Heading1"/>
       </w:pPr>
-      <w:bookmarkStart w:id="2" w:name="_Toc230306880"/>
+      <w:bookmarkStart w:id="9" w:name="_Toc230310655"/>
       <w:r>
         <w:lastRenderedPageBreak/>
         <w:t>Verification Environment</w:t>
       </w:r>
-      <w:bookmarkEnd w:id="2"/>
+      <w:bookmarkEnd w:id="9"/>
     </w:p>
     <w:p>
       <w:pPr>
+        <w:pStyle w:val="Heading2"/>
+      </w:pPr>
+      <w:bookmarkStart w:id="10" w:name="_Toc230310656"/>
+      <w:r>
+        <w:t xml:space="preserve">Testbench </w:t>
+      </w:r>
+      <w:r>
+        <w:t>a</w:t>
+      </w:r>
+      <w:r>
+        <w:t>rchitecture</w:t>
+      </w:r>
+      <w:bookmarkEnd w:id="10"/>
+    </w:p>
+    <w:p>
+      <w:pPr>
         <w:ind w:firstLine="432"/>
         <w:jc w:val="both"/>
       </w:pPr>
@@ -1120,6 +2217,22 @@
     </w:p>
     <w:p>
       <w:pPr>
+        <w:pStyle w:val="Heading2"/>
+      </w:pPr>
+      <w:bookmarkStart w:id="11" w:name="_Toc230310657"/>
+      <w:r>
+        <w:t xml:space="preserve">Environment </w:t>
+      </w:r>
+      <w:r>
+        <w:t>c</w:t>
+      </w:r>
+      <w:r>
+        <w:t>omponents</w:t>
+      </w:r>
+      <w:bookmarkEnd w:id="11"/>
+    </w:p>
+    <w:p>
+      <w:pPr>
         <w:ind w:firstLine="432"/>
         <w:jc w:val="both"/>
       </w:pPr>
@@ -1152,11 +2265,19 @@
       </w:r>
       <w:proofErr w:type="spellStart"/>
       <w:r>
-        <w:t>predict_transfer</w:t>
+        <w:t>predict_</w:t>
+      </w:r>
+      <w:proofErr w:type="gramStart"/>
+      <w:r>
+        <w:t>transfer</w:t>
       </w:r>
       <w:proofErr w:type="spellEnd"/>
       <w:r>
-        <w:t xml:space="preserve">() must be called before every TX push, and </w:t>
+        <w:t>(</w:t>
+      </w:r>
+      <w:proofErr w:type="gramEnd"/>
+      <w:r>
+        <w:t xml:space="preserve">) must be called before every TX push, and </w:t>
       </w:r>
       <w:proofErr w:type="spellStart"/>
       <w:r>
@@ -1166,6 +2287,22 @@
       <w:r>
         <w:t>() must be called after every RX read, maintaining queue balance at all times.</w:t>
       </w:r>
+    </w:p>
+    <w:p>
+      <w:pPr>
+        <w:pStyle w:val="Heading2"/>
+      </w:pPr>
+      <w:bookmarkStart w:id="12" w:name="_Toc230310658"/>
+      <w:r>
+        <w:t xml:space="preserve">Coverage </w:t>
+      </w:r>
+      <w:r>
+        <w:t>m</w:t>
+      </w:r>
+      <w:r>
+        <w:t>odel</w:t>
+      </w:r>
+      <w:bookmarkEnd w:id="12"/>
     </w:p>
     <w:p>
       <w:pPr>
@@ -1261,7 +2398,11 @@
       </w:r>
       <w:proofErr w:type="spellEnd"/>
       <w:r>
-        <w:t xml:space="preserve"> specifically targets the non-trivial case where EN=0 must override an active SS_CTRL configuration, closing the </w:t>
+        <w:t xml:space="preserve"> specifically </w:t>
+      </w:r>
+      <w:r>
+        <w:lastRenderedPageBreak/>
+        <w:t xml:space="preserve">targets the non-trivial case where EN=0 must override an active SS_CTRL configuration, closing the </w:t>
       </w:r>
       <w:proofErr w:type="spellStart"/>
       <w:r>
@@ -1296,7 +2437,6 @@
         <w:jc w:val="both"/>
       </w:pPr>
       <w:r>
-        <w:lastRenderedPageBreak/>
         <w:t xml:space="preserve">In summary: </w:t>
       </w:r>
       <w:r>
@@ -1307,7 +2447,15 @@
       </w:r>
       <w:proofErr w:type="spellStart"/>
       <w:r>
-        <w:t>u_wrap.u_dut.u_regfile</w:t>
+        <w:t>u_</w:t>
+      </w:r>
+      <w:proofErr w:type="gramStart"/>
+      <w:r>
+        <w:t>wrap.u</w:t>
+      </w:r>
+      <w:proofErr w:type="gramEnd"/>
+      <w:r>
+        <w:t>_dut.u_regfile</w:t>
       </w:r>
       <w:proofErr w:type="spellEnd"/>
       <w:r>
@@ -1334,843 +2482,258 @@
       <w:pPr>
         <w:pStyle w:val="Heading2"/>
       </w:pPr>
-      <w:r>
-        <w:t>Regression Infrastructure</w:t>
-      </w:r>
+      <w:bookmarkStart w:id="13" w:name="_Toc230310659"/>
+      <w:r>
+        <w:t xml:space="preserve">Regression </w:t>
+      </w:r>
+      <w:r>
+        <w:t>i</w:t>
+      </w:r>
+      <w:r>
+        <w:t>nfrastructure</w:t>
+      </w:r>
+      <w:bookmarkEnd w:id="13"/>
     </w:p>
     <w:p>
       <w:pPr>
-        <w:pStyle w:val="Heading3"/>
-      </w:pPr>
-      <w:r>
-        <w:t>What Does This Script Do?</w:t>
+        <w:ind w:firstLine="576"/>
+        <w:jc w:val="both"/>
+      </w:pPr>
+      <w:r>
+        <w:t xml:space="preserve">The verification flow is driven by a single </w:t>
+      </w:r>
+      <w:proofErr w:type="spellStart"/>
+      <w:r>
+        <w:t>Makefile</w:t>
+      </w:r>
+      <w:proofErr w:type="spellEnd"/>
+      <w:r>
+        <w:t xml:space="preserve"> targeting </w:t>
+      </w:r>
+      <w:proofErr w:type="spellStart"/>
+      <w:r>
+        <w:t>QuestaSim</w:t>
+      </w:r>
+      <w:proofErr w:type="spellEnd"/>
+      <w:r>
+        <w:t xml:space="preserve">. It supports four top-level knobs overridable from the command line: SIMULATOR, SEED, TEST, and WAVES, all defined with </w:t>
+      </w:r>
+      <w:r>
+        <w:t>“</w:t>
+      </w:r>
+      <w:r>
+        <w:t>=</w:t>
+      </w:r>
+      <w:r>
+        <w:t>”</w:t>
+      </w:r>
+      <w:r>
+        <w:t xml:space="preserve"> so any command-line value takes precedence over the default.</w:t>
       </w:r>
     </w:p>
     <w:p>
       <w:pPr>
-        <w:ind w:firstLine="720"/>
-      </w:pPr>
-      <w:r>
-        <w:t>run_parallel.py is a regression runner for SystemVerilog hardware simulations. It runs many test/seed combinations at the same time using multiple threads, collects pass/fail results, prints a summary table, and optionally merges Questa coverage databases</w:t>
-      </w:r>
-      <w:r>
-        <w:t xml:space="preserve">, </w:t>
-      </w:r>
-      <w:r>
-        <w:t>all driven from a single command-line call.</w:t>
+        <w:ind w:firstLine="576"/>
+        <w:jc w:val="both"/>
+      </w:pPr>
+      <w:r>
+        <w:t xml:space="preserve">Source files are organized into four groups: TB_SRCS containing the APB Master BFM, SPI Slave BFM, and </w:t>
+      </w:r>
+      <w:proofErr w:type="spellStart"/>
+      <w:r>
+        <w:t>tb_top</w:t>
+      </w:r>
+      <w:proofErr w:type="spellEnd"/>
+      <w:r>
+        <w:t>; ENV_SRCS containing the reference model and coverage collector; SEQ_SRCS containing the stimulus library; and ASSERT_SRCS containing the SVA assertions. The DUT source list defaults to the three golden RTL files and is overridden by the grader via DUT_SRCS to point at buggy variants. A compatibility shim EFF_DUT_SRCS selects DUT_SRC if set, otherwise falling back to DUT_SRCS.</w:t>
       </w:r>
     </w:p>
     <w:p>
       <w:pPr>
-        <w:pStyle w:val="Heading3"/>
-      </w:pPr>
-      <w:r>
-        <w:t>Block-by-Block Explanation</w:t>
+        <w:ind w:firstLine="576"/>
+        <w:jc w:val="both"/>
+      </w:pPr>
+      <w:r>
+        <w:t>The compile target creates a fresh Questa work library and compiles all sources in dependency order: interfaces, DUT, wrapper, environment, sequences, assertions, then testbench</w:t>
+      </w:r>
+      <w:r>
+        <w:t xml:space="preserve">, </w:t>
+      </w:r>
+      <w:r>
+        <w:t xml:space="preserve">all in a single vlog invocation with coverage instrumentation enabled. The run target depends on compile and launches </w:t>
+      </w:r>
+      <w:proofErr w:type="spellStart"/>
+      <w:r>
+        <w:t>vsim</w:t>
+      </w:r>
+      <w:proofErr w:type="spellEnd"/>
+      <w:r>
+        <w:t xml:space="preserve"> in batch mode, passing +TESTNAME and +SEED as </w:t>
+      </w:r>
+      <w:proofErr w:type="spellStart"/>
+      <w:r>
+        <w:t>plusargs</w:t>
+      </w:r>
+      <w:proofErr w:type="spellEnd"/>
+      <w:r>
+        <w:t>, saving a per-test coverage database on exit.</w:t>
       </w:r>
     </w:p>
     <w:p>
       <w:pPr>
-        <w:pStyle w:val="Heading4"/>
-      </w:pPr>
-      <w:r>
-        <w:t>Imports &amp; Constants</w:t>
-      </w:r>
-      <w:r>
-        <w:t>:</w:t>
-      </w:r>
-      <w:r>
-        <w:t xml:space="preserve"> </w:t>
+        <w:ind w:firstLine="576"/>
+        <w:jc w:val="both"/>
+      </w:pPr>
+      <w:r>
+        <w:t xml:space="preserve">The regression is defined as 11 tests × 5 seeds = 55 total simulation runs, each redirected to a per-test per-seed log file under build/. After all runs complete, the regress target merges </w:t>
+      </w:r>
+      <w:proofErr w:type="gramStart"/>
+      <w:r>
+        <w:t>all .</w:t>
+      </w:r>
+      <w:proofErr w:type="spellStart"/>
+      <w:r>
+        <w:t>ucdb</w:t>
+      </w:r>
+      <w:proofErr w:type="spellEnd"/>
+      <w:proofErr w:type="gramEnd"/>
+      <w:r>
+        <w:t xml:space="preserve"> coverage databases into a single build/</w:t>
+      </w:r>
+      <w:proofErr w:type="spellStart"/>
+      <w:r>
+        <w:t>merged.ucdb</w:t>
+      </w:r>
+      <w:proofErr w:type="spellEnd"/>
+      <w:r>
+        <w:t xml:space="preserve"> via </w:t>
+      </w:r>
+      <w:proofErr w:type="spellStart"/>
+      <w:r>
+        <w:t>vcover</w:t>
+      </w:r>
+      <w:proofErr w:type="spellEnd"/>
+      <w:r>
+        <w:t xml:space="preserve"> merge. The </w:t>
+      </w:r>
+      <w:proofErr w:type="spellStart"/>
+      <w:r>
+        <w:t>cov</w:t>
+      </w:r>
+      <w:proofErr w:type="spellEnd"/>
+      <w:r>
+        <w:t xml:space="preserve"> target then generates coverage_report.txt from the merged database, failing with a clear error message if the merged database does not exist, ensuring clean CI behavior.</w:t>
       </w:r>
     </w:p>
     <w:p>
-      <w:r>
-        <w:t>Loads Python's standard libraries (argument parsing, file system, subprocesses, threading, timing) and defines fixed values used throughout: default seeds (just seed 1), up to 10 parallel workers, the build folder, and the full list of 11 test names.</w:t>
-      </w:r>
+      <w:pPr>
+        <w:pStyle w:val="Heading2"/>
+      </w:pPr>
+      <w:bookmarkStart w:id="14" w:name="_Toc230310660"/>
+      <w:r>
+        <w:lastRenderedPageBreak/>
+        <w:t>Parallel regression runner</w:t>
+      </w:r>
+      <w:bookmarkEnd w:id="14"/>
     </w:p>
     <w:p>
-      <w:r>
-        <w:t>DEFAULT_SEEDS = list(range(1, 2))   MAX_WORKERS = 10   BUILD_DIR = Path("build")</w:t>
+      <w:pPr>
+        <w:ind w:firstLine="576"/>
+      </w:pPr>
+      <w:r>
+        <w:t>To accelerate regression turnaround, a Python script `run_parallel.py` was developed to execute multiple test/seed combinations concurrently using a thread pool of up to 10 parallel workers. The script is driven entirely from the command line, accepting five flags: `--tests`, `--seeds`, `--workers`, `--compile`, and `--</w:t>
+      </w:r>
+      <w:proofErr w:type="spellStart"/>
+      <w:r>
+        <w:t>makefile-dir</w:t>
+      </w:r>
+      <w:proofErr w:type="spellEnd"/>
+      <w:r>
+        <w:t>`, making it flexible for both full regression runs and targeted single-test debugging.</w:t>
       </w:r>
     </w:p>
     <w:p>
       <w:pPr>
-        <w:pStyle w:val="Heading4"/>
-      </w:pPr>
-      <w:r>
-        <w:t>Data Classes</w:t>
-      </w:r>
-      <w:r>
-        <w:t>:</w:t>
-      </w:r>
-      <w:r>
-        <w:t xml:space="preserve"> </w:t>
+        <w:ind w:firstLine="576"/>
+      </w:pPr>
+      <w:r>
+        <w:t>The script begins by optionally invoking `make compile` once before any tests start, streaming compiler output to the terminal in real time. It then constructs the full set of (test × seed) job combinations and submits them to a `</w:t>
+      </w:r>
+      <w:proofErr w:type="spellStart"/>
+      <w:r>
+        <w:t>ThreadPoolExecutor</w:t>
+      </w:r>
+      <w:proofErr w:type="spellEnd"/>
+      <w:r>
+        <w:t xml:space="preserve">`. Each worker calls `make run TEST=… SEED=… WAVES=0`, captures </w:t>
+      </w:r>
+      <w:proofErr w:type="spellStart"/>
+      <w:r>
+        <w:t>stdout</w:t>
+      </w:r>
+      <w:proofErr w:type="spellEnd"/>
+      <w:r>
+        <w:t xml:space="preserve"> and stderr, saves them to a per-test per-seed log file under `build/`, and classifies the result as pass or fail by scanning for known Questa and UVM keywords. Failure markers are checked first — `TEST_FAILED`, `** Error`, `ASSERTION_FAILED` — before checking for pass markers, with the make exit code used as a fallback if neither pattern is found.</w:t>
       </w:r>
     </w:p>
     <w:p>
-      <w:r>
-        <w:t>Two lightweight data containers. Job holds a test name + seed and auto-computes the log file path. Result stores the outcome: passed or not, elapsed time in seconds, and any error message from a crashed subprocess.</w:t>
+      <w:pPr>
+        <w:ind w:firstLine="576"/>
+      </w:pPr>
+      <w:r>
+        <w:t>Upon completion, the script prints an aligned summary table showing pass/fail status, elapsed time, and log path for every run. Failed runs are accompanied by up to five extracted error lines from the log, eliminating the need to open individual log files for triage. The script also reports wall-clock duration against the sequential equivalent, producing a speedup factor that quantifies the benefit of parallelism.</w:t>
       </w:r>
     </w:p>
     <w:p>
-      <w:r>
-        <w:t>@dataclass Job(test, seed)  →  log = build/log_&lt;test&gt;_&lt;seed&gt;.log</w:t>
-      </w:r>
-    </w:p>
-    <w:p>
-      <w:pPr>
-        <w:pStyle w:val="Heading4"/>
-      </w:pPr>
+      <w:pPr>
+        <w:ind w:firstLine="432"/>
+      </w:pPr>
+      <w:r>
+        <w:t xml:space="preserve">Finally, all Questa </w:t>
+      </w:r>
+      <w:proofErr w:type="gramStart"/>
+      <w:r>
+        <w:t>`.</w:t>
+      </w:r>
       <w:proofErr w:type="spellStart"/>
       <w:r>
-        <w:t>compile_project</w:t>
+        <w:t>ucdb</w:t>
       </w:r>
       <w:proofErr w:type="spellEnd"/>
-      <w:r>
-        <w:t>()</w:t>
-      </w:r>
-      <w:r>
-        <w:t>:</w:t>
-      </w:r>
-      <w:r>
-        <w:t xml:space="preserve"> </w:t>
-      </w:r>
-    </w:p>
-    <w:p>
-      <w:r>
-        <w:t>Runs 'make compile' once before any tests start. Streams the compiler output to the terminal so you can watch for errors in real time. Returns True on success or False on failure so main() can abort early.</w:t>
-      </w:r>
-    </w:p>
-    <w:p>
+      <w:proofErr w:type="gramEnd"/>
+      <w:r>
+        <w:t>` coverage databases produced during the regression are merged into `build/</w:t>
+      </w:r>
       <w:proofErr w:type="spellStart"/>
       <w:r>
-        <w:t>subprocess.run</w:t>
+        <w:t>merged.ucdb</w:t>
       </w:r>
       <w:proofErr w:type="spellEnd"/>
       <w:r>
-        <w:t xml:space="preserve">(["make", "compile"], </w:t>
+        <w:t>` via `</w:t>
       </w:r>
       <w:proofErr w:type="spellStart"/>
       <w:r>
-        <w:t>cwd</w:t>
+        <w:t>vcover</w:t>
       </w:r>
       <w:proofErr w:type="spellEnd"/>
       <w:r>
-        <w:t>=</w:t>
+        <w:t xml:space="preserve"> merge`, followed by a `</w:t>
       </w:r>
       <w:proofErr w:type="spellStart"/>
       <w:r>
-        <w:t>makefile_dir</w:t>
+        <w:t>vcover</w:t>
       </w:r>
       <w:proofErr w:type="spellEnd"/>
       <w:r>
-        <w:t>)</w:t>
-      </w:r>
-    </w:p>
-    <w:p>
-      <w:pPr>
-        <w:pStyle w:val="Heading4"/>
-      </w:pPr>
-      <w:proofErr w:type="spellStart"/>
-      <w:r>
-        <w:lastRenderedPageBreak/>
-        <w:t>run_job</w:t>
-      </w:r>
-      <w:proofErr w:type="spellEnd"/>
-      <w:r>
-        <w:t>()</w:t>
-      </w:r>
-      <w:r>
-        <w:t>:</w:t>
-      </w:r>
-      <w:r>
-        <w:t xml:space="preserve"> </w:t>
-      </w:r>
-    </w:p>
-    <w:p>
-      <w:pPr>
-        <w:ind w:firstLine="720"/>
-        <w:jc w:val="both"/>
-      </w:pPr>
-      <w:r>
-        <w:t xml:space="preserve">Runs a single simulation: calls 'make run TEST=… SEED=… WAVES=0', captures </w:t>
-      </w:r>
-      <w:proofErr w:type="spellStart"/>
-      <w:r>
-        <w:t>stdout+stderr</w:t>
-      </w:r>
-      <w:proofErr w:type="spellEnd"/>
-      <w:r>
-        <w:t>, saves them to the job's log file, then calls _</w:t>
-      </w:r>
-      <w:proofErr w:type="spellStart"/>
-      <w:r>
-        <w:t>detect_pass</w:t>
-      </w:r>
-      <w:proofErr w:type="spellEnd"/>
-      <w:r>
-        <w:t>() to decide pass or fail. Wrapped in try/except so a crashed subprocess still produces a Result.</w:t>
-      </w:r>
-    </w:p>
-    <w:p>
-      <w:pPr>
-        <w:pStyle w:val="Monospace"/>
-        <w:jc w:val="both"/>
-      </w:pPr>
-      <w:proofErr w:type="spellStart"/>
-      <w:r>
-        <w:t>cmd</w:t>
-      </w:r>
-      <w:proofErr w:type="spellEnd"/>
-      <w:r>
-        <w:t xml:space="preserve"> = ["make", "-s", "run", </w:t>
-      </w:r>
-      <w:proofErr w:type="spellStart"/>
-      <w:r>
-        <w:t>f"TEST</w:t>
-      </w:r>
-      <w:proofErr w:type="spellEnd"/>
-      <w:r>
-        <w:t>={</w:t>
-      </w:r>
-      <w:proofErr w:type="spellStart"/>
-      <w:r>
-        <w:t>job.test</w:t>
-      </w:r>
-      <w:proofErr w:type="spellEnd"/>
-      <w:r>
-        <w:t xml:space="preserve">}", </w:t>
-      </w:r>
-      <w:proofErr w:type="spellStart"/>
-      <w:r>
-        <w:t>f"SEED</w:t>
-      </w:r>
-      <w:proofErr w:type="spellEnd"/>
-      <w:r>
-        <w:t>={</w:t>
-      </w:r>
-      <w:proofErr w:type="spellStart"/>
-      <w:r>
-        <w:t>job.seed</w:t>
-      </w:r>
-      <w:proofErr w:type="spellEnd"/>
-      <w:r>
-        <w:t>}", "WAVES=0"]</w:t>
-      </w:r>
-    </w:p>
-    <w:p>
-      <w:pPr>
-        <w:pStyle w:val="Heading4"/>
-        <w:jc w:val="both"/>
-      </w:pPr>
-      <w:r>
-        <w:t>_</w:t>
-      </w:r>
-      <w:proofErr w:type="spellStart"/>
-      <w:r>
-        <w:t>detect_pass</w:t>
-      </w:r>
-      <w:proofErr w:type="spellEnd"/>
-      <w:r>
-        <w:t>()</w:t>
-      </w:r>
-      <w:r>
-        <w:t>:</w:t>
-      </w:r>
-      <w:r>
-        <w:t xml:space="preserve"> </w:t>
-      </w:r>
-    </w:p>
-    <w:p>
-      <w:pPr>
-        <w:ind w:firstLine="720"/>
-        <w:jc w:val="both"/>
-      </w:pPr>
-      <w:r>
-        <w:t>Scans log text for Questa/UVM keywords. Failure markers are checked first (TEST FAILED, ** ERROR, ASSERTION FAILED). If none found, checks for pass markers (TEST PASSED, SIMULATION PASSED). Falls back to the make exit code if neither pattern appears.</w:t>
-      </w:r>
-    </w:p>
-    <w:p>
-      <w:pPr>
-        <w:pStyle w:val="Monospace"/>
-        <w:jc w:val="both"/>
-      </w:pPr>
-      <w:r>
-        <w:t>if "TEST FAILED" in upper: return False   if "TEST PASSED" in upper: return True</w:t>
-      </w:r>
-    </w:p>
-    <w:p>
-      <w:pPr>
-        <w:pStyle w:val="Heading4"/>
-        <w:jc w:val="both"/>
-      </w:pPr>
-      <w:r>
-        <w:t>_</w:t>
-      </w:r>
-      <w:proofErr w:type="spellStart"/>
-      <w:r>
-        <w:t>extract_errors</w:t>
-      </w:r>
-      <w:proofErr w:type="spellEnd"/>
-      <w:r>
-        <w:t>()</w:t>
-      </w:r>
-      <w:r>
-        <w:t>:</w:t>
-      </w:r>
-      <w:r>
-        <w:t xml:space="preserve"> </w:t>
-      </w:r>
-    </w:p>
-    <w:p>
-      <w:pPr>
-        <w:ind w:firstLine="720"/>
-        <w:jc w:val="both"/>
-      </w:pPr>
-      <w:r>
-        <w:t xml:space="preserve">Opens a failed job's log and returns up to 5 distinct lines that contain error-related keywords (** error, </w:t>
-      </w:r>
-      <w:proofErr w:type="spellStart"/>
-      <w:r>
-        <w:t>uvm_fatal</w:t>
-      </w:r>
-      <w:proofErr w:type="spellEnd"/>
-      <w:r>
-        <w:t>, assertion failed, traceback, etc.). These lines are shown in the summary so you don't need to open the full log to understand why a test failed.</w:t>
-      </w:r>
-    </w:p>
-    <w:p>
-      <w:pPr>
-        <w:pStyle w:val="Monospace"/>
-        <w:jc w:val="both"/>
-      </w:pPr>
-      <w:r>
-        <w:t>keywords = ["** error", "</w:t>
-      </w:r>
-      <w:proofErr w:type="spellStart"/>
-      <w:r>
-        <w:t>uvm_fatal</w:t>
-      </w:r>
-      <w:proofErr w:type="spellEnd"/>
-      <w:r>
-        <w:t>", "assertion failed", "traceback", ...]</w:t>
-      </w:r>
-    </w:p>
-    <w:p>
-      <w:pPr>
-        <w:pStyle w:val="Heading4"/>
-        <w:jc w:val="both"/>
-      </w:pPr>
-      <w:proofErr w:type="spellStart"/>
-      <w:r>
-        <w:t>print_summary</w:t>
-      </w:r>
-      <w:proofErr w:type="spellEnd"/>
-      <w:r>
-        <w:t>()</w:t>
-      </w:r>
-      <w:r>
-        <w:t>:</w:t>
-      </w:r>
-      <w:r>
-        <w:t xml:space="preserve"> </w:t>
-      </w:r>
-    </w:p>
-    <w:p>
-      <w:pPr>
-        <w:ind w:firstLine="720"/>
-        <w:jc w:val="both"/>
-      </w:pPr>
-      <w:r>
-        <w:t>P</w:t>
-      </w:r>
-      <w:r>
-        <w:t xml:space="preserve">rints a nicely aligned table of every result (sorted by test + seed) showing a </w:t>
-      </w:r>
-      <w:r>
-        <w:rPr>
-          <w:rFonts w:ascii="Segoe UI Symbol" w:hAnsi="Segoe UI Symbol" w:cs="Segoe UI Symbol"/>
-        </w:rPr>
-        <w:t>✔</w:t>
-      </w:r>
-      <w:r>
-        <w:t>/</w:t>
-      </w:r>
-      <w:r>
-        <w:rPr>
-          <w:rFonts w:ascii="Segoe UI Symbol" w:hAnsi="Segoe UI Symbol" w:cs="Segoe UI Symbol"/>
-        </w:rPr>
-        <w:t>✗</w:t>
-      </w:r>
-      <w:r>
-        <w:t xml:space="preserve"> mark, PASS/FAIL status, elapsed time, and log path. Below the table, failed runs are listed individually with their extracted error lines. Returns the failure count for use as the exit code.</w:t>
-      </w:r>
-    </w:p>
-    <w:p>
-      <w:pPr>
-        <w:pStyle w:val="Monospace"/>
-        <w:jc w:val="both"/>
-      </w:pPr>
-      <w:r>
-        <w:rPr>
-          <w:rFonts w:ascii="Segoe UI Symbol" w:hAnsi="Segoe UI Symbol" w:cs="Segoe UI Symbol"/>
-        </w:rPr>
-        <w:t>✔</w:t>
-      </w:r>
-      <w:r>
-        <w:t xml:space="preserve"> </w:t>
-      </w:r>
-      <w:proofErr w:type="spellStart"/>
-      <w:r>
-        <w:t>sanity_test</w:t>
-      </w:r>
-      <w:proofErr w:type="spellEnd"/>
-      <w:r>
-        <w:t xml:space="preserve">   seed=1   PASS   12.3s   build/log_sanity_test_1.log</w:t>
-      </w:r>
-    </w:p>
-    <w:p>
-      <w:pPr>
-        <w:pStyle w:val="Heading4"/>
-        <w:jc w:val="both"/>
-      </w:pPr>
-      <w:proofErr w:type="spellStart"/>
-      <w:r>
-        <w:t>parse_args</w:t>
-      </w:r>
-      <w:proofErr w:type="spellEnd"/>
-      <w:r>
-        <w:t>()</w:t>
-      </w:r>
-      <w:r>
-        <w:t>:</w:t>
-      </w:r>
-      <w:r>
-        <w:t xml:space="preserve"> </w:t>
-      </w:r>
-    </w:p>
-    <w:p>
-      <w:pPr>
-        <w:ind w:firstLine="720"/>
-        <w:jc w:val="both"/>
-      </w:pPr>
-      <w:r>
-        <w:t>Defines the command-line interface. Five flags: --seeds (which seeds), --tests (which tests), --workers (parallelism level), --compile (run make compile first), --compile-only (compile and quit), and --</w:t>
-      </w:r>
-      <w:proofErr w:type="spellStart"/>
-      <w:r>
-        <w:t>makefile-dir</w:t>
-      </w:r>
-      <w:proofErr w:type="spellEnd"/>
-      <w:r>
-        <w:t xml:space="preserve"> (where the </w:t>
-      </w:r>
-      <w:proofErr w:type="spellStart"/>
-      <w:r>
-        <w:t>Makefile</w:t>
-      </w:r>
-      <w:proofErr w:type="spellEnd"/>
-      <w:r>
-        <w:t xml:space="preserve"> lives).</w:t>
-      </w:r>
-    </w:p>
-    <w:p>
-      <w:pPr>
-        <w:pStyle w:val="Monospace"/>
-        <w:jc w:val="both"/>
-      </w:pPr>
-      <w:r>
-        <w:t xml:space="preserve">python run_parallel.py --tests </w:t>
-      </w:r>
-      <w:proofErr w:type="spellStart"/>
-      <w:r>
-        <w:t>sanity_test</w:t>
-      </w:r>
-      <w:proofErr w:type="spellEnd"/>
-      <w:r>
-        <w:t xml:space="preserve"> --seeds 1 2 3 --workers 4 </w:t>
-      </w:r>
-      <w:r>
-        <w:t>–</w:t>
-      </w:r>
-      <w:r>
-        <w:t>compile</w:t>
-      </w:r>
-    </w:p>
-    <w:p>
-      <w:pPr>
-        <w:pStyle w:val="Heading4"/>
-      </w:pPr>
-      <w:r>
-        <w:lastRenderedPageBreak/>
-        <w:t>main() — Setup &amp; Job Launch</w:t>
-      </w:r>
-      <w:r>
-        <w:t xml:space="preserve">: </w:t>
-      </w:r>
-    </w:p>
-    <w:p>
-      <w:pPr>
-        <w:ind w:firstLine="720"/>
-      </w:pPr>
-      <w:r>
-        <w:t xml:space="preserve">Entry point. Resolves the </w:t>
-      </w:r>
-      <w:proofErr w:type="spellStart"/>
-      <w:r>
-        <w:t>Makefile</w:t>
-      </w:r>
-      <w:proofErr w:type="spellEnd"/>
-      <w:r>
-        <w:t xml:space="preserve"> path, optionally compiles, builds the full list of (test × seed) Job objects, then submits them all to a </w:t>
-      </w:r>
-      <w:proofErr w:type="spellStart"/>
-      <w:r>
-        <w:t>ThreadPoolExecutor</w:t>
-      </w:r>
-      <w:proofErr w:type="spellEnd"/>
-      <w:r>
-        <w:t>. As each future completes it prints a live progress line showing rank, status, test name, seed, and time.</w:t>
-      </w:r>
-    </w:p>
-    <w:p>
-      <w:pPr>
-        <w:pStyle w:val="Monospace"/>
-      </w:pPr>
-      <w:r>
-        <w:t xml:space="preserve">with </w:t>
-      </w:r>
-      <w:proofErr w:type="spellStart"/>
-      <w:r>
-        <w:t>ThreadPoolExecutor</w:t>
-      </w:r>
-      <w:proofErr w:type="spellEnd"/>
-      <w:r>
-        <w:t>(</w:t>
-      </w:r>
-      <w:proofErr w:type="spellStart"/>
-      <w:r>
-        <w:t>max_workers</w:t>
-      </w:r>
-      <w:proofErr w:type="spellEnd"/>
-      <w:r>
-        <w:t>=workers) as pool:   futures = {</w:t>
-      </w:r>
-      <w:proofErr w:type="spellStart"/>
-      <w:r>
-        <w:t>pool.submit</w:t>
-      </w:r>
-      <w:proofErr w:type="spellEnd"/>
-      <w:r>
-        <w:t>(</w:t>
-      </w:r>
-      <w:proofErr w:type="spellStart"/>
-      <w:r>
-        <w:t>run_job</w:t>
-      </w:r>
-      <w:proofErr w:type="spellEnd"/>
-      <w:r>
-        <w:t>, job, ...) ...}</w:t>
-      </w:r>
-    </w:p>
-    <w:p>
-      <w:pPr>
-        <w:pStyle w:val="Heading4"/>
-      </w:pPr>
-      <w:r>
-        <w:t>main() — Timing Summary</w:t>
-      </w:r>
-      <w:r>
-        <w:t xml:space="preserve">: </w:t>
-      </w:r>
-    </w:p>
-    <w:p>
-      <w:pPr>
-        <w:ind w:firstLine="720"/>
-      </w:pPr>
-      <w:r>
-        <w:t xml:space="preserve">After all threads finish, computes wall-clock duration (h/m/s) and the sequential equivalent (sum of individual run times). Prints a speedup factor so you can see how much parallelism helped, </w:t>
-      </w:r>
-      <w:r>
-        <w:t>e.g.,</w:t>
-      </w:r>
-      <w:r>
-        <w:t xml:space="preserve"> '8.3x (would have taken 450 s sequentially)'.</w:t>
-      </w:r>
-    </w:p>
-    <w:p>
-      <w:pPr>
-        <w:pStyle w:val="Monospace"/>
-        <w:jc w:val="center"/>
-      </w:pPr>
-      <w:r>
-        <w:t>Speedup:</w:t>
-      </w:r>
-      <w:r>
-        <w:t xml:space="preserve"> </w:t>
-      </w:r>
-      <w:r>
-        <w:t>8.3x (</w:t>
-      </w:r>
-      <w:r>
-        <w:t>would have taken 450s sequentially)</w:t>
-      </w:r>
-    </w:p>
-    <w:p>
-      <w:pPr>
-        <w:pStyle w:val="Heading4"/>
-      </w:pPr>
-      <w:r>
-        <w:t>main() — Coverage Merge</w:t>
-      </w:r>
-    </w:p>
-    <w:p>
-      <w:pPr>
-        <w:ind w:firstLine="720"/>
-      </w:pPr>
-      <w:r>
-        <w:t>After results are printed, searches for Questa .</w:t>
-      </w:r>
-      <w:proofErr w:type="spellStart"/>
-      <w:r>
-        <w:t>ucdb</w:t>
-      </w:r>
-      <w:proofErr w:type="spellEnd"/>
-      <w:r>
-        <w:t xml:space="preserve"> coverage database files. If found, merges them with '</w:t>
-      </w:r>
-      <w:proofErr w:type="spellStart"/>
-      <w:r>
-        <w:t>vcover</w:t>
-      </w:r>
-      <w:proofErr w:type="spellEnd"/>
-      <w:r>
-        <w:t xml:space="preserve"> merge' into build/</w:t>
-      </w:r>
-      <w:proofErr w:type="spellStart"/>
-      <w:r>
-        <w:t>merged.ucdb</w:t>
-      </w:r>
-      <w:proofErr w:type="spellEnd"/>
-      <w:r>
-        <w:t>, then generates a human-readable coverage_report.txt with '</w:t>
-      </w:r>
-      <w:proofErr w:type="spellStart"/>
-      <w:r>
-        <w:t>vcover</w:t>
-      </w:r>
-      <w:proofErr w:type="spellEnd"/>
-      <w:r>
-        <w:t xml:space="preserve"> report'. Warns if no .</w:t>
-      </w:r>
-      <w:proofErr w:type="spellStart"/>
-      <w:r>
-        <w:t>ucdb</w:t>
-      </w:r>
-      <w:proofErr w:type="spellEnd"/>
-      <w:r>
-        <w:t xml:space="preserve"> files are found.</w:t>
-      </w:r>
-    </w:p>
-    <w:p>
-      <w:pPr>
-        <w:pStyle w:val="Monospace"/>
-      </w:pPr>
-      <w:proofErr w:type="spellStart"/>
-      <w:r>
-        <w:t>vcover</w:t>
-      </w:r>
-      <w:proofErr w:type="spellEnd"/>
-      <w:r>
-        <w:t xml:space="preserve"> merge -out build/</w:t>
-      </w:r>
-      <w:proofErr w:type="spellStart"/>
-      <w:r>
-        <w:t>merged.ucdb</w:t>
-      </w:r>
-      <w:proofErr w:type="spellEnd"/>
-      <w:r>
-        <w:t xml:space="preserve"> *.</w:t>
-      </w:r>
-      <w:proofErr w:type="spellStart"/>
-      <w:r>
-        <w:t>ucdb</w:t>
-      </w:r>
-      <w:proofErr w:type="spellEnd"/>
-      <w:r>
-        <w:t xml:space="preserve">   </w:t>
-      </w:r>
-      <w:r>
-        <w:rPr>
-          <w:rFonts w:ascii="Arial" w:hAnsi="Arial" w:cs="Arial"/>
-        </w:rPr>
-        <w:t>→</w:t>
-      </w:r>
-      <w:r>
-        <w:t xml:space="preserve">   coverage_report.txt</w:t>
-      </w:r>
-    </w:p>
-    <w:p>
-      <w:pPr>
-        <w:pStyle w:val="Monospace"/>
-      </w:pPr>
-    </w:p>
-    <w:p>
-      <w:pPr>
-        <w:pStyle w:val="Heading3"/>
-      </w:pPr>
-      <w:r>
-        <w:t>How the Blocks Connect</w:t>
-      </w:r>
-    </w:p>
-    <w:p>
-      <w:pPr>
-        <w:pStyle w:val="ListParagraph"/>
-        <w:numPr>
-          <w:ilvl w:val="0"/>
-          <w:numId w:val="7"/>
-        </w:numPr>
-      </w:pPr>
-      <w:proofErr w:type="spellStart"/>
-      <w:r>
-        <w:t>parse_args</w:t>
-      </w:r>
-      <w:proofErr w:type="spellEnd"/>
-      <w:r>
-        <w:t>() reads your command-line flags.</w:t>
-      </w:r>
-    </w:p>
-    <w:p>
-      <w:pPr>
-        <w:pStyle w:val="ListParagraph"/>
-        <w:numPr>
-          <w:ilvl w:val="0"/>
-          <w:numId w:val="7"/>
-        </w:numPr>
-      </w:pPr>
-      <w:proofErr w:type="spellStart"/>
-      <w:r>
-        <w:t>compile_project</w:t>
-      </w:r>
-      <w:proofErr w:type="spellEnd"/>
-      <w:r>
-        <w:t>() optionally builds the design under test.</w:t>
-      </w:r>
-    </w:p>
-    <w:p>
-      <w:pPr>
-        <w:pStyle w:val="ListParagraph"/>
-        <w:numPr>
-          <w:ilvl w:val="0"/>
-          <w:numId w:val="7"/>
-        </w:numPr>
-      </w:pPr>
-      <w:r>
-        <w:t>main() creates Job objects and dispatches them all to a thread pool.</w:t>
-      </w:r>
-    </w:p>
-    <w:p>
-      <w:pPr>
-        <w:pStyle w:val="ListParagraph"/>
-        <w:numPr>
-          <w:ilvl w:val="0"/>
-          <w:numId w:val="7"/>
-        </w:numPr>
-      </w:pPr>
-      <w:r>
-        <w:t xml:space="preserve">Each worker thread calls </w:t>
-      </w:r>
-      <w:proofErr w:type="spellStart"/>
-      <w:r>
-        <w:t>run_job</w:t>
-      </w:r>
-      <w:proofErr w:type="spellEnd"/>
-      <w:r>
-        <w:t>() then _</w:t>
-      </w:r>
-      <w:proofErr w:type="spellStart"/>
-      <w:r>
-        <w:t>detect_pass</w:t>
-      </w:r>
-      <w:proofErr w:type="spellEnd"/>
-      <w:r>
-        <w:t>().</w:t>
-      </w:r>
-    </w:p>
-    <w:p>
-      <w:pPr>
-        <w:pStyle w:val="ListParagraph"/>
-        <w:numPr>
-          <w:ilvl w:val="0"/>
-          <w:numId w:val="7"/>
-        </w:numPr>
-      </w:pPr>
-      <w:proofErr w:type="spellStart"/>
-      <w:r>
-        <w:t>print_summary</w:t>
-      </w:r>
-      <w:proofErr w:type="spellEnd"/>
-      <w:r>
-        <w:t>() prints the results table; _</w:t>
-      </w:r>
-      <w:proofErr w:type="spellStart"/>
-      <w:r>
-        <w:t>extract_errors</w:t>
-      </w:r>
-      <w:proofErr w:type="spellEnd"/>
-      <w:r>
-        <w:t>() shows why failures happened.</w:t>
-      </w:r>
-    </w:p>
-    <w:p>
-      <w:pPr>
-        <w:pStyle w:val="ListParagraph"/>
-        <w:numPr>
-          <w:ilvl w:val="0"/>
-          <w:numId w:val="7"/>
-        </w:numPr>
-      </w:pPr>
-      <w:r>
-        <w:t>Coverage .</w:t>
-      </w:r>
-      <w:proofErr w:type="spellStart"/>
-      <w:r>
-        <w:t>ucdb</w:t>
-      </w:r>
-      <w:proofErr w:type="spellEnd"/>
-      <w:r>
-        <w:t xml:space="preserve"> files are merged and a report is saved.</w:t>
-      </w:r>
-    </w:p>
-    <w:p>
-      <w:pPr>
-        <w:pStyle w:val="ListParagraph"/>
-        <w:numPr>
-          <w:ilvl w:val="0"/>
-          <w:numId w:val="7"/>
-        </w:numPr>
-      </w:pPr>
-      <w:r>
-        <w:t>The process exits with code 0 (all pass) or 1 (any failure) — CI-friendly.</w:t>
-      </w:r>
-    </w:p>
-    <w:p>
-      <w:r>
-        <w:br w:type="page"/>
-      </w:r>
-    </w:p>
-    <w:p>
-      <w:pPr>
-        <w:pStyle w:val="Heading1"/>
-      </w:pPr>
-      <w:bookmarkStart w:id="3" w:name="_Toc230306881"/>
-      <w:r>
-        <w:lastRenderedPageBreak/>
-        <w:t>Simulation Results</w:t>
-      </w:r>
-      <w:bookmarkEnd w:id="3"/>
+        <w:t xml:space="preserve"> report` call that generates `coverage_report.txt`. The script exits with code 0 if all runs pass and code 1 if any fail, making it directly compatible with CI pipelines.</w:t>
+      </w:r>
     </w:p>
     <w:p/>
     <w:p>
+      <w:pPr>
+        <w:spacing w:line="259" w:lineRule="auto"/>
+      </w:pPr>
       <w:r>
         <w:br w:type="page"/>
       </w:r>
@@ -2179,12 +2742,29 @@
       <w:pPr>
         <w:pStyle w:val="Heading1"/>
       </w:pPr>
-      <w:bookmarkStart w:id="4" w:name="_Toc230306882"/>
+      <w:bookmarkStart w:id="15" w:name="_Toc230310661"/>
+      <w:r>
+        <w:lastRenderedPageBreak/>
+        <w:t>Simulation Results</w:t>
+      </w:r>
+      <w:bookmarkEnd w:id="15"/>
+    </w:p>
+    <w:p/>
+    <w:p>
+      <w:r>
+        <w:br w:type="page"/>
+      </w:r>
+    </w:p>
+    <w:p>
+      <w:pPr>
+        <w:pStyle w:val="Heading1"/>
+      </w:pPr>
+      <w:bookmarkStart w:id="16" w:name="_Toc230310662"/>
       <w:r>
         <w:lastRenderedPageBreak/>
         <w:t>Bugs Found</w:t>
       </w:r>
-      <w:bookmarkEnd w:id="4"/>
+      <w:bookmarkEnd w:id="16"/>
     </w:p>
     <w:p/>
     <w:p/>
@@ -2197,12 +2777,12 @@
       <w:pPr>
         <w:pStyle w:val="Heading1"/>
       </w:pPr>
-      <w:bookmarkStart w:id="5" w:name="_Toc230306883"/>
+      <w:bookmarkStart w:id="17" w:name="_Toc230310663"/>
       <w:r>
         <w:lastRenderedPageBreak/>
         <w:t>Conclusion</w:t>
       </w:r>
-      <w:bookmarkEnd w:id="5"/>
+      <w:bookmarkEnd w:id="17"/>
     </w:p>
     <w:p/>
     <w:p/>
@@ -4096,6 +4676,19 @@
       <w:szCs w:val="19"/>
     </w:rPr>
   </w:style>
+  <w:style w:type="paragraph" w:styleId="TOC2">
+    <w:name w:val="toc 2"/>
+    <w:basedOn w:val="Normal"/>
+    <w:next w:val="Normal"/>
+    <w:autoRedefine/>
+    <w:uiPriority w:val="39"/>
+    <w:unhideWhenUsed/>
+    <w:rsid w:val="00A61E71"/>
+    <w:pPr>
+      <w:spacing w:after="100"/>
+      <w:ind w:left="240"/>
+    </w:pPr>
+  </w:style>
 </w:styles>
 </file>
 
@@ -4222,13 +4815,6 @@
     <w:pitch w:val="fixed"/>
     <w:sig w:usb0="00000087" w:usb1="00000000" w:usb2="00000000" w:usb3="00000000" w:csb0="0000001B" w:csb1="00000000"/>
   </w:font>
-  <w:font w:name="Segoe UI Symbol">
-    <w:panose1 w:val="020B0502040204020203"/>
-    <w:charset w:val="00"/>
-    <w:family w:val="swiss"/>
-    <w:pitch w:val="variable"/>
-    <w:sig w:usb0="800001E3" w:usb1="1200FFEF" w:usb2="00040000" w:usb3="00000000" w:csb0="00000001" w:csb1="00000000"/>
-  </w:font>
 </w:fonts>
 </file>
 
@@ -4247,8 +4833,8 @@
     <w:compatSetting w:name="useWord2013TrackBottomHyphenation" w:uri="http://schemas.microsoft.com/office/word" w:val="0"/>
   </w:compat>
   <w:rsids>
-    <w:rsidRoot w:val="00FD7210"/>
-    <w:rsid w:val="00FD7210"/>
+    <w:rsidRoot w:val="00102A86"/>
+    <w:rsid w:val="00102A86"/>
   </w:rsids>
   <m:mathPr>
     <m:mathFont m:val="Cambria Math"/>

</xml_diff>

<commit_message>
work on final report
</commit_message>
<xml_diff>
--- a/Report/Final_Report.docx
+++ b/Report/Final_Report.docx
@@ -1,6 +1,6 @@
 
 <file path=word/document.xml><?xml version="1.0" encoding="utf-8"?>
-<w:document xmlns:wpc="http://schemas.microsoft.com/office/word/2010/wordprocessingCanvas" xmlns:cx="http://schemas.microsoft.com/office/drawing/2014/chartex" xmlns:cx1="http://schemas.microsoft.com/office/drawing/2015/9/8/chartex" xmlns:cx2="http://schemas.microsoft.com/office/drawing/2015/10/21/chartex" xmlns:cx3="http://schemas.microsoft.com/office/drawing/2016/5/9/chartex" xmlns:cx4="http://schemas.microsoft.com/office/drawing/2016/5/10/chartex" xmlns:cx5="http://schemas.microsoft.com/office/drawing/2016/5/11/chartex" xmlns:cx6="http://schemas.microsoft.com/office/drawing/2016/5/12/chartex" xmlns:cx7="http://schemas.microsoft.com/office/drawing/2016/5/13/chartex" xmlns:cx8="http://schemas.microsoft.com/office/drawing/2016/5/14/chartex" xmlns:mc="http://schemas.openxmlformats.org/markup-compatibility/2006" xmlns:aink="http://schemas.microsoft.com/office/drawing/2016/ink" xmlns:am3d="http://schemas.microsoft.com/office/drawing/2017/model3d" xmlns:o="urn:schemas-microsoft-com:office:office" xmlns:oel="http://schemas.microsoft.com/office/2019/extlst" xmlns:r="http://schemas.openxmlformats.org/officeDocument/2006/relationships" xmlns:m="http://schemas.openxmlformats.org/officeDocument/2006/math" xmlns:v="urn:schemas-microsoft-com:vml" xmlns:wp14="http://schemas.microsoft.com/office/word/2010/wordprocessingDrawing" xmlns:wp="http://schemas.openxmlformats.org/drawingml/2006/wordprocessingDrawing" xmlns:w10="urn:schemas-microsoft-com:office:word" xmlns:w="http://schemas.openxmlformats.org/wordprocessingml/2006/main" xmlns:w14="http://schemas.microsoft.com/office/word/2010/wordml" xmlns:w15="http://schemas.microsoft.com/office/word/2012/wordml" xmlns:w16cex="http://schemas.microsoft.com/office/word/2018/wordml/cex" xmlns:w16cid="http://schemas.microsoft.com/office/word/2016/wordml/cid" xmlns:w16="http://schemas.microsoft.com/office/word/2018/wordml" xmlns:w16du="http://schemas.microsoft.com/office/word/2023/wordml/word16du" xmlns:w16sdtdh="http://schemas.microsoft.com/office/word/2020/wordml/sdtdatahash" xmlns:w16se="http://schemas.microsoft.com/office/word/2015/wordml/symex" xmlns:wpg="http://schemas.microsoft.com/office/word/2010/wordprocessingGroup" xmlns:wpi="http://schemas.microsoft.com/office/word/2010/wordprocessingInk" xmlns:wne="http://schemas.microsoft.com/office/word/2006/wordml" xmlns:wps="http://schemas.microsoft.com/office/word/2010/wordprocessingShape" mc:Ignorable="w14 w15 w16se w16cid w16 w16cex w16sdtdh wp14">
+<w:document xmlns:wpc="http://schemas.microsoft.com/office/word/2010/wordprocessingCanvas" xmlns:cx="http://schemas.microsoft.com/office/drawing/2014/chartex" xmlns:cx1="http://schemas.microsoft.com/office/drawing/2015/9/8/chartex" xmlns:cx2="http://schemas.microsoft.com/office/drawing/2015/10/21/chartex" xmlns:cx3="http://schemas.microsoft.com/office/drawing/2016/5/9/chartex" xmlns:cx4="http://schemas.microsoft.com/office/drawing/2016/5/10/chartex" xmlns:cx5="http://schemas.microsoft.com/office/drawing/2016/5/11/chartex" xmlns:cx6="http://schemas.microsoft.com/office/drawing/2016/5/12/chartex" xmlns:cx7="http://schemas.microsoft.com/office/drawing/2016/5/13/chartex" xmlns:cx8="http://schemas.microsoft.com/office/drawing/2016/5/14/chartex" xmlns:mc="http://schemas.openxmlformats.org/markup-compatibility/2006" xmlns:aink="http://schemas.microsoft.com/office/drawing/2016/ink" xmlns:am3d="http://schemas.microsoft.com/office/drawing/2017/model3d" xmlns:o="urn:schemas-microsoft-com:office:office" xmlns:oel="http://schemas.microsoft.com/office/2019/extlst" xmlns:r="http://schemas.openxmlformats.org/officeDocument/2006/relationships" xmlns:m="http://schemas.openxmlformats.org/officeDocument/2006/math" xmlns:v="urn:schemas-microsoft-com:vml" xmlns:wp14="http://schemas.microsoft.com/office/word/2010/wordprocessingDrawing" xmlns:wp="http://schemas.openxmlformats.org/drawingml/2006/wordprocessingDrawing" xmlns:w10="urn:schemas-microsoft-com:office:word" xmlns:w="http://schemas.openxmlformats.org/wordprocessingml/2006/main" xmlns:w14="http://schemas.microsoft.com/office/word/2010/wordml" xmlns:w15="http://schemas.microsoft.com/office/word/2012/wordml" xmlns:w16cex="http://schemas.microsoft.com/office/word/2018/wordml/cex" xmlns:w16cid="http://schemas.microsoft.com/office/word/2016/wordml/cid" xmlns:w16="http://schemas.microsoft.com/office/word/2018/wordml" xmlns:w16du="http://schemas.microsoft.com/office/word/2023/wordml/word16du" xmlns:w16sdtdh="http://schemas.microsoft.com/office/word/2020/wordml/sdtdatahash" xmlns:w16sdtfl="http://schemas.microsoft.com/office/word/2024/wordml/sdtformatlock" xmlns:w16se="http://schemas.microsoft.com/office/word/2015/wordml/symex" xmlns:wpg="http://schemas.microsoft.com/office/word/2010/wordprocessingGroup" xmlns:wpi="http://schemas.microsoft.com/office/word/2010/wordprocessingInk" xmlns:wne="http://schemas.microsoft.com/office/word/2006/wordml" xmlns:wps="http://schemas.microsoft.com/office/word/2010/wordprocessingShape" mc:Ignorable="w14 w15 w16se w16cid w16 w16cex w16sdtdh w16sdtfl w16du wp14">
   <w:body>
     <w:p>
       <w:pPr>
@@ -62,87 +62,612 @@
       <w:pPr>
         <w:jc w:val="center"/>
         <w:rPr>
+          <w:b/>
+          <w:bCs/>
           <w:sz w:val="48"/>
           <w:szCs w:val="48"/>
         </w:rPr>
       </w:pPr>
       <w:r>
         <w:rPr>
+          <w:b/>
+          <w:bCs/>
           <w:sz w:val="48"/>
           <w:szCs w:val="48"/>
         </w:rPr>
-        <w:t>Verification Report</w:t>
-      </w:r>
-    </w:p>
-    <w:sdt>
-      <w:sdtPr>
+        <w:t xml:space="preserve">CSE – 313s </w:t>
+      </w:r>
+    </w:p>
+    <w:p>
+      <w:pPr>
+        <w:jc w:val="center"/>
         <w:rPr>
+          <w:b/>
+          <w:bCs/>
           <w:sz w:val="48"/>
           <w:szCs w:val="48"/>
         </w:rPr>
-        <w:alias w:val="Title"/>
-        <w:tag w:val=""/>
-        <w:id w:val="1313057570"/>
-        <w:placeholder>
-          <w:docPart w:val="E50EBC09E417438CB8AA5BB7AAE1017C"/>
-        </w:placeholder>
-        <w:showingPlcHdr/>
-        <w:dataBinding w:prefixMappings="xmlns:ns0='http://purl.org/dc/elements/1.1/' xmlns:ns1='http://schemas.openxmlformats.org/package/2006/metadata/core-properties' " w:xpath="/ns1:coreProperties[1]/ns0:title[1]" w:storeItemID="{6C3C8BC8-F283-45AE-878A-BAB7291924A1}"/>
-        <w:text/>
-      </w:sdtPr>
-      <w:sdtContent>
-        <w:p>
-          <w:pPr>
-            <w:jc w:val="center"/>
-            <w:rPr>
-              <w:sz w:val="48"/>
-              <w:szCs w:val="48"/>
-            </w:rPr>
-          </w:pPr>
-          <w:r>
-            <w:rPr>
-              <w:rStyle w:val="PlaceholderText"/>
-            </w:rPr>
-            <w:t>[Title]</w:t>
-          </w:r>
-        </w:p>
-      </w:sdtContent>
-    </w:sdt>
-    <w:sdt>
-      <w:sdtPr>
+      </w:pPr>
+      <w:r>
         <w:rPr>
+          <w:b/>
+          <w:bCs/>
           <w:sz w:val="48"/>
           <w:szCs w:val="48"/>
         </w:rPr>
-        <w:alias w:val="Subject"/>
-        <w:tag w:val=""/>
-        <w:id w:val="1716236938"/>
-        <w:placeholder>
-          <w:docPart w:val="AC7FA7CB34A64FB280DDB685D9E847A2"/>
-        </w:placeholder>
-        <w:showingPlcHdr/>
-        <w:dataBinding w:prefixMappings="xmlns:ns0='http://purl.org/dc/elements/1.1/' xmlns:ns1='http://schemas.openxmlformats.org/package/2006/metadata/core-properties' " w:xpath="/ns1:coreProperties[1]/ns0:subject[1]" w:storeItemID="{6C3C8BC8-F283-45AE-878A-BAB7291924A1}"/>
-        <w:text/>
-      </w:sdtPr>
-      <w:sdtContent>
-        <w:p>
-          <w:pPr>
-            <w:jc w:val="center"/>
-            <w:rPr>
-              <w:sz w:val="48"/>
-              <w:szCs w:val="48"/>
-            </w:rPr>
-          </w:pPr>
-          <w:r>
-            <w:rPr>
-              <w:rStyle w:val="PlaceholderText"/>
-            </w:rPr>
-            <w:t>[Subject]</w:t>
-          </w:r>
-        </w:p>
-      </w:sdtContent>
-    </w:sdt>
-    <w:p/>
+        <w:t>Digital Systems Testing and Verification</w:t>
+      </w:r>
+    </w:p>
+    <w:p>
+      <w:pPr>
+        <w:jc w:val="center"/>
+        <w:rPr>
+          <w:b/>
+          <w:bCs/>
+          <w:sz w:val="40"/>
+          <w:szCs w:val="40"/>
+        </w:rPr>
+      </w:pPr>
+      <w:r>
+        <w:rPr>
+          <w:b/>
+          <w:bCs/>
+          <w:sz w:val="40"/>
+          <w:szCs w:val="40"/>
+        </w:rPr>
+        <w:t>Final Project Report</w:t>
+      </w:r>
+    </w:p>
+    <w:p>
+      <w:pPr>
+        <w:jc w:val="center"/>
+        <w:rPr>
+          <w:b/>
+          <w:bCs/>
+          <w:sz w:val="48"/>
+          <w:szCs w:val="48"/>
+        </w:rPr>
+      </w:pPr>
+      <w:r>
+        <w:rPr>
+          <w:b/>
+          <w:bCs/>
+          <w:sz w:val="48"/>
+          <w:szCs w:val="48"/>
+        </w:rPr>
+        <w:t>SPI Master with APB Interface</w:t>
+      </w:r>
+    </w:p>
+    <w:p>
+      <w:pPr>
+        <w:jc w:val="center"/>
+        <w:rPr>
+          <w:b/>
+          <w:bCs/>
+          <w:sz w:val="40"/>
+          <w:szCs w:val="40"/>
+        </w:rPr>
+      </w:pPr>
+      <w:r>
+        <w:rPr>
+          <w:b/>
+          <w:bCs/>
+          <w:sz w:val="40"/>
+          <w:szCs w:val="40"/>
+        </w:rPr>
+        <w:t>Team-19</w:t>
+      </w:r>
+    </w:p>
+    <w:tbl>
+      <w:tblPr>
+        <w:tblStyle w:val="GridTable4-Accent1"/>
+        <w:tblW w:w="8823" w:type="dxa"/>
+        <w:tblLook w:val="04A0" w:firstRow="1" w:lastRow="0" w:firstColumn="1" w:lastColumn="0" w:noHBand="0" w:noVBand="1"/>
+      </w:tblPr>
+      <w:tblGrid>
+        <w:gridCol w:w="4609"/>
+        <w:gridCol w:w="1704"/>
+        <w:gridCol w:w="2510"/>
+      </w:tblGrid>
+      <w:tr>
+        <w:trPr>
+          <w:cnfStyle w:val="100000000000" w:firstRow="1" w:lastRow="0" w:firstColumn="0" w:lastColumn="0" w:oddVBand="0" w:evenVBand="0" w:oddHBand="0" w:evenHBand="0" w:firstRowFirstColumn="0" w:firstRowLastColumn="0" w:lastRowFirstColumn="0" w:lastRowLastColumn="0"/>
+          <w:trHeight w:val="377"/>
+        </w:trPr>
+        <w:tc>
+          <w:tcPr>
+            <w:cnfStyle w:val="001000000000" w:firstRow="0" w:lastRow="0" w:firstColumn="1" w:lastColumn="0" w:oddVBand="0" w:evenVBand="0" w:oddHBand="0" w:evenHBand="0" w:firstRowFirstColumn="0" w:firstRowLastColumn="0" w:lastRowFirstColumn="0" w:lastRowLastColumn="0"/>
+            <w:tcW w:w="0" w:type="auto"/>
+          </w:tcPr>
+          <w:p>
+            <w:pPr>
+              <w:jc w:val="center"/>
+            </w:pPr>
+            <w:r>
+              <w:t>Name</w:t>
+            </w:r>
+          </w:p>
+        </w:tc>
+        <w:tc>
+          <w:tcPr>
+            <w:tcW w:w="1704" w:type="dxa"/>
+          </w:tcPr>
+          <w:p>
+            <w:pPr>
+              <w:jc w:val="center"/>
+              <w:cnfStyle w:val="100000000000" w:firstRow="1" w:lastRow="0" w:firstColumn="0" w:lastColumn="0" w:oddVBand="0" w:evenVBand="0" w:oddHBand="0" w:evenHBand="0" w:firstRowFirstColumn="0" w:firstRowLastColumn="0" w:lastRowFirstColumn="0" w:lastRowLastColumn="0"/>
+            </w:pPr>
+            <w:r>
+              <w:t>ID</w:t>
+            </w:r>
+          </w:p>
+        </w:tc>
+        <w:tc>
+          <w:tcPr>
+            <w:tcW w:w="2510" w:type="dxa"/>
+          </w:tcPr>
+          <w:p>
+            <w:pPr>
+              <w:jc w:val="center"/>
+              <w:cnfStyle w:val="100000000000" w:firstRow="1" w:lastRow="0" w:firstColumn="0" w:lastColumn="0" w:oddVBand="0" w:evenVBand="0" w:oddHBand="0" w:evenHBand="0" w:firstRowFirstColumn="0" w:firstRowLastColumn="0" w:lastRowFirstColumn="0" w:lastRowLastColumn="0"/>
+            </w:pPr>
+            <w:r>
+              <w:t>Specialization</w:t>
+            </w:r>
+          </w:p>
+        </w:tc>
+      </w:tr>
+      <w:tr>
+        <w:trPr>
+          <w:cnfStyle w:val="000000100000" w:firstRow="0" w:lastRow="0" w:firstColumn="0" w:lastColumn="0" w:oddVBand="0" w:evenVBand="0" w:oddHBand="1" w:evenHBand="0" w:firstRowFirstColumn="0" w:firstRowLastColumn="0" w:lastRowFirstColumn="0" w:lastRowLastColumn="0"/>
+          <w:trHeight w:val="364"/>
+        </w:trPr>
+        <w:tc>
+          <w:tcPr>
+            <w:cnfStyle w:val="001000000000" w:firstRow="0" w:lastRow="0" w:firstColumn="1" w:lastColumn="0" w:oddVBand="0" w:evenVBand="0" w:oddHBand="0" w:evenHBand="0" w:firstRowFirstColumn="0" w:firstRowLastColumn="0" w:lastRowFirstColumn="0" w:lastRowLastColumn="0"/>
+            <w:tcW w:w="0" w:type="auto"/>
+          </w:tcPr>
+          <w:p>
+            <w:pPr>
+              <w:jc w:val="center"/>
+            </w:pPr>
+            <w:r>
+              <w:t>Ziad Ahmed Orabi</w:t>
+            </w:r>
+          </w:p>
+        </w:tc>
+        <w:tc>
+          <w:tcPr>
+            <w:tcW w:w="1704" w:type="dxa"/>
+          </w:tcPr>
+          <w:p>
+            <w:pPr>
+              <w:jc w:val="center"/>
+              <w:cnfStyle w:val="000000100000" w:firstRow="0" w:lastRow="0" w:firstColumn="0" w:lastColumn="0" w:oddVBand="0" w:evenVBand="0" w:oddHBand="1" w:evenHBand="0" w:firstRowFirstColumn="0" w:firstRowLastColumn="0" w:lastRowFirstColumn="0" w:lastRowLastColumn="0"/>
+              <w:rPr>
+                <w:b/>
+                <w:bCs/>
+              </w:rPr>
+            </w:pPr>
+            <w:r>
+              <w:rPr>
+                <w:b/>
+                <w:bCs/>
+              </w:rPr>
+              <w:t>2200399</w:t>
+            </w:r>
+          </w:p>
+        </w:tc>
+        <w:tc>
+          <w:tcPr>
+            <w:tcW w:w="2510" w:type="dxa"/>
+          </w:tcPr>
+          <w:p>
+            <w:pPr>
+              <w:jc w:val="center"/>
+              <w:cnfStyle w:val="000000100000" w:firstRow="0" w:lastRow="0" w:firstColumn="0" w:lastColumn="0" w:oddVBand="0" w:evenVBand="0" w:oddHBand="1" w:evenHBand="0" w:firstRowFirstColumn="0" w:firstRowLastColumn="0" w:lastRowFirstColumn="0" w:lastRowLastColumn="0"/>
+              <w:rPr>
+                <w:b/>
+                <w:bCs/>
+              </w:rPr>
+            </w:pPr>
+            <w:r>
+              <w:rPr>
+                <w:b/>
+                <w:bCs/>
+              </w:rPr>
+              <w:t>CSE</w:t>
+            </w:r>
+          </w:p>
+        </w:tc>
+      </w:tr>
+      <w:tr>
+        <w:trPr>
+          <w:trHeight w:val="377"/>
+        </w:trPr>
+        <w:tc>
+          <w:tcPr>
+            <w:cnfStyle w:val="001000000000" w:firstRow="0" w:lastRow="0" w:firstColumn="1" w:lastColumn="0" w:oddVBand="0" w:evenVBand="0" w:oddHBand="0" w:evenHBand="0" w:firstRowFirstColumn="0" w:firstRowLastColumn="0" w:lastRowFirstColumn="0" w:lastRowLastColumn="0"/>
+            <w:tcW w:w="0" w:type="auto"/>
+          </w:tcPr>
+          <w:p>
+            <w:pPr>
+              <w:jc w:val="center"/>
+            </w:pPr>
+            <w:r>
+              <w:t>Mathew Mina Youssef Aziz</w:t>
+            </w:r>
+          </w:p>
+        </w:tc>
+        <w:tc>
+          <w:tcPr>
+            <w:tcW w:w="1704" w:type="dxa"/>
+          </w:tcPr>
+          <w:p>
+            <w:pPr>
+              <w:jc w:val="center"/>
+              <w:cnfStyle w:val="000000000000" w:firstRow="0" w:lastRow="0" w:firstColumn="0" w:lastColumn="0" w:oddVBand="0" w:evenVBand="0" w:oddHBand="0" w:evenHBand="0" w:firstRowFirstColumn="0" w:firstRowLastColumn="0" w:lastRowFirstColumn="0" w:lastRowLastColumn="0"/>
+              <w:rPr>
+                <w:b/>
+                <w:bCs/>
+              </w:rPr>
+            </w:pPr>
+            <w:r>
+              <w:rPr>
+                <w:b/>
+                <w:bCs/>
+              </w:rPr>
+              <w:t>2300910</w:t>
+            </w:r>
+          </w:p>
+        </w:tc>
+        <w:tc>
+          <w:tcPr>
+            <w:tcW w:w="2510" w:type="dxa"/>
+          </w:tcPr>
+          <w:p>
+            <w:pPr>
+              <w:jc w:val="center"/>
+              <w:cnfStyle w:val="000000000000" w:firstRow="0" w:lastRow="0" w:firstColumn="0" w:lastColumn="0" w:oddVBand="0" w:evenVBand="0" w:oddHBand="0" w:evenHBand="0" w:firstRowFirstColumn="0" w:firstRowLastColumn="0" w:lastRowFirstColumn="0" w:lastRowLastColumn="0"/>
+              <w:rPr>
+                <w:b/>
+                <w:bCs/>
+              </w:rPr>
+            </w:pPr>
+            <w:r>
+              <w:rPr>
+                <w:b/>
+                <w:bCs/>
+              </w:rPr>
+              <w:t>CSE</w:t>
+            </w:r>
+          </w:p>
+        </w:tc>
+      </w:tr>
+      <w:tr>
+        <w:trPr>
+          <w:cnfStyle w:val="000000100000" w:firstRow="0" w:lastRow="0" w:firstColumn="0" w:lastColumn="0" w:oddVBand="0" w:evenVBand="0" w:oddHBand="1" w:evenHBand="0" w:firstRowFirstColumn="0" w:firstRowLastColumn="0" w:lastRowFirstColumn="0" w:lastRowLastColumn="0"/>
+          <w:trHeight w:val="364"/>
+        </w:trPr>
+        <w:tc>
+          <w:tcPr>
+            <w:cnfStyle w:val="001000000000" w:firstRow="0" w:lastRow="0" w:firstColumn="1" w:lastColumn="0" w:oddVBand="0" w:evenVBand="0" w:oddHBand="0" w:evenHBand="0" w:firstRowFirstColumn="0" w:firstRowLastColumn="0" w:lastRowFirstColumn="0" w:lastRowLastColumn="0"/>
+            <w:tcW w:w="0" w:type="auto"/>
+          </w:tcPr>
+          <w:p>
+            <w:pPr>
+              <w:jc w:val="center"/>
+            </w:pPr>
+            <w:proofErr w:type="spellStart"/>
+            <w:r>
+              <w:t>Arsany</w:t>
+            </w:r>
+            <w:proofErr w:type="spellEnd"/>
+            <w:r>
+              <w:t xml:space="preserve"> Hany Anwar</w:t>
+            </w:r>
+          </w:p>
+        </w:tc>
+        <w:tc>
+          <w:tcPr>
+            <w:tcW w:w="1704" w:type="dxa"/>
+          </w:tcPr>
+          <w:p>
+            <w:pPr>
+              <w:jc w:val="center"/>
+              <w:cnfStyle w:val="000000100000" w:firstRow="0" w:lastRow="0" w:firstColumn="0" w:lastColumn="0" w:oddVBand="0" w:evenVBand="0" w:oddHBand="1" w:evenHBand="0" w:firstRowFirstColumn="0" w:firstRowLastColumn="0" w:lastRowFirstColumn="0" w:lastRowLastColumn="0"/>
+              <w:rPr>
+                <w:b/>
+                <w:bCs/>
+              </w:rPr>
+            </w:pPr>
+            <w:r>
+              <w:rPr>
+                <w:b/>
+                <w:bCs/>
+              </w:rPr>
+              <w:t>2200655</w:t>
+            </w:r>
+          </w:p>
+        </w:tc>
+        <w:tc>
+          <w:tcPr>
+            <w:tcW w:w="2510" w:type="dxa"/>
+          </w:tcPr>
+          <w:p>
+            <w:pPr>
+              <w:jc w:val="center"/>
+              <w:cnfStyle w:val="000000100000" w:firstRow="0" w:lastRow="0" w:firstColumn="0" w:lastColumn="0" w:oddVBand="0" w:evenVBand="0" w:oddHBand="1" w:evenHBand="0" w:firstRowFirstColumn="0" w:firstRowLastColumn="0" w:lastRowFirstColumn="0" w:lastRowLastColumn="0"/>
+              <w:rPr>
+                <w:b/>
+                <w:bCs/>
+              </w:rPr>
+            </w:pPr>
+            <w:r>
+              <w:rPr>
+                <w:b/>
+                <w:bCs/>
+              </w:rPr>
+              <w:t>CSE</w:t>
+            </w:r>
+          </w:p>
+        </w:tc>
+      </w:tr>
+      <w:tr>
+        <w:trPr>
+          <w:trHeight w:val="377"/>
+        </w:trPr>
+        <w:tc>
+          <w:tcPr>
+            <w:cnfStyle w:val="001000000000" w:firstRow="0" w:lastRow="0" w:firstColumn="1" w:lastColumn="0" w:oddVBand="0" w:evenVBand="0" w:oddHBand="0" w:evenHBand="0" w:firstRowFirstColumn="0" w:firstRowLastColumn="0" w:lastRowFirstColumn="0" w:lastRowLastColumn="0"/>
+            <w:tcW w:w="0" w:type="auto"/>
+          </w:tcPr>
+          <w:p>
+            <w:pPr>
+              <w:jc w:val="center"/>
+            </w:pPr>
+            <w:r>
+              <w:t>Andrew Ehab Tharwat</w:t>
+            </w:r>
+          </w:p>
+        </w:tc>
+        <w:tc>
+          <w:tcPr>
+            <w:tcW w:w="1704" w:type="dxa"/>
+          </w:tcPr>
+          <w:p>
+            <w:pPr>
+              <w:jc w:val="center"/>
+              <w:cnfStyle w:val="000000000000" w:firstRow="0" w:lastRow="0" w:firstColumn="0" w:lastColumn="0" w:oddVBand="0" w:evenVBand="0" w:oddHBand="0" w:evenHBand="0" w:firstRowFirstColumn="0" w:firstRowLastColumn="0" w:lastRowFirstColumn="0" w:lastRowLastColumn="0"/>
+              <w:rPr>
+                <w:b/>
+                <w:bCs/>
+              </w:rPr>
+            </w:pPr>
+            <w:r>
+              <w:rPr>
+                <w:b/>
+                <w:bCs/>
+              </w:rPr>
+              <w:t>2200249</w:t>
+            </w:r>
+          </w:p>
+        </w:tc>
+        <w:tc>
+          <w:tcPr>
+            <w:tcW w:w="2510" w:type="dxa"/>
+          </w:tcPr>
+          <w:p>
+            <w:pPr>
+              <w:jc w:val="center"/>
+              <w:cnfStyle w:val="000000000000" w:firstRow="0" w:lastRow="0" w:firstColumn="0" w:lastColumn="0" w:oddVBand="0" w:evenVBand="0" w:oddHBand="0" w:evenHBand="0" w:firstRowFirstColumn="0" w:firstRowLastColumn="0" w:lastRowFirstColumn="0" w:lastRowLastColumn="0"/>
+              <w:rPr>
+                <w:b/>
+                <w:bCs/>
+              </w:rPr>
+            </w:pPr>
+            <w:r>
+              <w:rPr>
+                <w:b/>
+                <w:bCs/>
+              </w:rPr>
+              <w:t>CSE</w:t>
+            </w:r>
+          </w:p>
+        </w:tc>
+      </w:tr>
+      <w:tr>
+        <w:trPr>
+          <w:cnfStyle w:val="000000100000" w:firstRow="0" w:lastRow="0" w:firstColumn="0" w:lastColumn="0" w:oddVBand="0" w:evenVBand="0" w:oddHBand="1" w:evenHBand="0" w:firstRowFirstColumn="0" w:firstRowLastColumn="0" w:lastRowFirstColumn="0" w:lastRowLastColumn="0"/>
+          <w:trHeight w:val="364"/>
+        </w:trPr>
+        <w:tc>
+          <w:tcPr>
+            <w:cnfStyle w:val="001000000000" w:firstRow="0" w:lastRow="0" w:firstColumn="1" w:lastColumn="0" w:oddVBand="0" w:evenVBand="0" w:oddHBand="0" w:evenHBand="0" w:firstRowFirstColumn="0" w:firstRowLastColumn="0" w:lastRowFirstColumn="0" w:lastRowLastColumn="0"/>
+            <w:tcW w:w="0" w:type="auto"/>
+          </w:tcPr>
+          <w:p>
+            <w:pPr>
+              <w:jc w:val="center"/>
+            </w:pPr>
+            <w:r>
+              <w:t>Mina Fathy Labib</w:t>
+            </w:r>
+          </w:p>
+        </w:tc>
+        <w:tc>
+          <w:tcPr>
+            <w:tcW w:w="1704" w:type="dxa"/>
+          </w:tcPr>
+          <w:p>
+            <w:pPr>
+              <w:jc w:val="center"/>
+              <w:cnfStyle w:val="000000100000" w:firstRow="0" w:lastRow="0" w:firstColumn="0" w:lastColumn="0" w:oddVBand="0" w:evenVBand="0" w:oddHBand="1" w:evenHBand="0" w:firstRowFirstColumn="0" w:firstRowLastColumn="0" w:lastRowFirstColumn="0" w:lastRowLastColumn="0"/>
+              <w:rPr>
+                <w:b/>
+                <w:bCs/>
+              </w:rPr>
+            </w:pPr>
+            <w:r>
+              <w:rPr>
+                <w:b/>
+                <w:bCs/>
+              </w:rPr>
+              <w:t>2200840</w:t>
+            </w:r>
+          </w:p>
+        </w:tc>
+        <w:tc>
+          <w:tcPr>
+            <w:tcW w:w="2510" w:type="dxa"/>
+          </w:tcPr>
+          <w:p>
+            <w:pPr>
+              <w:jc w:val="center"/>
+              <w:cnfStyle w:val="000000100000" w:firstRow="0" w:lastRow="0" w:firstColumn="0" w:lastColumn="0" w:oddVBand="0" w:evenVBand="0" w:oddHBand="1" w:evenHBand="0" w:firstRowFirstColumn="0" w:firstRowLastColumn="0" w:lastRowFirstColumn="0" w:lastRowLastColumn="0"/>
+              <w:rPr>
+                <w:b/>
+                <w:bCs/>
+              </w:rPr>
+            </w:pPr>
+            <w:r>
+              <w:rPr>
+                <w:b/>
+                <w:bCs/>
+              </w:rPr>
+              <w:t>ECE</w:t>
+            </w:r>
+          </w:p>
+        </w:tc>
+      </w:tr>
+      <w:tr>
+        <w:trPr>
+          <w:trHeight w:val="377"/>
+        </w:trPr>
+        <w:tc>
+          <w:tcPr>
+            <w:cnfStyle w:val="001000000000" w:firstRow="0" w:lastRow="0" w:firstColumn="1" w:lastColumn="0" w:oddVBand="0" w:evenVBand="0" w:oddHBand="0" w:evenHBand="0" w:firstRowFirstColumn="0" w:firstRowLastColumn="0" w:lastRowFirstColumn="0" w:lastRowLastColumn="0"/>
+            <w:tcW w:w="0" w:type="auto"/>
+          </w:tcPr>
+          <w:p>
+            <w:pPr>
+              <w:jc w:val="center"/>
+            </w:pPr>
+            <w:r>
+              <w:t>Radwa Yasser Ahmed</w:t>
+            </w:r>
+          </w:p>
+        </w:tc>
+        <w:tc>
+          <w:tcPr>
+            <w:tcW w:w="1704" w:type="dxa"/>
+          </w:tcPr>
+          <w:p>
+            <w:pPr>
+              <w:jc w:val="center"/>
+              <w:cnfStyle w:val="000000000000" w:firstRow="0" w:lastRow="0" w:firstColumn="0" w:lastColumn="0" w:oddVBand="0" w:evenVBand="0" w:oddHBand="0" w:evenHBand="0" w:firstRowFirstColumn="0" w:firstRowLastColumn="0" w:lastRowFirstColumn="0" w:lastRowLastColumn="0"/>
+              <w:rPr>
+                <w:b/>
+                <w:bCs/>
+              </w:rPr>
+            </w:pPr>
+            <w:r>
+              <w:rPr>
+                <w:b/>
+                <w:bCs/>
+              </w:rPr>
+              <w:t>2200239</w:t>
+            </w:r>
+          </w:p>
+        </w:tc>
+        <w:tc>
+          <w:tcPr>
+            <w:tcW w:w="2510" w:type="dxa"/>
+          </w:tcPr>
+          <w:p>
+            <w:pPr>
+              <w:jc w:val="center"/>
+              <w:cnfStyle w:val="000000000000" w:firstRow="0" w:lastRow="0" w:firstColumn="0" w:lastColumn="0" w:oddVBand="0" w:evenVBand="0" w:oddHBand="0" w:evenHBand="0" w:firstRowFirstColumn="0" w:firstRowLastColumn="0" w:lastRowFirstColumn="0" w:lastRowLastColumn="0"/>
+              <w:rPr>
+                <w:b/>
+                <w:bCs/>
+              </w:rPr>
+            </w:pPr>
+            <w:r>
+              <w:rPr>
+                <w:b/>
+                <w:bCs/>
+              </w:rPr>
+              <w:t>CSE</w:t>
+            </w:r>
+          </w:p>
+        </w:tc>
+      </w:tr>
+      <w:tr>
+        <w:trPr>
+          <w:cnfStyle w:val="000000100000" w:firstRow="0" w:lastRow="0" w:firstColumn="0" w:lastColumn="0" w:oddVBand="0" w:evenVBand="0" w:oddHBand="1" w:evenHBand="0" w:firstRowFirstColumn="0" w:firstRowLastColumn="0" w:lastRowFirstColumn="0" w:lastRowLastColumn="0"/>
+          <w:trHeight w:val="364"/>
+        </w:trPr>
+        <w:tc>
+          <w:tcPr>
+            <w:cnfStyle w:val="001000000000" w:firstRow="0" w:lastRow="0" w:firstColumn="1" w:lastColumn="0" w:oddVBand="0" w:evenVBand="0" w:oddHBand="0" w:evenHBand="0" w:firstRowFirstColumn="0" w:firstRowLastColumn="0" w:lastRowFirstColumn="0" w:lastRowLastColumn="0"/>
+            <w:tcW w:w="0" w:type="auto"/>
+          </w:tcPr>
+          <w:p>
+            <w:pPr>
+              <w:jc w:val="center"/>
+            </w:pPr>
+            <w:r>
+              <w:t>George Safwat Wasfy</w:t>
+            </w:r>
+          </w:p>
+        </w:tc>
+        <w:tc>
+          <w:tcPr>
+            <w:tcW w:w="1704" w:type="dxa"/>
+          </w:tcPr>
+          <w:p>
+            <w:pPr>
+              <w:jc w:val="center"/>
+              <w:cnfStyle w:val="000000100000" w:firstRow="0" w:lastRow="0" w:firstColumn="0" w:lastColumn="0" w:oddVBand="0" w:evenVBand="0" w:oddHBand="1" w:evenHBand="0" w:firstRowFirstColumn="0" w:firstRowLastColumn="0" w:lastRowFirstColumn="0" w:lastRowLastColumn="0"/>
+              <w:rPr>
+                <w:b/>
+                <w:bCs/>
+              </w:rPr>
+            </w:pPr>
+            <w:r>
+              <w:rPr>
+                <w:b/>
+                <w:bCs/>
+              </w:rPr>
+              <w:t>2200365</w:t>
+            </w:r>
+          </w:p>
+        </w:tc>
+        <w:tc>
+          <w:tcPr>
+            <w:tcW w:w="2510" w:type="dxa"/>
+          </w:tcPr>
+          <w:p>
+            <w:pPr>
+              <w:jc w:val="center"/>
+              <w:cnfStyle w:val="000000100000" w:firstRow="0" w:lastRow="0" w:firstColumn="0" w:lastColumn="0" w:oddVBand="0" w:evenVBand="0" w:oddHBand="1" w:evenHBand="0" w:firstRowFirstColumn="0" w:firstRowLastColumn="0" w:lastRowFirstColumn="0" w:lastRowLastColumn="0"/>
+              <w:rPr>
+                <w:b/>
+                <w:bCs/>
+              </w:rPr>
+            </w:pPr>
+            <w:r>
+              <w:rPr>
+                <w:b/>
+                <w:bCs/>
+              </w:rPr>
+              <w:t>ECE</w:t>
+            </w:r>
+          </w:p>
+        </w:tc>
+      </w:tr>
+    </w:tbl>
     <w:p>
       <w:pPr>
         <w:sectPr>
@@ -160,14 +685,12 @@
           <w:docGrid w:linePitch="360"/>
         </w:sectPr>
       </w:pPr>
-      <w:r>
-        <w:br w:type="page"/>
-      </w:r>
     </w:p>
     <w:sdt>
       <w:sdtPr>
         <w:rPr>
           <w:rFonts w:asciiTheme="minorHAnsi" w:eastAsiaTheme="minorEastAsia" w:hAnsiTheme="minorHAnsi" w:cstheme="minorHAnsi"/>
+          <w:b w:val="0"/>
           <w:color w:val="auto"/>
           <w:sz w:val="28"/>
           <w:szCs w:val="28"/>
@@ -1834,12 +2357,13 @@
       <w:r>
         <w:t xml:space="preserve">Report </w:t>
       </w:r>
-      <w:proofErr w:type="spellStart"/>
+      <w:r>
+        <w:t>o</w:t>
+      </w:r>
       <w:r>
         <w:t>rganization</w:t>
       </w:r>
       <w:bookmarkEnd w:id="3"/>
-      <w:proofErr w:type="spellEnd"/>
     </w:p>
     <w:p>
       <w:pPr>
@@ -1880,21 +2404,7 @@
         <w:jc w:val="both"/>
       </w:pPr>
       <w:r>
-        <w:t>The DUT is an SPI Master Controller IP implemented in SystemVerilog. It is structured as a three-file hierarchy: spi_master.sv serves as a thin top-level wrapper instantiating two sub-blocks</w:t>
-      </w:r>
-      <w:r>
-        <w:t xml:space="preserve">; </w:t>
-      </w:r>
-      <w:r>
-        <w:t xml:space="preserve">apb_regfile.sv, which implements the APB v2.0 slave interface, nine programmable registers, </w:t>
-      </w:r>
-      <w:proofErr w:type="gramStart"/>
-      <w:r>
-        <w:t>TX</w:t>
-      </w:r>
-      <w:proofErr w:type="gramEnd"/>
-      <w:r>
-        <w:t xml:space="preserve"> and RX FIFOs (8 entries, 32-bit wide each), and interrupt logic; and spi_core.sv, which implements the SPI shift FSM, SCLK generation, and MOSI drive logic. </w:t>
+        <w:t xml:space="preserve">The DUT is an SPI Master Controller IP implemented in SystemVerilog. It is structured as a three-file hierarchy: spi_master.sv serves as a thin top-level wrapper instantiating two sub-blocks; apb_regfile.sv, which implements the APB v2.0 slave interface, nine programmable registers, TX and RX FIFOs (8 entries, 32-bit wide each), and interrupt logic; and spi_core.sv, which implements the SPI shift FSM, SCLK generation, and MOSI drive logic. </w:t>
       </w:r>
     </w:p>
     <w:p>
@@ -2079,13 +2589,7 @@
       </w:r>
       <w:proofErr w:type="spellEnd"/>
       <w:r>
-        <w:t xml:space="preserve"> and starts a transfer only when at least one SS lane is driven </w:t>
-      </w:r>
-      <w:r>
-        <w:t>low,</w:t>
-      </w:r>
-      <w:r>
-        <w:t xml:space="preserve"> and the TX FIFO is non-empty. Both the TX and RX FIFO pointers are reset not only on </w:t>
+        <w:t xml:space="preserve"> and starts a transfer only when at least one SS lane is driven low, and the TX FIFO is non-empty. Both the TX and RX FIFO pointers are reset not only on </w:t>
       </w:r>
       <w:proofErr w:type="spellStart"/>
       <w:r>
@@ -2277,15 +2781,39 @@
       </w:r>
       <w:proofErr w:type="gramEnd"/>
       <w:r>
-        <w:t xml:space="preserve">) must be called before every TX push, and </w:t>
+        <w:t xml:space="preserve">) must be called before every TX </w:t>
+      </w:r>
+      <w:proofErr w:type="gramStart"/>
+      <w:r>
+        <w:t>push, and</w:t>
+      </w:r>
+      <w:proofErr w:type="gramEnd"/>
+      <w:r>
+        <w:t xml:space="preserve"> </w:t>
       </w:r>
       <w:proofErr w:type="spellStart"/>
       <w:r>
-        <w:t>verify_rx_drain</w:t>
+        <w:t>verify_rx_</w:t>
+      </w:r>
+      <w:proofErr w:type="gramStart"/>
+      <w:r>
+        <w:t>drain</w:t>
       </w:r>
       <w:proofErr w:type="spellEnd"/>
       <w:r>
-        <w:t>() must be called after every RX read, maintaining queue balance at all times.</w:t>
+        <w:t>(</w:t>
+      </w:r>
+      <w:proofErr w:type="gramEnd"/>
+      <w:r>
+        <w:t xml:space="preserve">) must be called after every RX read, </w:t>
+      </w:r>
+      <w:proofErr w:type="gramStart"/>
+      <w:r>
+        <w:t>maintaining queue balance at all times</w:t>
+      </w:r>
+      <w:proofErr w:type="gramEnd"/>
+      <w:r>
+        <w:t>.</w:t>
       </w:r>
     </w:p>
     <w:p>
@@ -2339,13 +2867,7 @@
         <w:t>R18</w:t>
       </w:r>
       <w:r>
-        <w:t>, where a hardware event sets a bit on the exact same cycle that software writes a W1C clear</w:t>
-      </w:r>
-      <w:r>
-        <w:t xml:space="preserve">, </w:t>
-      </w:r>
-      <w:r>
-        <w:t xml:space="preserve">the specification requires the set to win. </w:t>
+        <w:t xml:space="preserve">, where a hardware event sets a bit on the exact same cycle that software writes a W1C clear, the specification requires the set to win. </w:t>
       </w:r>
     </w:p>
     <w:p>
@@ -2439,9 +2961,11 @@
       <w:r>
         <w:t xml:space="preserve">In summary: </w:t>
       </w:r>
+      <w:proofErr w:type="gramStart"/>
       <w:r>
         <w:t>Thirty Seven</w:t>
       </w:r>
+      <w:proofErr w:type="gramEnd"/>
       <w:r>
         <w:t xml:space="preserve"> SVA assertions are bound into the DUT hierarchy via </w:t>
       </w:r>
@@ -2455,7 +2979,15 @@
       </w:r>
       <w:proofErr w:type="gramEnd"/>
       <w:r>
-        <w:t>_dut.u_regfile</w:t>
+        <w:t>_</w:t>
+      </w:r>
+      <w:proofErr w:type="gramStart"/>
+      <w:r>
+        <w:t>dut.u</w:t>
+      </w:r>
+      <w:proofErr w:type="gramEnd"/>
+      <w:r>
+        <w:t>_regfile</w:t>
       </w:r>
       <w:proofErr w:type="spellEnd"/>
       <w:r>
@@ -2463,7 +2995,23 @@
       </w:r>
       <w:proofErr w:type="spellStart"/>
       <w:r>
-        <w:t>u_wrap.u_dut.u_core</w:t>
+        <w:t>u_</w:t>
+      </w:r>
+      <w:proofErr w:type="gramStart"/>
+      <w:r>
+        <w:t>wrap.u</w:t>
+      </w:r>
+      <w:proofErr w:type="gramEnd"/>
+      <w:r>
+        <w:t>_</w:t>
+      </w:r>
+      <w:proofErr w:type="gramStart"/>
+      <w:r>
+        <w:t>dut.u</w:t>
+      </w:r>
+      <w:proofErr w:type="gramEnd"/>
+      <w:r>
+        <w:t>_core</w:t>
       </w:r>
       <w:proofErr w:type="spellEnd"/>
       <w:r>
@@ -2585,7 +3133,15 @@
         <w:jc w:val="both"/>
       </w:pPr>
       <w:r>
-        <w:t xml:space="preserve">The regression is defined as 11 tests × 5 seeds = 55 total simulation runs, each redirected to a per-test per-seed log file under build/. After all runs complete, the regress target merges </w:t>
+        <w:t xml:space="preserve">The regression is defined as 11 tests × 5 seeds = 55 total simulation runs, each redirected to a per-test per-seed log file under build/. After </w:t>
+      </w:r>
+      <w:proofErr w:type="gramStart"/>
+      <w:r>
+        <w:t>all</w:t>
+      </w:r>
+      <w:proofErr w:type="gramEnd"/>
+      <w:r>
+        <w:t xml:space="preserve"> runs complete, the regress target merges </w:t>
       </w:r>
       <w:proofErr w:type="gramStart"/>
       <w:r>
@@ -2805,7 +3361,7 @@
 </file>
 
 <file path=word/endnotes.xml><?xml version="1.0" encoding="utf-8"?>
-<w:endnotes xmlns:wpc="http://schemas.microsoft.com/office/word/2010/wordprocessingCanvas" xmlns:cx="http://schemas.microsoft.com/office/drawing/2014/chartex" xmlns:cx1="http://schemas.microsoft.com/office/drawing/2015/9/8/chartex" xmlns:cx2="http://schemas.microsoft.com/office/drawing/2015/10/21/chartex" xmlns:cx3="http://schemas.microsoft.com/office/drawing/2016/5/9/chartex" xmlns:cx4="http://schemas.microsoft.com/office/drawing/2016/5/10/chartex" xmlns:cx5="http://schemas.microsoft.com/office/drawing/2016/5/11/chartex" xmlns:cx6="http://schemas.microsoft.com/office/drawing/2016/5/12/chartex" xmlns:cx7="http://schemas.microsoft.com/office/drawing/2016/5/13/chartex" xmlns:cx8="http://schemas.microsoft.com/office/drawing/2016/5/14/chartex" xmlns:mc="http://schemas.openxmlformats.org/markup-compatibility/2006" xmlns:aink="http://schemas.microsoft.com/office/drawing/2016/ink" xmlns:am3d="http://schemas.microsoft.com/office/drawing/2017/model3d" xmlns:o="urn:schemas-microsoft-com:office:office" xmlns:oel="http://schemas.microsoft.com/office/2019/extlst" xmlns:r="http://schemas.openxmlformats.org/officeDocument/2006/relationships" xmlns:m="http://schemas.openxmlformats.org/officeDocument/2006/math" xmlns:v="urn:schemas-microsoft-com:vml" xmlns:wp14="http://schemas.microsoft.com/office/word/2010/wordprocessingDrawing" xmlns:wp="http://schemas.openxmlformats.org/drawingml/2006/wordprocessingDrawing" xmlns:w10="urn:schemas-microsoft-com:office:word" xmlns:w="http://schemas.openxmlformats.org/wordprocessingml/2006/main" xmlns:w14="http://schemas.microsoft.com/office/word/2010/wordml" xmlns:w15="http://schemas.microsoft.com/office/word/2012/wordml" xmlns:w16cex="http://schemas.microsoft.com/office/word/2018/wordml/cex" xmlns:w16cid="http://schemas.microsoft.com/office/word/2016/wordml/cid" xmlns:w16="http://schemas.microsoft.com/office/word/2018/wordml" xmlns:w16du="http://schemas.microsoft.com/office/word/2023/wordml/word16du" xmlns:w16sdtdh="http://schemas.microsoft.com/office/word/2020/wordml/sdtdatahash" xmlns:w16se="http://schemas.microsoft.com/office/word/2015/wordml/symex" xmlns:wpg="http://schemas.microsoft.com/office/word/2010/wordprocessingGroup" xmlns:wpi="http://schemas.microsoft.com/office/word/2010/wordprocessingInk" xmlns:wne="http://schemas.microsoft.com/office/word/2006/wordml" xmlns:wps="http://schemas.microsoft.com/office/word/2010/wordprocessingShape" mc:Ignorable="w14 w15 w16se w16cid w16 w16cex w16sdtdh wp14">
+<w:endnotes xmlns:wpc="http://schemas.microsoft.com/office/word/2010/wordprocessingCanvas" xmlns:cx="http://schemas.microsoft.com/office/drawing/2014/chartex" xmlns:cx1="http://schemas.microsoft.com/office/drawing/2015/9/8/chartex" xmlns:cx2="http://schemas.microsoft.com/office/drawing/2015/10/21/chartex" xmlns:cx3="http://schemas.microsoft.com/office/drawing/2016/5/9/chartex" xmlns:cx4="http://schemas.microsoft.com/office/drawing/2016/5/10/chartex" xmlns:cx5="http://schemas.microsoft.com/office/drawing/2016/5/11/chartex" xmlns:cx6="http://schemas.microsoft.com/office/drawing/2016/5/12/chartex" xmlns:cx7="http://schemas.microsoft.com/office/drawing/2016/5/13/chartex" xmlns:cx8="http://schemas.microsoft.com/office/drawing/2016/5/14/chartex" xmlns:mc="http://schemas.openxmlformats.org/markup-compatibility/2006" xmlns:aink="http://schemas.microsoft.com/office/drawing/2016/ink" xmlns:am3d="http://schemas.microsoft.com/office/drawing/2017/model3d" xmlns:o="urn:schemas-microsoft-com:office:office" xmlns:oel="http://schemas.microsoft.com/office/2019/extlst" xmlns:r="http://schemas.openxmlformats.org/officeDocument/2006/relationships" xmlns:m="http://schemas.openxmlformats.org/officeDocument/2006/math" xmlns:v="urn:schemas-microsoft-com:vml" xmlns:wp14="http://schemas.microsoft.com/office/word/2010/wordprocessingDrawing" xmlns:wp="http://schemas.openxmlformats.org/drawingml/2006/wordprocessingDrawing" xmlns:w10="urn:schemas-microsoft-com:office:word" xmlns:w="http://schemas.openxmlformats.org/wordprocessingml/2006/main" xmlns:w14="http://schemas.microsoft.com/office/word/2010/wordml" xmlns:w15="http://schemas.microsoft.com/office/word/2012/wordml" xmlns:w16cex="http://schemas.microsoft.com/office/word/2018/wordml/cex" xmlns:w16cid="http://schemas.microsoft.com/office/word/2016/wordml/cid" xmlns:w16="http://schemas.microsoft.com/office/word/2018/wordml" xmlns:w16du="http://schemas.microsoft.com/office/word/2023/wordml/word16du" xmlns:w16sdtdh="http://schemas.microsoft.com/office/word/2020/wordml/sdtdatahash" xmlns:w16sdtfl="http://schemas.microsoft.com/office/word/2024/wordml/sdtformatlock" xmlns:w16se="http://schemas.microsoft.com/office/word/2015/wordml/symex" xmlns:wpg="http://schemas.microsoft.com/office/word/2010/wordprocessingGroup" xmlns:wpi="http://schemas.microsoft.com/office/word/2010/wordprocessingInk" xmlns:wne="http://schemas.microsoft.com/office/word/2006/wordml" xmlns:wps="http://schemas.microsoft.com/office/word/2010/wordprocessingShape" mc:Ignorable="w14 w15 w16se w16cid w16 w16cex w16sdtdh w16sdtfl w16du wp14">
   <w:endnote w:type="separator" w:id="-1">
     <w:p>
       <w:pPr>
@@ -2830,7 +3386,7 @@
 </file>
 
 <file path=word/footer1.xml><?xml version="1.0" encoding="utf-8"?>
-<w:ftr xmlns:wpc="http://schemas.microsoft.com/office/word/2010/wordprocessingCanvas" xmlns:cx="http://schemas.microsoft.com/office/drawing/2014/chartex" xmlns:cx1="http://schemas.microsoft.com/office/drawing/2015/9/8/chartex" xmlns:cx2="http://schemas.microsoft.com/office/drawing/2015/10/21/chartex" xmlns:cx3="http://schemas.microsoft.com/office/drawing/2016/5/9/chartex" xmlns:cx4="http://schemas.microsoft.com/office/drawing/2016/5/10/chartex" xmlns:cx5="http://schemas.microsoft.com/office/drawing/2016/5/11/chartex" xmlns:cx6="http://schemas.microsoft.com/office/drawing/2016/5/12/chartex" xmlns:cx7="http://schemas.microsoft.com/office/drawing/2016/5/13/chartex" xmlns:cx8="http://schemas.microsoft.com/office/drawing/2016/5/14/chartex" xmlns:mc="http://schemas.openxmlformats.org/markup-compatibility/2006" xmlns:aink="http://schemas.microsoft.com/office/drawing/2016/ink" xmlns:am3d="http://schemas.microsoft.com/office/drawing/2017/model3d" xmlns:o="urn:schemas-microsoft-com:office:office" xmlns:oel="http://schemas.microsoft.com/office/2019/extlst" xmlns:r="http://schemas.openxmlformats.org/officeDocument/2006/relationships" xmlns:m="http://schemas.openxmlformats.org/officeDocument/2006/math" xmlns:v="urn:schemas-microsoft-com:vml" xmlns:wp14="http://schemas.microsoft.com/office/word/2010/wordprocessingDrawing" xmlns:wp="http://schemas.openxmlformats.org/drawingml/2006/wordprocessingDrawing" xmlns:w10="urn:schemas-microsoft-com:office:word" xmlns:w="http://schemas.openxmlformats.org/wordprocessingml/2006/main" xmlns:w14="http://schemas.microsoft.com/office/word/2010/wordml" xmlns:w15="http://schemas.microsoft.com/office/word/2012/wordml" xmlns:w16cex="http://schemas.microsoft.com/office/word/2018/wordml/cex" xmlns:w16cid="http://schemas.microsoft.com/office/word/2016/wordml/cid" xmlns:w16="http://schemas.microsoft.com/office/word/2018/wordml" xmlns:w16du="http://schemas.microsoft.com/office/word/2023/wordml/word16du" xmlns:w16sdtdh="http://schemas.microsoft.com/office/word/2020/wordml/sdtdatahash" xmlns:w16se="http://schemas.microsoft.com/office/word/2015/wordml/symex" xmlns:wpg="http://schemas.microsoft.com/office/word/2010/wordprocessingGroup" xmlns:wpi="http://schemas.microsoft.com/office/word/2010/wordprocessingInk" xmlns:wne="http://schemas.microsoft.com/office/word/2006/wordml" xmlns:wps="http://schemas.microsoft.com/office/word/2010/wordprocessingShape" mc:Ignorable="w14 w15 w16se w16cid w16 w16cex w16sdtdh wp14">
+<w:ftr xmlns:wpc="http://schemas.microsoft.com/office/word/2010/wordprocessingCanvas" xmlns:cx="http://schemas.microsoft.com/office/drawing/2014/chartex" xmlns:cx1="http://schemas.microsoft.com/office/drawing/2015/9/8/chartex" xmlns:cx2="http://schemas.microsoft.com/office/drawing/2015/10/21/chartex" xmlns:cx3="http://schemas.microsoft.com/office/drawing/2016/5/9/chartex" xmlns:cx4="http://schemas.microsoft.com/office/drawing/2016/5/10/chartex" xmlns:cx5="http://schemas.microsoft.com/office/drawing/2016/5/11/chartex" xmlns:cx6="http://schemas.microsoft.com/office/drawing/2016/5/12/chartex" xmlns:cx7="http://schemas.microsoft.com/office/drawing/2016/5/13/chartex" xmlns:cx8="http://schemas.microsoft.com/office/drawing/2016/5/14/chartex" xmlns:mc="http://schemas.openxmlformats.org/markup-compatibility/2006" xmlns:aink="http://schemas.microsoft.com/office/drawing/2016/ink" xmlns:am3d="http://schemas.microsoft.com/office/drawing/2017/model3d" xmlns:o="urn:schemas-microsoft-com:office:office" xmlns:oel="http://schemas.microsoft.com/office/2019/extlst" xmlns:r="http://schemas.openxmlformats.org/officeDocument/2006/relationships" xmlns:m="http://schemas.openxmlformats.org/officeDocument/2006/math" xmlns:v="urn:schemas-microsoft-com:vml" xmlns:wp14="http://schemas.microsoft.com/office/word/2010/wordprocessingDrawing" xmlns:wp="http://schemas.openxmlformats.org/drawingml/2006/wordprocessingDrawing" xmlns:w10="urn:schemas-microsoft-com:office:word" xmlns:w="http://schemas.openxmlformats.org/wordprocessingml/2006/main" xmlns:w14="http://schemas.microsoft.com/office/word/2010/wordml" xmlns:w15="http://schemas.microsoft.com/office/word/2012/wordml" xmlns:w16cex="http://schemas.microsoft.com/office/word/2018/wordml/cex" xmlns:w16cid="http://schemas.microsoft.com/office/word/2016/wordml/cid" xmlns:w16="http://schemas.microsoft.com/office/word/2018/wordml" xmlns:w16du="http://schemas.microsoft.com/office/word/2023/wordml/word16du" xmlns:w16sdtdh="http://schemas.microsoft.com/office/word/2020/wordml/sdtdatahash" xmlns:w16sdtfl="http://schemas.microsoft.com/office/word/2024/wordml/sdtformatlock" xmlns:w16se="http://schemas.microsoft.com/office/word/2015/wordml/symex" xmlns:wpg="http://schemas.microsoft.com/office/word/2010/wordprocessingGroup" xmlns:wpi="http://schemas.microsoft.com/office/word/2010/wordprocessingInk" xmlns:wne="http://schemas.microsoft.com/office/word/2006/wordml" xmlns:wps="http://schemas.microsoft.com/office/word/2010/wordprocessingShape" mc:Ignorable="w14 w15 w16se w16cid w16 w16cex w16sdtdh w16sdtfl w16du wp14">
   <w:sdt>
     <w:sdtPr>
       <w:id w:val="-1356101"/>
@@ -2883,7 +3439,7 @@
 </file>
 
 <file path=word/footer2.xml><?xml version="1.0" encoding="utf-8"?>
-<w:ftr xmlns:wpc="http://schemas.microsoft.com/office/word/2010/wordprocessingCanvas" xmlns:cx="http://schemas.microsoft.com/office/drawing/2014/chartex" xmlns:cx1="http://schemas.microsoft.com/office/drawing/2015/9/8/chartex" xmlns:cx2="http://schemas.microsoft.com/office/drawing/2015/10/21/chartex" xmlns:cx3="http://schemas.microsoft.com/office/drawing/2016/5/9/chartex" xmlns:cx4="http://schemas.microsoft.com/office/drawing/2016/5/10/chartex" xmlns:cx5="http://schemas.microsoft.com/office/drawing/2016/5/11/chartex" xmlns:cx6="http://schemas.microsoft.com/office/drawing/2016/5/12/chartex" xmlns:cx7="http://schemas.microsoft.com/office/drawing/2016/5/13/chartex" xmlns:cx8="http://schemas.microsoft.com/office/drawing/2016/5/14/chartex" xmlns:mc="http://schemas.openxmlformats.org/markup-compatibility/2006" xmlns:aink="http://schemas.microsoft.com/office/drawing/2016/ink" xmlns:am3d="http://schemas.microsoft.com/office/drawing/2017/model3d" xmlns:o="urn:schemas-microsoft-com:office:office" xmlns:oel="http://schemas.microsoft.com/office/2019/extlst" xmlns:r="http://schemas.openxmlformats.org/officeDocument/2006/relationships" xmlns:m="http://schemas.openxmlformats.org/officeDocument/2006/math" xmlns:v="urn:schemas-microsoft-com:vml" xmlns:wp14="http://schemas.microsoft.com/office/word/2010/wordprocessingDrawing" xmlns:wp="http://schemas.openxmlformats.org/drawingml/2006/wordprocessingDrawing" xmlns:w10="urn:schemas-microsoft-com:office:word" xmlns:w="http://schemas.openxmlformats.org/wordprocessingml/2006/main" xmlns:w14="http://schemas.microsoft.com/office/word/2010/wordml" xmlns:w15="http://schemas.microsoft.com/office/word/2012/wordml" xmlns:w16cex="http://schemas.microsoft.com/office/word/2018/wordml/cex" xmlns:w16cid="http://schemas.microsoft.com/office/word/2016/wordml/cid" xmlns:w16="http://schemas.microsoft.com/office/word/2018/wordml" xmlns:w16du="http://schemas.microsoft.com/office/word/2023/wordml/word16du" xmlns:w16sdtdh="http://schemas.microsoft.com/office/word/2020/wordml/sdtdatahash" xmlns:w16se="http://schemas.microsoft.com/office/word/2015/wordml/symex" xmlns:wpg="http://schemas.microsoft.com/office/word/2010/wordprocessingGroup" xmlns:wpi="http://schemas.microsoft.com/office/word/2010/wordprocessingInk" xmlns:wne="http://schemas.microsoft.com/office/word/2006/wordml" xmlns:wps="http://schemas.microsoft.com/office/word/2010/wordprocessingShape" mc:Ignorable="w14 w15 w16se w16cid w16 w16cex w16sdtdh wp14">
+<w:ftr xmlns:wpc="http://schemas.microsoft.com/office/word/2010/wordprocessingCanvas" xmlns:cx="http://schemas.microsoft.com/office/drawing/2014/chartex" xmlns:cx1="http://schemas.microsoft.com/office/drawing/2015/9/8/chartex" xmlns:cx2="http://schemas.microsoft.com/office/drawing/2015/10/21/chartex" xmlns:cx3="http://schemas.microsoft.com/office/drawing/2016/5/9/chartex" xmlns:cx4="http://schemas.microsoft.com/office/drawing/2016/5/10/chartex" xmlns:cx5="http://schemas.microsoft.com/office/drawing/2016/5/11/chartex" xmlns:cx6="http://schemas.microsoft.com/office/drawing/2016/5/12/chartex" xmlns:cx7="http://schemas.microsoft.com/office/drawing/2016/5/13/chartex" xmlns:cx8="http://schemas.microsoft.com/office/drawing/2016/5/14/chartex" xmlns:mc="http://schemas.openxmlformats.org/markup-compatibility/2006" xmlns:aink="http://schemas.microsoft.com/office/drawing/2016/ink" xmlns:am3d="http://schemas.microsoft.com/office/drawing/2017/model3d" xmlns:o="urn:schemas-microsoft-com:office:office" xmlns:oel="http://schemas.microsoft.com/office/2019/extlst" xmlns:r="http://schemas.openxmlformats.org/officeDocument/2006/relationships" xmlns:m="http://schemas.openxmlformats.org/officeDocument/2006/math" xmlns:v="urn:schemas-microsoft-com:vml" xmlns:wp14="http://schemas.microsoft.com/office/word/2010/wordprocessingDrawing" xmlns:wp="http://schemas.openxmlformats.org/drawingml/2006/wordprocessingDrawing" xmlns:w10="urn:schemas-microsoft-com:office:word" xmlns:w="http://schemas.openxmlformats.org/wordprocessingml/2006/main" xmlns:w14="http://schemas.microsoft.com/office/word/2010/wordml" xmlns:w15="http://schemas.microsoft.com/office/word/2012/wordml" xmlns:w16cex="http://schemas.microsoft.com/office/word/2018/wordml/cex" xmlns:w16cid="http://schemas.microsoft.com/office/word/2016/wordml/cid" xmlns:w16="http://schemas.microsoft.com/office/word/2018/wordml" xmlns:w16du="http://schemas.microsoft.com/office/word/2023/wordml/word16du" xmlns:w16sdtdh="http://schemas.microsoft.com/office/word/2020/wordml/sdtdatahash" xmlns:w16sdtfl="http://schemas.microsoft.com/office/word/2024/wordml/sdtformatlock" xmlns:w16se="http://schemas.microsoft.com/office/word/2015/wordml/symex" xmlns:wpg="http://schemas.microsoft.com/office/word/2010/wordprocessingGroup" xmlns:wpi="http://schemas.microsoft.com/office/word/2010/wordprocessingInk" xmlns:wne="http://schemas.microsoft.com/office/word/2006/wordml" xmlns:wps="http://schemas.microsoft.com/office/word/2010/wordprocessingShape" mc:Ignorable="w14 w15 w16se w16cid w16 w16cex w16sdtdh w16sdtfl w16du wp14">
   <w:sdt>
     <w:sdtPr>
       <w:id w:val="1205205134"/>
@@ -2937,7 +3493,7 @@
 </file>
 
 <file path=word/footnotes.xml><?xml version="1.0" encoding="utf-8"?>
-<w:footnotes xmlns:wpc="http://schemas.microsoft.com/office/word/2010/wordprocessingCanvas" xmlns:cx="http://schemas.microsoft.com/office/drawing/2014/chartex" xmlns:cx1="http://schemas.microsoft.com/office/drawing/2015/9/8/chartex" xmlns:cx2="http://schemas.microsoft.com/office/drawing/2015/10/21/chartex" xmlns:cx3="http://schemas.microsoft.com/office/drawing/2016/5/9/chartex" xmlns:cx4="http://schemas.microsoft.com/office/drawing/2016/5/10/chartex" xmlns:cx5="http://schemas.microsoft.com/office/drawing/2016/5/11/chartex" xmlns:cx6="http://schemas.microsoft.com/office/drawing/2016/5/12/chartex" xmlns:cx7="http://schemas.microsoft.com/office/drawing/2016/5/13/chartex" xmlns:cx8="http://schemas.microsoft.com/office/drawing/2016/5/14/chartex" xmlns:mc="http://schemas.openxmlformats.org/markup-compatibility/2006" xmlns:aink="http://schemas.microsoft.com/office/drawing/2016/ink" xmlns:am3d="http://schemas.microsoft.com/office/drawing/2017/model3d" xmlns:o="urn:schemas-microsoft-com:office:office" xmlns:oel="http://schemas.microsoft.com/office/2019/extlst" xmlns:r="http://schemas.openxmlformats.org/officeDocument/2006/relationships" xmlns:m="http://schemas.openxmlformats.org/officeDocument/2006/math" xmlns:v="urn:schemas-microsoft-com:vml" xmlns:wp14="http://schemas.microsoft.com/office/word/2010/wordprocessingDrawing" xmlns:wp="http://schemas.openxmlformats.org/drawingml/2006/wordprocessingDrawing" xmlns:w10="urn:schemas-microsoft-com:office:word" xmlns:w="http://schemas.openxmlformats.org/wordprocessingml/2006/main" xmlns:w14="http://schemas.microsoft.com/office/word/2010/wordml" xmlns:w15="http://schemas.microsoft.com/office/word/2012/wordml" xmlns:w16cex="http://schemas.microsoft.com/office/word/2018/wordml/cex" xmlns:w16cid="http://schemas.microsoft.com/office/word/2016/wordml/cid" xmlns:w16="http://schemas.microsoft.com/office/word/2018/wordml" xmlns:w16du="http://schemas.microsoft.com/office/word/2023/wordml/word16du" xmlns:w16sdtdh="http://schemas.microsoft.com/office/word/2020/wordml/sdtdatahash" xmlns:w16se="http://schemas.microsoft.com/office/word/2015/wordml/symex" xmlns:wpg="http://schemas.microsoft.com/office/word/2010/wordprocessingGroup" xmlns:wpi="http://schemas.microsoft.com/office/word/2010/wordprocessingInk" xmlns:wne="http://schemas.microsoft.com/office/word/2006/wordml" xmlns:wps="http://schemas.microsoft.com/office/word/2010/wordprocessingShape" mc:Ignorable="w14 w15 w16se w16cid w16 w16cex w16sdtdh wp14">
+<w:footnotes xmlns:wpc="http://schemas.microsoft.com/office/word/2010/wordprocessingCanvas" xmlns:cx="http://schemas.microsoft.com/office/drawing/2014/chartex" xmlns:cx1="http://schemas.microsoft.com/office/drawing/2015/9/8/chartex" xmlns:cx2="http://schemas.microsoft.com/office/drawing/2015/10/21/chartex" xmlns:cx3="http://schemas.microsoft.com/office/drawing/2016/5/9/chartex" xmlns:cx4="http://schemas.microsoft.com/office/drawing/2016/5/10/chartex" xmlns:cx5="http://schemas.microsoft.com/office/drawing/2016/5/11/chartex" xmlns:cx6="http://schemas.microsoft.com/office/drawing/2016/5/12/chartex" xmlns:cx7="http://schemas.microsoft.com/office/drawing/2016/5/13/chartex" xmlns:cx8="http://schemas.microsoft.com/office/drawing/2016/5/14/chartex" xmlns:mc="http://schemas.openxmlformats.org/markup-compatibility/2006" xmlns:aink="http://schemas.microsoft.com/office/drawing/2016/ink" xmlns:am3d="http://schemas.microsoft.com/office/drawing/2017/model3d" xmlns:o="urn:schemas-microsoft-com:office:office" xmlns:oel="http://schemas.microsoft.com/office/2019/extlst" xmlns:r="http://schemas.openxmlformats.org/officeDocument/2006/relationships" xmlns:m="http://schemas.openxmlformats.org/officeDocument/2006/math" xmlns:v="urn:schemas-microsoft-com:vml" xmlns:wp14="http://schemas.microsoft.com/office/word/2010/wordprocessingDrawing" xmlns:wp="http://schemas.openxmlformats.org/drawingml/2006/wordprocessingDrawing" xmlns:w10="urn:schemas-microsoft-com:office:word" xmlns:w="http://schemas.openxmlformats.org/wordprocessingml/2006/main" xmlns:w14="http://schemas.microsoft.com/office/word/2010/wordml" xmlns:w15="http://schemas.microsoft.com/office/word/2012/wordml" xmlns:w16cex="http://schemas.microsoft.com/office/word/2018/wordml/cex" xmlns:w16cid="http://schemas.microsoft.com/office/word/2016/wordml/cid" xmlns:w16="http://schemas.microsoft.com/office/word/2018/wordml" xmlns:w16du="http://schemas.microsoft.com/office/word/2023/wordml/word16du" xmlns:w16sdtdh="http://schemas.microsoft.com/office/word/2020/wordml/sdtdatahash" xmlns:w16sdtfl="http://schemas.microsoft.com/office/word/2024/wordml/sdtformatlock" xmlns:w16se="http://schemas.microsoft.com/office/word/2015/wordml/symex" xmlns:wpg="http://schemas.microsoft.com/office/word/2010/wordprocessingGroup" xmlns:wpi="http://schemas.microsoft.com/office/word/2010/wordprocessingInk" xmlns:wne="http://schemas.microsoft.com/office/word/2006/wordml" xmlns:wps="http://schemas.microsoft.com/office/word/2010/wordprocessingShape" mc:Ignorable="w14 w15 w16se w16cid w16 w16cex w16sdtdh w16sdtfl w16du wp14">
   <w:footnote w:type="separator" w:id="-1">
     <w:p>
       <w:pPr>
@@ -2962,7 +3518,7 @@
 </file>
 
 <file path=word/numbering.xml><?xml version="1.0" encoding="utf-8"?>
-<w:numbering xmlns:wpc="http://schemas.microsoft.com/office/word/2010/wordprocessingCanvas" xmlns:cx="http://schemas.microsoft.com/office/drawing/2014/chartex" xmlns:cx1="http://schemas.microsoft.com/office/drawing/2015/9/8/chartex" xmlns:cx2="http://schemas.microsoft.com/office/drawing/2015/10/21/chartex" xmlns:cx3="http://schemas.microsoft.com/office/drawing/2016/5/9/chartex" xmlns:cx4="http://schemas.microsoft.com/office/drawing/2016/5/10/chartex" xmlns:cx5="http://schemas.microsoft.com/office/drawing/2016/5/11/chartex" xmlns:cx6="http://schemas.microsoft.com/office/drawing/2016/5/12/chartex" xmlns:cx7="http://schemas.microsoft.com/office/drawing/2016/5/13/chartex" xmlns:cx8="http://schemas.microsoft.com/office/drawing/2016/5/14/chartex" xmlns:mc="http://schemas.openxmlformats.org/markup-compatibility/2006" xmlns:aink="http://schemas.microsoft.com/office/drawing/2016/ink" xmlns:am3d="http://schemas.microsoft.com/office/drawing/2017/model3d" xmlns:o="urn:schemas-microsoft-com:office:office" xmlns:oel="http://schemas.microsoft.com/office/2019/extlst" xmlns:r="http://schemas.openxmlformats.org/officeDocument/2006/relationships" xmlns:m="http://schemas.openxmlformats.org/officeDocument/2006/math" xmlns:v="urn:schemas-microsoft-com:vml" xmlns:wp14="http://schemas.microsoft.com/office/word/2010/wordprocessingDrawing" xmlns:wp="http://schemas.openxmlformats.org/drawingml/2006/wordprocessingDrawing" xmlns:w10="urn:schemas-microsoft-com:office:word" xmlns:w="http://schemas.openxmlformats.org/wordprocessingml/2006/main" xmlns:w14="http://schemas.microsoft.com/office/word/2010/wordml" xmlns:w15="http://schemas.microsoft.com/office/word/2012/wordml" xmlns:w16cex="http://schemas.microsoft.com/office/word/2018/wordml/cex" xmlns:w16cid="http://schemas.microsoft.com/office/word/2016/wordml/cid" xmlns:w16="http://schemas.microsoft.com/office/word/2018/wordml" xmlns:w16du="http://schemas.microsoft.com/office/word/2023/wordml/word16du" xmlns:w16sdtdh="http://schemas.microsoft.com/office/word/2020/wordml/sdtdatahash" xmlns:w16se="http://schemas.microsoft.com/office/word/2015/wordml/symex" xmlns:wpg="http://schemas.microsoft.com/office/word/2010/wordprocessingGroup" xmlns:wpi="http://schemas.microsoft.com/office/word/2010/wordprocessingInk" xmlns:wne="http://schemas.microsoft.com/office/word/2006/wordml" xmlns:wps="http://schemas.microsoft.com/office/word/2010/wordprocessingShape" mc:Ignorable="w14 w15 w16se w16cid w16 w16cex w16sdtdh wp14">
+<w:numbering xmlns:wpc="http://schemas.microsoft.com/office/word/2010/wordprocessingCanvas" xmlns:cx="http://schemas.microsoft.com/office/drawing/2014/chartex" xmlns:cx1="http://schemas.microsoft.com/office/drawing/2015/9/8/chartex" xmlns:cx2="http://schemas.microsoft.com/office/drawing/2015/10/21/chartex" xmlns:cx3="http://schemas.microsoft.com/office/drawing/2016/5/9/chartex" xmlns:cx4="http://schemas.microsoft.com/office/drawing/2016/5/10/chartex" xmlns:cx5="http://schemas.microsoft.com/office/drawing/2016/5/11/chartex" xmlns:cx6="http://schemas.microsoft.com/office/drawing/2016/5/12/chartex" xmlns:cx7="http://schemas.microsoft.com/office/drawing/2016/5/13/chartex" xmlns:cx8="http://schemas.microsoft.com/office/drawing/2016/5/14/chartex" xmlns:mc="http://schemas.openxmlformats.org/markup-compatibility/2006" xmlns:aink="http://schemas.microsoft.com/office/drawing/2016/ink" xmlns:am3d="http://schemas.microsoft.com/office/drawing/2017/model3d" xmlns:o="urn:schemas-microsoft-com:office:office" xmlns:oel="http://schemas.microsoft.com/office/2019/extlst" xmlns:r="http://schemas.openxmlformats.org/officeDocument/2006/relationships" xmlns:m="http://schemas.openxmlformats.org/officeDocument/2006/math" xmlns:v="urn:schemas-microsoft-com:vml" xmlns:wp14="http://schemas.microsoft.com/office/word/2010/wordprocessingDrawing" xmlns:wp="http://schemas.openxmlformats.org/drawingml/2006/wordprocessingDrawing" xmlns:w10="urn:schemas-microsoft-com:office:word" xmlns:w="http://schemas.openxmlformats.org/wordprocessingml/2006/main" xmlns:w14="http://schemas.microsoft.com/office/word/2010/wordml" xmlns:w15="http://schemas.microsoft.com/office/word/2012/wordml" xmlns:w16cex="http://schemas.microsoft.com/office/word/2018/wordml/cex" xmlns:w16cid="http://schemas.microsoft.com/office/word/2016/wordml/cid" xmlns:w16="http://schemas.microsoft.com/office/word/2018/wordml" xmlns:w16du="http://schemas.microsoft.com/office/word/2023/wordml/word16du" xmlns:w16sdtdh="http://schemas.microsoft.com/office/word/2020/wordml/sdtdatahash" xmlns:w16sdtfl="http://schemas.microsoft.com/office/word/2024/wordml/sdtformatlock" xmlns:w16se="http://schemas.microsoft.com/office/word/2015/wordml/symex" xmlns:wpg="http://schemas.microsoft.com/office/word/2010/wordprocessingGroup" xmlns:wpi="http://schemas.microsoft.com/office/word/2010/wordprocessingInk" xmlns:wne="http://schemas.microsoft.com/office/word/2006/wordml" xmlns:wps="http://schemas.microsoft.com/office/word/2010/wordprocessingShape" mc:Ignorable="w14 w15 w16se w16cid w16 w16cex w16sdtdh w16sdtfl w16du wp14">
   <w:abstractNum w:abstractNumId="0" w15:restartNumberingAfterBreak="0">
     <w:nsid w:val="00B60758"/>
     <w:multiLevelType w:val="multilevel"/>
@@ -3713,7 +4269,7 @@
 </file>
 
 <file path=word/styles.xml><?xml version="1.0" encoding="utf-8"?>
-<w:styles xmlns:mc="http://schemas.openxmlformats.org/markup-compatibility/2006" xmlns:r="http://schemas.openxmlformats.org/officeDocument/2006/relationships" xmlns:w="http://schemas.openxmlformats.org/wordprocessingml/2006/main" xmlns:w14="http://schemas.microsoft.com/office/word/2010/wordml" xmlns:w15="http://schemas.microsoft.com/office/word/2012/wordml" xmlns:w16cex="http://schemas.microsoft.com/office/word/2018/wordml/cex" xmlns:w16cid="http://schemas.microsoft.com/office/word/2016/wordml/cid" xmlns:w16="http://schemas.microsoft.com/office/word/2018/wordml" xmlns:w16sdtdh="http://schemas.microsoft.com/office/word/2020/wordml/sdtdatahash" xmlns:w16se="http://schemas.microsoft.com/office/word/2015/wordml/symex" mc:Ignorable="w14 w15 w16se w16cid w16 w16cex w16sdtdh">
+<w:styles xmlns:mc="http://schemas.openxmlformats.org/markup-compatibility/2006" xmlns:r="http://schemas.openxmlformats.org/officeDocument/2006/relationships" xmlns:w="http://schemas.openxmlformats.org/wordprocessingml/2006/main" xmlns:w14="http://schemas.microsoft.com/office/word/2010/wordml" xmlns:w15="http://schemas.microsoft.com/office/word/2012/wordml" xmlns:w16cex="http://schemas.microsoft.com/office/word/2018/wordml/cex" xmlns:w16cid="http://schemas.microsoft.com/office/word/2016/wordml/cid" xmlns:w16="http://schemas.microsoft.com/office/word/2018/wordml" xmlns:w16du="http://schemas.microsoft.com/office/word/2023/wordml/word16du" xmlns:w16sdtdh="http://schemas.microsoft.com/office/word/2020/wordml/sdtdatahash" xmlns:w16sdtfl="http://schemas.microsoft.com/office/word/2024/wordml/sdtformatlock" xmlns:w16se="http://schemas.microsoft.com/office/word/2015/wordml/symex" mc:Ignorable="w14 w15 w16se w16cid w16 w16cex w16sdtdh w16sdtfl w16du">
   <w:docDefaults>
     <w:rPrDefault>
       <w:rPr>
@@ -4689,623 +5245,102 @@
       <w:ind w:left="240"/>
     </w:pPr>
   </w:style>
-</w:styles>
-</file>
-
-<file path=word/glossary/document.xml><?xml version="1.0" encoding="utf-8"?>
-<w:glossaryDocument xmlns:wpc="http://schemas.microsoft.com/office/word/2010/wordprocessingCanvas" xmlns:cx="http://schemas.microsoft.com/office/drawing/2014/chartex" xmlns:cx1="http://schemas.microsoft.com/office/drawing/2015/9/8/chartex" xmlns:cx2="http://schemas.microsoft.com/office/drawing/2015/10/21/chartex" xmlns:cx3="http://schemas.microsoft.com/office/drawing/2016/5/9/chartex" xmlns:cx4="http://schemas.microsoft.com/office/drawing/2016/5/10/chartex" xmlns:cx5="http://schemas.microsoft.com/office/drawing/2016/5/11/chartex" xmlns:cx6="http://schemas.microsoft.com/office/drawing/2016/5/12/chartex" xmlns:cx7="http://schemas.microsoft.com/office/drawing/2016/5/13/chartex" xmlns:cx8="http://schemas.microsoft.com/office/drawing/2016/5/14/chartex" xmlns:mc="http://schemas.openxmlformats.org/markup-compatibility/2006" xmlns:aink="http://schemas.microsoft.com/office/drawing/2016/ink" xmlns:am3d="http://schemas.microsoft.com/office/drawing/2017/model3d" xmlns:o="urn:schemas-microsoft-com:office:office" xmlns:oel="http://schemas.microsoft.com/office/2019/extlst" xmlns:r="http://schemas.openxmlformats.org/officeDocument/2006/relationships" xmlns:m="http://schemas.openxmlformats.org/officeDocument/2006/math" xmlns:v="urn:schemas-microsoft-com:vml" xmlns:wp14="http://schemas.microsoft.com/office/word/2010/wordprocessingDrawing" xmlns:wp="http://schemas.openxmlformats.org/drawingml/2006/wordprocessingDrawing" xmlns:w10="urn:schemas-microsoft-com:office:word" xmlns:w="http://schemas.openxmlformats.org/wordprocessingml/2006/main" xmlns:w14="http://schemas.microsoft.com/office/word/2010/wordml" xmlns:w15="http://schemas.microsoft.com/office/word/2012/wordml" xmlns:w16cex="http://schemas.microsoft.com/office/word/2018/wordml/cex" xmlns:w16cid="http://schemas.microsoft.com/office/word/2016/wordml/cid" xmlns:w16="http://schemas.microsoft.com/office/word/2018/wordml" xmlns:w16du="http://schemas.microsoft.com/office/word/2023/wordml/word16du" xmlns:w16sdtdh="http://schemas.microsoft.com/office/word/2020/wordml/sdtdatahash" xmlns:w16se="http://schemas.microsoft.com/office/word/2015/wordml/symex" xmlns:wpg="http://schemas.microsoft.com/office/word/2010/wordprocessingGroup" xmlns:wpi="http://schemas.microsoft.com/office/word/2010/wordprocessingInk" xmlns:wne="http://schemas.microsoft.com/office/word/2006/wordml" xmlns:wps="http://schemas.microsoft.com/office/word/2010/wordprocessingShape" mc:Ignorable="w14 w15 w16se w16cid w16 w16cex w16sdtdh wp14">
-  <w:docParts>
-    <w:docPart>
-      <w:docPartPr>
-        <w:name w:val="E50EBC09E417438CB8AA5BB7AAE1017C"/>
-        <w:category>
-          <w:name w:val="General"/>
-          <w:gallery w:val="placeholder"/>
-        </w:category>
-        <w:types>
-          <w:type w:val="bbPlcHdr"/>
-        </w:types>
-        <w:behaviors>
-          <w:behavior w:val="content"/>
-        </w:behaviors>
-        <w:guid w:val="{08C075C3-2CDA-46F8-8745-8EADABD3E5C9}"/>
-      </w:docPartPr>
-      <w:docPartBody>
-        <w:p>
-          <w:pPr>
-            <w:pStyle w:val="E50EBC09E417438CB8AA5BB7AAE1017C"/>
-          </w:pPr>
-          <w:r>
-            <w:rPr>
-              <w:rStyle w:val="PlaceholderText"/>
-            </w:rPr>
-            <w:t>[Title]</w:t>
-          </w:r>
-        </w:p>
-      </w:docPartBody>
-    </w:docPart>
-    <w:docPart>
-      <w:docPartPr>
-        <w:name w:val="AC7FA7CB34A64FB280DDB685D9E847A2"/>
-        <w:category>
-          <w:name w:val="General"/>
-          <w:gallery w:val="placeholder"/>
-        </w:category>
-        <w:types>
-          <w:type w:val="bbPlcHdr"/>
-        </w:types>
-        <w:behaviors>
-          <w:behavior w:val="content"/>
-        </w:behaviors>
-        <w:guid w:val="{68783085-DD96-4630-AED7-38EB058B9F70}"/>
-      </w:docPartPr>
-      <w:docPartBody>
-        <w:p>
-          <w:pPr>
-            <w:pStyle w:val="AC7FA7CB34A64FB280DDB685D9E847A2"/>
-          </w:pPr>
-          <w:r>
-            <w:rPr>
-              <w:rStyle w:val="PlaceholderText"/>
-            </w:rPr>
-            <w:t>[Subject]</w:t>
-          </w:r>
-        </w:p>
-      </w:docPartBody>
-    </w:docPart>
-  </w:docParts>
-</w:glossaryDocument>
-</file>
-
-<file path=word/glossary/fontTable.xml><?xml version="1.0" encoding="utf-8"?>
-<w:fonts xmlns:mc="http://schemas.openxmlformats.org/markup-compatibility/2006" xmlns:r="http://schemas.openxmlformats.org/officeDocument/2006/relationships" xmlns:w="http://schemas.openxmlformats.org/wordprocessingml/2006/main" xmlns:w14="http://schemas.microsoft.com/office/word/2010/wordml" xmlns:w15="http://schemas.microsoft.com/office/word/2012/wordml" xmlns:w16cex="http://schemas.microsoft.com/office/word/2018/wordml/cex" xmlns:w16cid="http://schemas.microsoft.com/office/word/2016/wordml/cid" xmlns:w16="http://schemas.microsoft.com/office/word/2018/wordml" xmlns:w16sdtdh="http://schemas.microsoft.com/office/word/2020/wordml/sdtdatahash" xmlns:w16se="http://schemas.microsoft.com/office/word/2015/wordml/symex" mc:Ignorable="w14 w15 w16se w16cid w16 w16cex w16sdtdh">
-  <w:font w:name="Times New Roman">
-    <w:panose1 w:val="02020603050405020304"/>
-    <w:charset w:val="00"/>
-    <w:family w:val="roman"/>
-    <w:pitch w:val="variable"/>
-    <w:sig w:usb0="E0002EFF" w:usb1="C000785B" w:usb2="00000009" w:usb3="00000000" w:csb0="000001FF" w:csb1="00000000"/>
-  </w:font>
-  <w:font w:name="Courier New">
-    <w:panose1 w:val="02070309020205020404"/>
-    <w:charset w:val="00"/>
-    <w:family w:val="modern"/>
-    <w:pitch w:val="fixed"/>
-    <w:sig w:usb0="E0002EFF" w:usb1="C0007843" w:usb2="00000009" w:usb3="00000000" w:csb0="000001FF" w:csb1="00000000"/>
-  </w:font>
-  <w:font w:name="Wingdings">
-    <w:panose1 w:val="05000000000000000000"/>
-    <w:charset w:val="02"/>
-    <w:family w:val="auto"/>
-    <w:pitch w:val="variable"/>
-    <w:sig w:usb0="00000000" w:usb1="10000000" w:usb2="00000000" w:usb3="00000000" w:csb0="80000000" w:csb1="00000000"/>
-  </w:font>
-  <w:font w:name="Symbol">
-    <w:panose1 w:val="05050102010706020507"/>
-    <w:charset w:val="02"/>
-    <w:family w:val="roman"/>
-    <w:pitch w:val="variable"/>
-    <w:sig w:usb0="00000000" w:usb1="10000000" w:usb2="00000000" w:usb3="00000000" w:csb0="80000000" w:csb1="00000000"/>
-  </w:font>
-  <w:font w:name="Calibri">
-    <w:panose1 w:val="020F0502020204030204"/>
-    <w:charset w:val="00"/>
-    <w:family w:val="swiss"/>
-    <w:pitch w:val="variable"/>
-    <w:sig w:usb0="E4002EFF" w:usb1="C000247B" w:usb2="00000009" w:usb3="00000000" w:csb0="000001FF" w:csb1="00000000"/>
-  </w:font>
-  <w:font w:name="Arial">
-    <w:panose1 w:val="020B0604020202020204"/>
-    <w:charset w:val="00"/>
-    <w:family w:val="swiss"/>
-    <w:pitch w:val="variable"/>
-    <w:sig w:usb0="E0002EFF" w:usb1="C000785B" w:usb2="00000009" w:usb3="00000000" w:csb0="000001FF" w:csb1="00000000"/>
-  </w:font>
-  <w:font w:name="Calibri Light">
-    <w:panose1 w:val="020F0302020204030204"/>
-    <w:charset w:val="00"/>
-    <w:family w:val="swiss"/>
-    <w:pitch w:val="variable"/>
-    <w:sig w:usb0="E4002EFF" w:usb1="C000247B" w:usb2="00000009" w:usb3="00000000" w:csb0="000001FF" w:csb1="00000000"/>
-  </w:font>
-  <w:font w:name="Monospac821 BT">
-    <w:panose1 w:val="020B0609020202020204"/>
-    <w:charset w:val="00"/>
-    <w:family w:val="modern"/>
-    <w:pitch w:val="fixed"/>
-    <w:sig w:usb0="00000087" w:usb1="00000000" w:usb2="00000000" w:usb3="00000000" w:csb0="0000001B" w:csb1="00000000"/>
-  </w:font>
-</w:fonts>
-</file>
-
-<file path=word/glossary/settings.xml><?xml version="1.0" encoding="utf-8"?>
-<w:settings xmlns:mc="http://schemas.openxmlformats.org/markup-compatibility/2006" xmlns:o="urn:schemas-microsoft-com:office:office" xmlns:r="http://schemas.openxmlformats.org/officeDocument/2006/relationships" xmlns:m="http://schemas.openxmlformats.org/officeDocument/2006/math" xmlns:v="urn:schemas-microsoft-com:vml" xmlns:w10="urn:schemas-microsoft-com:office:word" xmlns:w="http://schemas.openxmlformats.org/wordprocessingml/2006/main" xmlns:w14="http://schemas.microsoft.com/office/word/2010/wordml" xmlns:w15="http://schemas.microsoft.com/office/word/2012/wordml" xmlns:w16cex="http://schemas.microsoft.com/office/word/2018/wordml/cex" xmlns:w16cid="http://schemas.microsoft.com/office/word/2016/wordml/cid" xmlns:w16="http://schemas.microsoft.com/office/word/2018/wordml" xmlns:w16sdtdh="http://schemas.microsoft.com/office/word/2020/wordml/sdtdatahash" xmlns:w16se="http://schemas.microsoft.com/office/word/2015/wordml/symex" xmlns:sl="http://schemas.openxmlformats.org/schemaLibrary/2006/main" mc:Ignorable="w14 w15 w16se w16cid w16 w16cex w16sdtdh">
-  <w:view w:val="normal"/>
-  <w:defaultTabStop w:val="720"/>
-  <w:characterSpacingControl w:val="doNotCompress"/>
-  <w:compat>
-    <w:useFELayout/>
-    <w:compatSetting w:name="compatibilityMode" w:uri="http://schemas.microsoft.com/office/word" w:val="15"/>
-    <w:compatSetting w:name="overrideTableStyleFontSizeAndJustification" w:uri="http://schemas.microsoft.com/office/word" w:val="1"/>
-    <w:compatSetting w:name="enableOpenTypeFeatures" w:uri="http://schemas.microsoft.com/office/word" w:val="1"/>
-    <w:compatSetting w:name="doNotFlipMirrorIndents" w:uri="http://schemas.microsoft.com/office/word" w:val="1"/>
-    <w:compatSetting w:name="differentiateMultirowTableHeaders" w:uri="http://schemas.microsoft.com/office/word" w:val="1"/>
-    <w:compatSetting w:name="useWord2013TrackBottomHyphenation" w:uri="http://schemas.microsoft.com/office/word" w:val="0"/>
-  </w:compat>
-  <w:rsids>
-    <w:rsidRoot w:val="00102A86"/>
-    <w:rsid w:val="00102A86"/>
-  </w:rsids>
-  <m:mathPr>
-    <m:mathFont m:val="Cambria Math"/>
-    <m:brkBin m:val="before"/>
-    <m:brkBinSub m:val="--"/>
-    <m:smallFrac m:val="0"/>
-    <m:dispDef/>
-    <m:lMargin m:val="0"/>
-    <m:rMargin m:val="0"/>
-    <m:defJc m:val="centerGroup"/>
-    <m:wrapIndent m:val="1440"/>
-    <m:intLim m:val="subSup"/>
-    <m:naryLim m:val="undOvr"/>
-  </m:mathPr>
-  <w:themeFontLang w:val="en-US" w:bidi="ar-SA"/>
-  <w:clrSchemeMapping w:bg1="light1" w:t1="dark1" w:bg2="light2" w:t2="dark2" w:accent1="accent1" w:accent2="accent2" w:accent3="accent3" w:accent4="accent4" w:accent5="accent5" w:accent6="accent6" w:hyperlink="hyperlink" w:followedHyperlink="followedHyperlink"/>
-  <w:decimalSymbol w:val="."/>
-  <w:listSeparator w:val=","/>
-  <w15:chartTrackingRefBased/>
-</w:settings>
-</file>
-
-<file path=word/glossary/styles.xml><?xml version="1.0" encoding="utf-8"?>
-<w:styles xmlns:mc="http://schemas.openxmlformats.org/markup-compatibility/2006" xmlns:r="http://schemas.openxmlformats.org/officeDocument/2006/relationships" xmlns:w="http://schemas.openxmlformats.org/wordprocessingml/2006/main" xmlns:w14="http://schemas.microsoft.com/office/word/2010/wordml" xmlns:w15="http://schemas.microsoft.com/office/word/2012/wordml" xmlns:w16cex="http://schemas.microsoft.com/office/word/2018/wordml/cex" xmlns:w16cid="http://schemas.microsoft.com/office/word/2016/wordml/cid" xmlns:w16="http://schemas.microsoft.com/office/word/2018/wordml" xmlns:w16sdtdh="http://schemas.microsoft.com/office/word/2020/wordml/sdtdatahash" xmlns:w16se="http://schemas.microsoft.com/office/word/2015/wordml/symex" mc:Ignorable="w14 w15 w16se w16cid w16 w16cex w16sdtdh">
-  <w:docDefaults>
-    <w:rPrDefault>
-      <w:rPr>
-        <w:rFonts w:asciiTheme="minorHAnsi" w:eastAsiaTheme="minorEastAsia" w:hAnsiTheme="minorHAnsi" w:cstheme="minorBidi"/>
-        <w:sz w:val="22"/>
-        <w:szCs w:val="22"/>
-        <w:lang w:val="en-US" w:eastAsia="en-US" w:bidi="ar-SA"/>
-      </w:rPr>
-    </w:rPrDefault>
-    <w:pPrDefault>
-      <w:pPr>
-        <w:spacing w:after="160" w:line="259" w:lineRule="auto"/>
-      </w:pPr>
-    </w:pPrDefault>
-  </w:docDefaults>
-  <w:latentStyles w:defLockedState="0" w:defUIPriority="99" w:defSemiHidden="0" w:defUnhideWhenUsed="0" w:defQFormat="0" w:count="376">
-    <w:lsdException w:name="Normal" w:uiPriority="0" w:qFormat="1"/>
-    <w:lsdException w:name="heading 1" w:uiPriority="9" w:qFormat="1"/>
-    <w:lsdException w:name="heading 2" w:semiHidden="1" w:uiPriority="9" w:unhideWhenUsed="1" w:qFormat="1"/>
-    <w:lsdException w:name="heading 3" w:semiHidden="1" w:uiPriority="9" w:unhideWhenUsed="1" w:qFormat="1"/>
-    <w:lsdException w:name="heading 4" w:semiHidden="1" w:uiPriority="9" w:unhideWhenUsed="1" w:qFormat="1"/>
-    <w:lsdException w:name="heading 5" w:semiHidden="1" w:uiPriority="9" w:unhideWhenUsed="1" w:qFormat="1"/>
-    <w:lsdException w:name="heading 6" w:semiHidden="1" w:uiPriority="9" w:unhideWhenUsed="1" w:qFormat="1"/>
-    <w:lsdException w:name="heading 7" w:semiHidden="1" w:uiPriority="9" w:unhideWhenUsed="1" w:qFormat="1"/>
-    <w:lsdException w:name="heading 8" w:semiHidden="1" w:uiPriority="9" w:unhideWhenUsed="1" w:qFormat="1"/>
-    <w:lsdException w:name="heading 9" w:semiHidden="1" w:uiPriority="9" w:unhideWhenUsed="1" w:qFormat="1"/>
-    <w:lsdException w:name="index 1" w:semiHidden="1" w:unhideWhenUsed="1"/>
-    <w:lsdException w:name="index 2" w:semiHidden="1" w:unhideWhenUsed="1"/>
-    <w:lsdException w:name="index 3" w:semiHidden="1" w:unhideWhenUsed="1"/>
-    <w:lsdException w:name="index 4" w:semiHidden="1" w:unhideWhenUsed="1"/>
-    <w:lsdException w:name="index 5" w:semiHidden="1" w:unhideWhenUsed="1"/>
-    <w:lsdException w:name="index 6" w:semiHidden="1" w:unhideWhenUsed="1"/>
-    <w:lsdException w:name="index 7" w:semiHidden="1" w:unhideWhenUsed="1"/>
-    <w:lsdException w:name="index 8" w:semiHidden="1" w:unhideWhenUsed="1"/>
-    <w:lsdException w:name="index 9" w:semiHidden="1" w:unhideWhenUsed="1"/>
-    <w:lsdException w:name="toc 1" w:semiHidden="1" w:uiPriority="39" w:unhideWhenUsed="1"/>
-    <w:lsdException w:name="toc 2" w:semiHidden="1" w:uiPriority="39" w:unhideWhenUsed="1"/>
-    <w:lsdException w:name="toc 3" w:semiHidden="1" w:uiPriority="39" w:unhideWhenUsed="1"/>
-    <w:lsdException w:name="toc 4" w:semiHidden="1" w:uiPriority="39" w:unhideWhenUsed="1"/>
-    <w:lsdException w:name="toc 5" w:semiHidden="1" w:uiPriority="39" w:unhideWhenUsed="1"/>
-    <w:lsdException w:name="toc 6" w:semiHidden="1" w:uiPriority="39" w:unhideWhenUsed="1"/>
-    <w:lsdException w:name="toc 7" w:semiHidden="1" w:uiPriority="39" w:unhideWhenUsed="1"/>
-    <w:lsdException w:name="toc 8" w:semiHidden="1" w:uiPriority="39" w:unhideWhenUsed="1"/>
-    <w:lsdException w:name="toc 9" w:semiHidden="1" w:uiPriority="39" w:unhideWhenUsed="1"/>
-    <w:lsdException w:name="Normal Indent" w:semiHidden="1" w:unhideWhenUsed="1"/>
-    <w:lsdException w:name="footnote text" w:semiHidden="1" w:unhideWhenUsed="1"/>
-    <w:lsdException w:name="annotation text" w:semiHidden="1" w:unhideWhenUsed="1"/>
-    <w:lsdException w:name="header" w:semiHidden="1" w:unhideWhenUsed="1"/>
-    <w:lsdException w:name="footer" w:semiHidden="1" w:unhideWhenUsed="1"/>
-    <w:lsdException w:name="index heading" w:semiHidden="1" w:unhideWhenUsed="1"/>
-    <w:lsdException w:name="caption" w:semiHidden="1" w:uiPriority="35" w:unhideWhenUsed="1" w:qFormat="1"/>
-    <w:lsdException w:name="table of figures" w:semiHidden="1" w:unhideWhenUsed="1"/>
-    <w:lsdException w:name="envelope address" w:semiHidden="1" w:unhideWhenUsed="1"/>
-    <w:lsdException w:name="envelope return" w:semiHidden="1" w:unhideWhenUsed="1"/>
-    <w:lsdException w:name="footnote reference" w:semiHidden="1" w:unhideWhenUsed="1"/>
-    <w:lsdException w:name="annotation reference" w:semiHidden="1" w:unhideWhenUsed="1"/>
-    <w:lsdException w:name="line number" w:semiHidden="1" w:unhideWhenUsed="1"/>
-    <w:lsdException w:name="page number" w:semiHidden="1" w:unhideWhenUsed="1"/>
-    <w:lsdException w:name="endnote reference" w:semiHidden="1" w:unhideWhenUsed="1"/>
-    <w:lsdException w:name="endnote text" w:semiHidden="1" w:unhideWhenUsed="1"/>
-    <w:lsdException w:name="table of authorities" w:semiHidden="1" w:unhideWhenUsed="1"/>
-    <w:lsdException w:name="macro" w:semiHidden="1" w:unhideWhenUsed="1"/>
-    <w:lsdException w:name="toa heading" w:semiHidden="1" w:unhideWhenUsed="1"/>
-    <w:lsdException w:name="List" w:semiHidden="1" w:unhideWhenUsed="1"/>
-    <w:lsdException w:name="List Bullet" w:semiHidden="1" w:unhideWhenUsed="1"/>
-    <w:lsdException w:name="List Number" w:semiHidden="1" w:unhideWhenUsed="1"/>
-    <w:lsdException w:name="List 2" w:semiHidden="1" w:unhideWhenUsed="1"/>
-    <w:lsdException w:name="List 3" w:semiHidden="1" w:unhideWhenUsed="1"/>
-    <w:lsdException w:name="List 4" w:semiHidden="1" w:unhideWhenUsed="1"/>
-    <w:lsdException w:name="List 5" w:semiHidden="1" w:unhideWhenUsed="1"/>
-    <w:lsdException w:name="List Bullet 2" w:semiHidden="1" w:unhideWhenUsed="1"/>
-    <w:lsdException w:name="List Bullet 3" w:semiHidden="1" w:unhideWhenUsed="1"/>
-    <w:lsdException w:name="List Bullet 4" w:semiHidden="1" w:unhideWhenUsed="1"/>
-    <w:lsdException w:name="List Bullet 5" w:semiHidden="1" w:unhideWhenUsed="1"/>
-    <w:lsdException w:name="List Number 2" w:semiHidden="1" w:unhideWhenUsed="1"/>
-    <w:lsdException w:name="List Number 3" w:semiHidden="1" w:unhideWhenUsed="1"/>
-    <w:lsdException w:name="List Number 4" w:semiHidden="1" w:unhideWhenUsed="1"/>
-    <w:lsdException w:name="List Number 5" w:semiHidden="1" w:unhideWhenUsed="1"/>
-    <w:lsdException w:name="Title" w:uiPriority="10" w:qFormat="1"/>
-    <w:lsdException w:name="Closing" w:semiHidden="1" w:unhideWhenUsed="1"/>
-    <w:lsdException w:name="Signature" w:semiHidden="1" w:unhideWhenUsed="1"/>
-    <w:lsdException w:name="Default Paragraph Font" w:semiHidden="1" w:uiPriority="1" w:unhideWhenUsed="1"/>
-    <w:lsdException w:name="Body Text" w:semiHidden="1" w:unhideWhenUsed="1"/>
-    <w:lsdException w:name="Body Text Indent" w:semiHidden="1" w:unhideWhenUsed="1"/>
-    <w:lsdException w:name="List Continue" w:semiHidden="1" w:unhideWhenUsed="1"/>
-    <w:lsdException w:name="List Continue 2" w:semiHidden="1" w:unhideWhenUsed="1"/>
-    <w:lsdException w:name="List Continue 3" w:semiHidden="1" w:unhideWhenUsed="1"/>
-    <w:lsdException w:name="List Continue 4" w:semiHidden="1" w:unhideWhenUsed="1"/>
-    <w:lsdException w:name="List Continue 5" w:semiHidden="1" w:unhideWhenUsed="1"/>
-    <w:lsdException w:name="Message Header" w:semiHidden="1" w:unhideWhenUsed="1"/>
-    <w:lsdException w:name="Subtitle" w:uiPriority="11" w:qFormat="1"/>
-    <w:lsdException w:name="Salutation" w:semiHidden="1" w:unhideWhenUsed="1"/>
-    <w:lsdException w:name="Date" w:semiHidden="1" w:unhideWhenUsed="1"/>
-    <w:lsdException w:name="Body Text First Indent" w:semiHidden="1" w:unhideWhenUsed="1"/>
-    <w:lsdException w:name="Body Text First Indent 2" w:semiHidden="1" w:unhideWhenUsed="1"/>
-    <w:lsdException w:name="Note Heading" w:semiHidden="1" w:unhideWhenUsed="1"/>
-    <w:lsdException w:name="Body Text 2" w:semiHidden="1" w:unhideWhenUsed="1"/>
-    <w:lsdException w:name="Body Text 3" w:semiHidden="1" w:unhideWhenUsed="1"/>
-    <w:lsdException w:name="Body Text Indent 2" w:semiHidden="1" w:unhideWhenUsed="1"/>
-    <w:lsdException w:name="Body Text Indent 3" w:semiHidden="1" w:unhideWhenUsed="1"/>
-    <w:lsdException w:name="Block Text" w:semiHidden="1" w:unhideWhenUsed="1"/>
-    <w:lsdException w:name="Hyperlink" w:semiHidden="1" w:unhideWhenUsed="1"/>
-    <w:lsdException w:name="FollowedHyperlink" w:semiHidden="1" w:unhideWhenUsed="1"/>
-    <w:lsdException w:name="Strong" w:uiPriority="22" w:qFormat="1"/>
-    <w:lsdException w:name="Emphasis" w:uiPriority="20" w:qFormat="1"/>
-    <w:lsdException w:name="Document Map" w:semiHidden="1" w:unhideWhenUsed="1"/>
-    <w:lsdException w:name="Plain Text" w:semiHidden="1" w:unhideWhenUsed="1"/>
-    <w:lsdException w:name="E-mail Signature" w:semiHidden="1" w:unhideWhenUsed="1"/>
-    <w:lsdException w:name="HTML Top of Form" w:semiHidden="1" w:unhideWhenUsed="1"/>
-    <w:lsdException w:name="HTML Bottom of Form" w:semiHidden="1" w:unhideWhenUsed="1"/>
-    <w:lsdException w:name="Normal (Web)" w:semiHidden="1" w:unhideWhenUsed="1"/>
-    <w:lsdException w:name="HTML Acronym" w:semiHidden="1" w:unhideWhenUsed="1"/>
-    <w:lsdException w:name="HTML Address" w:semiHidden="1" w:unhideWhenUsed="1"/>
-    <w:lsdException w:name="HTML Cite" w:semiHidden="1" w:unhideWhenUsed="1"/>
-    <w:lsdException w:name="HTML Code" w:semiHidden="1" w:unhideWhenUsed="1"/>
-    <w:lsdException w:name="HTML Definition" w:semiHidden="1" w:unhideWhenUsed="1"/>
-    <w:lsdException w:name="HTML Keyboard" w:semiHidden="1" w:unhideWhenUsed="1"/>
-    <w:lsdException w:name="HTML Preformatted" w:semiHidden="1" w:unhideWhenUsed="1"/>
-    <w:lsdException w:name="HTML Sample" w:semiHidden="1" w:unhideWhenUsed="1"/>
-    <w:lsdException w:name="HTML Typewriter" w:semiHidden="1" w:unhideWhenUsed="1"/>
-    <w:lsdException w:name="HTML Variable" w:semiHidden="1" w:unhideWhenUsed="1"/>
-    <w:lsdException w:name="Normal Table" w:semiHidden="1" w:unhideWhenUsed="1"/>
-    <w:lsdException w:name="annotation subject" w:semiHidden="1" w:unhideWhenUsed="1"/>
-    <w:lsdException w:name="No List" w:semiHidden="1" w:unhideWhenUsed="1"/>
-    <w:lsdException w:name="Outline List 1" w:semiHidden="1" w:unhideWhenUsed="1"/>
-    <w:lsdException w:name="Outline List 2" w:semiHidden="1" w:unhideWhenUsed="1"/>
-    <w:lsdException w:name="Outline List 3" w:semiHidden="1" w:unhideWhenUsed="1"/>
-    <w:lsdException w:name="Table Simple 1" w:semiHidden="1" w:unhideWhenUsed="1"/>
-    <w:lsdException w:name="Table Simple 2" w:semiHidden="1" w:unhideWhenUsed="1"/>
-    <w:lsdException w:name="Table Simple 3" w:semiHidden="1" w:unhideWhenUsed="1"/>
-    <w:lsdException w:name="Table Classic 1" w:semiHidden="1" w:unhideWhenUsed="1"/>
-    <w:lsdException w:name="Table Classic 2" w:semiHidden="1" w:unhideWhenUsed="1"/>
-    <w:lsdException w:name="Table Classic 3" w:semiHidden="1" w:unhideWhenUsed="1"/>
-    <w:lsdException w:name="Table Classic 4" w:semiHidden="1" w:unhideWhenUsed="1"/>
-    <w:lsdException w:name="Table Colorful 1" w:semiHidden="1" w:unhideWhenUsed="1"/>
-    <w:lsdException w:name="Table Colorful 2" w:semiHidden="1" w:unhideWhenUsed="1"/>
-    <w:lsdException w:name="Table Colorful 3" w:semiHidden="1" w:unhideWhenUsed="1"/>
-    <w:lsdException w:name="Table Columns 1" w:semiHidden="1" w:unhideWhenUsed="1"/>
-    <w:lsdException w:name="Table Columns 2" w:semiHidden="1" w:unhideWhenUsed="1"/>
-    <w:lsdException w:name="Table Columns 3" w:semiHidden="1" w:unhideWhenUsed="1"/>
-    <w:lsdException w:name="Table Columns 4" w:semiHidden="1" w:unhideWhenUsed="1"/>
-    <w:lsdException w:name="Table Columns 5" w:semiHidden="1" w:unhideWhenUsed="1"/>
-    <w:lsdException w:name="Table Grid 1" w:semiHidden="1" w:unhideWhenUsed="1"/>
-    <w:lsdException w:name="Table Grid 2" w:semiHidden="1" w:unhideWhenUsed="1"/>
-    <w:lsdException w:name="Table Grid 3" w:semiHidden="1" w:unhideWhenUsed="1"/>
-    <w:lsdException w:name="Table Grid 4" w:semiHidden="1" w:unhideWhenUsed="1"/>
-    <w:lsdException w:name="Table Grid 5" w:semiHidden="1" w:unhideWhenUsed="1"/>
-    <w:lsdException w:name="Table Grid 6" w:semiHidden="1" w:unhideWhenUsed="1"/>
-    <w:lsdException w:name="Table Grid 7" w:semiHidden="1" w:unhideWhenUsed="1"/>
-    <w:lsdException w:name="Table Grid 8" w:semiHidden="1" w:unhideWhenUsed="1"/>
-    <w:lsdException w:name="Table List 1" w:semiHidden="1" w:unhideWhenUsed="1"/>
-    <w:lsdException w:name="Table List 2" w:semiHidden="1" w:unhideWhenUsed="1"/>
-    <w:lsdException w:name="Table List 3" w:semiHidden="1" w:unhideWhenUsed="1"/>
-    <w:lsdException w:name="Table List 4" w:semiHidden="1" w:unhideWhenUsed="1"/>
-    <w:lsdException w:name="Table List 5" w:semiHidden="1" w:unhideWhenUsed="1"/>
-    <w:lsdException w:name="Table List 6" w:semiHidden="1" w:unhideWhenUsed="1"/>
-    <w:lsdException w:name="Table List 7" w:semiHidden="1" w:unhideWhenUsed="1"/>
-    <w:lsdException w:name="Table List 8" w:semiHidden="1" w:unhideWhenUsed="1"/>
-    <w:lsdException w:name="Table 3D effects 1" w:semiHidden="1" w:unhideWhenUsed="1"/>
-    <w:lsdException w:name="Table 3D effects 2" w:semiHidden="1" w:unhideWhenUsed="1"/>
-    <w:lsdException w:name="Table 3D effects 3" w:semiHidden="1" w:unhideWhenUsed="1"/>
-    <w:lsdException w:name="Table Contemporary" w:semiHidden="1" w:unhideWhenUsed="1"/>
-    <w:lsdException w:name="Table Elegant" w:semiHidden="1" w:unhideWhenUsed="1"/>
-    <w:lsdException w:name="Table Professional" w:semiHidden="1" w:unhideWhenUsed="1"/>
-    <w:lsdException w:name="Table Subtle 1" w:semiHidden="1" w:unhideWhenUsed="1"/>
-    <w:lsdException w:name="Table Subtle 2" w:semiHidden="1" w:unhideWhenUsed="1"/>
-    <w:lsdException w:name="Table Web 1" w:semiHidden="1" w:unhideWhenUsed="1"/>
-    <w:lsdException w:name="Table Web 2" w:semiHidden="1" w:unhideWhenUsed="1"/>
-    <w:lsdException w:name="Table Web 3" w:semiHidden="1" w:unhideWhenUsed="1"/>
-    <w:lsdException w:name="Balloon Text" w:semiHidden="1" w:unhideWhenUsed="1"/>
-    <w:lsdException w:name="Table Grid" w:uiPriority="39"/>
-    <w:lsdException w:name="Table Theme" w:semiHidden="1" w:unhideWhenUsed="1"/>
-    <w:lsdException w:name="Placeholder Text" w:semiHidden="1"/>
-    <w:lsdException w:name="No Spacing" w:uiPriority="1" w:qFormat="1"/>
-    <w:lsdException w:name="Light Shading" w:uiPriority="60"/>
-    <w:lsdException w:name="Light List" w:uiPriority="61"/>
-    <w:lsdException w:name="Light Grid" w:uiPriority="62"/>
-    <w:lsdException w:name="Medium Shading 1" w:uiPriority="63"/>
-    <w:lsdException w:name="Medium Shading 2" w:uiPriority="64"/>
-    <w:lsdException w:name="Medium List 1" w:uiPriority="65"/>
-    <w:lsdException w:name="Medium List 2" w:uiPriority="66"/>
-    <w:lsdException w:name="Medium Grid 1" w:uiPriority="67"/>
-    <w:lsdException w:name="Medium Grid 2" w:uiPriority="68"/>
-    <w:lsdException w:name="Medium Grid 3" w:uiPriority="69"/>
-    <w:lsdException w:name="Dark List" w:uiPriority="70"/>
-    <w:lsdException w:name="Colorful Shading" w:uiPriority="71"/>
-    <w:lsdException w:name="Colorful List" w:uiPriority="72"/>
-    <w:lsdException w:name="Colorful Grid" w:uiPriority="73"/>
-    <w:lsdException w:name="Light Shading Accent 1" w:uiPriority="60"/>
-    <w:lsdException w:name="Light List Accent 1" w:uiPriority="61"/>
-    <w:lsdException w:name="Light Grid Accent 1" w:uiPriority="62"/>
-    <w:lsdException w:name="Medium Shading 1 Accent 1" w:uiPriority="63"/>
-    <w:lsdException w:name="Medium Shading 2 Accent 1" w:uiPriority="64"/>
-    <w:lsdException w:name="Medium List 1 Accent 1" w:uiPriority="65"/>
-    <w:lsdException w:name="Revision" w:semiHidden="1"/>
-    <w:lsdException w:name="List Paragraph" w:uiPriority="34" w:qFormat="1"/>
-    <w:lsdException w:name="Quote" w:uiPriority="29" w:qFormat="1"/>
-    <w:lsdException w:name="Intense Quote" w:uiPriority="30" w:qFormat="1"/>
-    <w:lsdException w:name="Medium List 2 Accent 1" w:uiPriority="66"/>
-    <w:lsdException w:name="Medium Grid 1 Accent 1" w:uiPriority="67"/>
-    <w:lsdException w:name="Medium Grid 2 Accent 1" w:uiPriority="68"/>
-    <w:lsdException w:name="Medium Grid 3 Accent 1" w:uiPriority="69"/>
-    <w:lsdException w:name="Dark List Accent 1" w:uiPriority="70"/>
-    <w:lsdException w:name="Colorful Shading Accent 1" w:uiPriority="71"/>
-    <w:lsdException w:name="Colorful List Accent 1" w:uiPriority="72"/>
-    <w:lsdException w:name="Colorful Grid Accent 1" w:uiPriority="73"/>
-    <w:lsdException w:name="Light Shading Accent 2" w:uiPriority="60"/>
-    <w:lsdException w:name="Light List Accent 2" w:uiPriority="61"/>
-    <w:lsdException w:name="Light Grid Accent 2" w:uiPriority="62"/>
-    <w:lsdException w:name="Medium Shading 1 Accent 2" w:uiPriority="63"/>
-    <w:lsdException w:name="Medium Shading 2 Accent 2" w:uiPriority="64"/>
-    <w:lsdException w:name="Medium List 1 Accent 2" w:uiPriority="65"/>
-    <w:lsdException w:name="Medium List 2 Accent 2" w:uiPriority="66"/>
-    <w:lsdException w:name="Medium Grid 1 Accent 2" w:uiPriority="67"/>
-    <w:lsdException w:name="Medium Grid 2 Accent 2" w:uiPriority="68"/>
-    <w:lsdException w:name="Medium Grid 3 Accent 2" w:uiPriority="69"/>
-    <w:lsdException w:name="Dark List Accent 2" w:uiPriority="70"/>
-    <w:lsdException w:name="Colorful Shading Accent 2" w:uiPriority="71"/>
-    <w:lsdException w:name="Colorful List Accent 2" w:uiPriority="72"/>
-    <w:lsdException w:name="Colorful Grid Accent 2" w:uiPriority="73"/>
-    <w:lsdException w:name="Light Shading Accent 3" w:uiPriority="60"/>
-    <w:lsdException w:name="Light List Accent 3" w:uiPriority="61"/>
-    <w:lsdException w:name="Light Grid Accent 3" w:uiPriority="62"/>
-    <w:lsdException w:name="Medium Shading 1 Accent 3" w:uiPriority="63"/>
-    <w:lsdException w:name="Medium Shading 2 Accent 3" w:uiPriority="64"/>
-    <w:lsdException w:name="Medium List 1 Accent 3" w:uiPriority="65"/>
-    <w:lsdException w:name="Medium List 2 Accent 3" w:uiPriority="66"/>
-    <w:lsdException w:name="Medium Grid 1 Accent 3" w:uiPriority="67"/>
-    <w:lsdException w:name="Medium Grid 2 Accent 3" w:uiPriority="68"/>
-    <w:lsdException w:name="Medium Grid 3 Accent 3" w:uiPriority="69"/>
-    <w:lsdException w:name="Dark List Accent 3" w:uiPriority="70"/>
-    <w:lsdException w:name="Colorful Shading Accent 3" w:uiPriority="71"/>
-    <w:lsdException w:name="Colorful List Accent 3" w:uiPriority="72"/>
-    <w:lsdException w:name="Colorful Grid Accent 3" w:uiPriority="73"/>
-    <w:lsdException w:name="Light Shading Accent 4" w:uiPriority="60"/>
-    <w:lsdException w:name="Light List Accent 4" w:uiPriority="61"/>
-    <w:lsdException w:name="Light Grid Accent 4" w:uiPriority="62"/>
-    <w:lsdException w:name="Medium Shading 1 Accent 4" w:uiPriority="63"/>
-    <w:lsdException w:name="Medium Shading 2 Accent 4" w:uiPriority="64"/>
-    <w:lsdException w:name="Medium List 1 Accent 4" w:uiPriority="65"/>
-    <w:lsdException w:name="Medium List 2 Accent 4" w:uiPriority="66"/>
-    <w:lsdException w:name="Medium Grid 1 Accent 4" w:uiPriority="67"/>
-    <w:lsdException w:name="Medium Grid 2 Accent 4" w:uiPriority="68"/>
-    <w:lsdException w:name="Medium Grid 3 Accent 4" w:uiPriority="69"/>
-    <w:lsdException w:name="Dark List Accent 4" w:uiPriority="70"/>
-    <w:lsdException w:name="Colorful Shading Accent 4" w:uiPriority="71"/>
-    <w:lsdException w:name="Colorful List Accent 4" w:uiPriority="72"/>
-    <w:lsdException w:name="Colorful Grid Accent 4" w:uiPriority="73"/>
-    <w:lsdException w:name="Light Shading Accent 5" w:uiPriority="60"/>
-    <w:lsdException w:name="Light List Accent 5" w:uiPriority="61"/>
-    <w:lsdException w:name="Light Grid Accent 5" w:uiPriority="62"/>
-    <w:lsdException w:name="Medium Shading 1 Accent 5" w:uiPriority="63"/>
-    <w:lsdException w:name="Medium Shading 2 Accent 5" w:uiPriority="64"/>
-    <w:lsdException w:name="Medium List 1 Accent 5" w:uiPriority="65"/>
-    <w:lsdException w:name="Medium List 2 Accent 5" w:uiPriority="66"/>
-    <w:lsdException w:name="Medium Grid 1 Accent 5" w:uiPriority="67"/>
-    <w:lsdException w:name="Medium Grid 2 Accent 5" w:uiPriority="68"/>
-    <w:lsdException w:name="Medium Grid 3 Accent 5" w:uiPriority="69"/>
-    <w:lsdException w:name="Dark List Accent 5" w:uiPriority="70"/>
-    <w:lsdException w:name="Colorful Shading Accent 5" w:uiPriority="71"/>
-    <w:lsdException w:name="Colorful List Accent 5" w:uiPriority="72"/>
-    <w:lsdException w:name="Colorful Grid Accent 5" w:uiPriority="73"/>
-    <w:lsdException w:name="Light Shading Accent 6" w:uiPriority="60"/>
-    <w:lsdException w:name="Light List Accent 6" w:uiPriority="61"/>
-    <w:lsdException w:name="Light Grid Accent 6" w:uiPriority="62"/>
-    <w:lsdException w:name="Medium Shading 1 Accent 6" w:uiPriority="63"/>
-    <w:lsdException w:name="Medium Shading 2 Accent 6" w:uiPriority="64"/>
-    <w:lsdException w:name="Medium List 1 Accent 6" w:uiPriority="65"/>
-    <w:lsdException w:name="Medium List 2 Accent 6" w:uiPriority="66"/>
-    <w:lsdException w:name="Medium Grid 1 Accent 6" w:uiPriority="67"/>
-    <w:lsdException w:name="Medium Grid 2 Accent 6" w:uiPriority="68"/>
-    <w:lsdException w:name="Medium Grid 3 Accent 6" w:uiPriority="69"/>
-    <w:lsdException w:name="Dark List Accent 6" w:uiPriority="70"/>
-    <w:lsdException w:name="Colorful Shading Accent 6" w:uiPriority="71"/>
-    <w:lsdException w:name="Colorful List Accent 6" w:uiPriority="72"/>
-    <w:lsdException w:name="Colorful Grid Accent 6" w:uiPriority="73"/>
-    <w:lsdException w:name="Subtle Emphasis" w:uiPriority="19" w:qFormat="1"/>
-    <w:lsdException w:name="Intense Emphasis" w:uiPriority="21" w:qFormat="1"/>
-    <w:lsdException w:name="Subtle Reference" w:uiPriority="31" w:qFormat="1"/>
-    <w:lsdException w:name="Intense Reference" w:uiPriority="32" w:qFormat="1"/>
-    <w:lsdException w:name="Book Title" w:uiPriority="33" w:qFormat="1"/>
-    <w:lsdException w:name="Bibliography" w:semiHidden="1" w:uiPriority="37" w:unhideWhenUsed="1"/>
-    <w:lsdException w:name="TOC Heading" w:semiHidden="1" w:uiPriority="39" w:unhideWhenUsed="1" w:qFormat="1"/>
-    <w:lsdException w:name="Plain Table 1" w:uiPriority="41"/>
-    <w:lsdException w:name="Plain Table 2" w:uiPriority="42"/>
-    <w:lsdException w:name="Plain Table 3" w:uiPriority="43"/>
-    <w:lsdException w:name="Plain Table 4" w:uiPriority="44"/>
-    <w:lsdException w:name="Plain Table 5" w:uiPriority="45"/>
-    <w:lsdException w:name="Grid Table Light" w:uiPriority="40"/>
-    <w:lsdException w:name="Grid Table 1 Light" w:uiPriority="46"/>
-    <w:lsdException w:name="Grid Table 2" w:uiPriority="47"/>
-    <w:lsdException w:name="Grid Table 3" w:uiPriority="48"/>
-    <w:lsdException w:name="Grid Table 4" w:uiPriority="49"/>
-    <w:lsdException w:name="Grid Table 5 Dark" w:uiPriority="50"/>
-    <w:lsdException w:name="Grid Table 6 Colorful" w:uiPriority="51"/>
-    <w:lsdException w:name="Grid Table 7 Colorful" w:uiPriority="52"/>
-    <w:lsdException w:name="Grid Table 1 Light Accent 1" w:uiPriority="46"/>
-    <w:lsdException w:name="Grid Table 2 Accent 1" w:uiPriority="47"/>
-    <w:lsdException w:name="Grid Table 3 Accent 1" w:uiPriority="48"/>
-    <w:lsdException w:name="Grid Table 4 Accent 1" w:uiPriority="49"/>
-    <w:lsdException w:name="Grid Table 5 Dark Accent 1" w:uiPriority="50"/>
-    <w:lsdException w:name="Grid Table 6 Colorful Accent 1" w:uiPriority="51"/>
-    <w:lsdException w:name="Grid Table 7 Colorful Accent 1" w:uiPriority="52"/>
-    <w:lsdException w:name="Grid Table 1 Light Accent 2" w:uiPriority="46"/>
-    <w:lsdException w:name="Grid Table 2 Accent 2" w:uiPriority="47"/>
-    <w:lsdException w:name="Grid Table 3 Accent 2" w:uiPriority="48"/>
-    <w:lsdException w:name="Grid Table 4 Accent 2" w:uiPriority="49"/>
-    <w:lsdException w:name="Grid Table 5 Dark Accent 2" w:uiPriority="50"/>
-    <w:lsdException w:name="Grid Table 6 Colorful Accent 2" w:uiPriority="51"/>
-    <w:lsdException w:name="Grid Table 7 Colorful Accent 2" w:uiPriority="52"/>
-    <w:lsdException w:name="Grid Table 1 Light Accent 3" w:uiPriority="46"/>
-    <w:lsdException w:name="Grid Table 2 Accent 3" w:uiPriority="47"/>
-    <w:lsdException w:name="Grid Table 3 Accent 3" w:uiPriority="48"/>
-    <w:lsdException w:name="Grid Table 4 Accent 3" w:uiPriority="49"/>
-    <w:lsdException w:name="Grid Table 5 Dark Accent 3" w:uiPriority="50"/>
-    <w:lsdException w:name="Grid Table 6 Colorful Accent 3" w:uiPriority="51"/>
-    <w:lsdException w:name="Grid Table 7 Colorful Accent 3" w:uiPriority="52"/>
-    <w:lsdException w:name="Grid Table 1 Light Accent 4" w:uiPriority="46"/>
-    <w:lsdException w:name="Grid Table 2 Accent 4" w:uiPriority="47"/>
-    <w:lsdException w:name="Grid Table 3 Accent 4" w:uiPriority="48"/>
-    <w:lsdException w:name="Grid Table 4 Accent 4" w:uiPriority="49"/>
-    <w:lsdException w:name="Grid Table 5 Dark Accent 4" w:uiPriority="50"/>
-    <w:lsdException w:name="Grid Table 6 Colorful Accent 4" w:uiPriority="51"/>
-    <w:lsdException w:name="Grid Table 7 Colorful Accent 4" w:uiPriority="52"/>
-    <w:lsdException w:name="Grid Table 1 Light Accent 5" w:uiPriority="46"/>
-    <w:lsdException w:name="Grid Table 2 Accent 5" w:uiPriority="47"/>
-    <w:lsdException w:name="Grid Table 3 Accent 5" w:uiPriority="48"/>
-    <w:lsdException w:name="Grid Table 4 Accent 5" w:uiPriority="49"/>
-    <w:lsdException w:name="Grid Table 5 Dark Accent 5" w:uiPriority="50"/>
-    <w:lsdException w:name="Grid Table 6 Colorful Accent 5" w:uiPriority="51"/>
-    <w:lsdException w:name="Grid Table 7 Colorful Accent 5" w:uiPriority="52"/>
-    <w:lsdException w:name="Grid Table 1 Light Accent 6" w:uiPriority="46"/>
-    <w:lsdException w:name="Grid Table 2 Accent 6" w:uiPriority="47"/>
-    <w:lsdException w:name="Grid Table 3 Accent 6" w:uiPriority="48"/>
-    <w:lsdException w:name="Grid Table 4 Accent 6" w:uiPriority="49"/>
-    <w:lsdException w:name="Grid Table 5 Dark Accent 6" w:uiPriority="50"/>
-    <w:lsdException w:name="Grid Table 6 Colorful Accent 6" w:uiPriority="51"/>
-    <w:lsdException w:name="Grid Table 7 Colorful Accent 6" w:uiPriority="52"/>
-    <w:lsdException w:name="List Table 1 Light" w:uiPriority="46"/>
-    <w:lsdException w:name="List Table 2" w:uiPriority="47"/>
-    <w:lsdException w:name="List Table 3" w:uiPriority="48"/>
-    <w:lsdException w:name="List Table 4" w:uiPriority="49"/>
-    <w:lsdException w:name="List Table 5 Dark" w:uiPriority="50"/>
-    <w:lsdException w:name="List Table 6 Colorful" w:uiPriority="51"/>
-    <w:lsdException w:name="List Table 7 Colorful" w:uiPriority="52"/>
-    <w:lsdException w:name="List Table 1 Light Accent 1" w:uiPriority="46"/>
-    <w:lsdException w:name="List Table 2 Accent 1" w:uiPriority="47"/>
-    <w:lsdException w:name="List Table 3 Accent 1" w:uiPriority="48"/>
-    <w:lsdException w:name="List Table 4 Accent 1" w:uiPriority="49"/>
-    <w:lsdException w:name="List Table 5 Dark Accent 1" w:uiPriority="50"/>
-    <w:lsdException w:name="List Table 6 Colorful Accent 1" w:uiPriority="51"/>
-    <w:lsdException w:name="List Table 7 Colorful Accent 1" w:uiPriority="52"/>
-    <w:lsdException w:name="List Table 1 Light Accent 2" w:uiPriority="46"/>
-    <w:lsdException w:name="List Table 2 Accent 2" w:uiPriority="47"/>
-    <w:lsdException w:name="List Table 3 Accent 2" w:uiPriority="48"/>
-    <w:lsdException w:name="List Table 4 Accent 2" w:uiPriority="49"/>
-    <w:lsdException w:name="List Table 5 Dark Accent 2" w:uiPriority="50"/>
-    <w:lsdException w:name="List Table 6 Colorful Accent 2" w:uiPriority="51"/>
-    <w:lsdException w:name="List Table 7 Colorful Accent 2" w:uiPriority="52"/>
-    <w:lsdException w:name="List Table 1 Light Accent 3" w:uiPriority="46"/>
-    <w:lsdException w:name="List Table 2 Accent 3" w:uiPriority="47"/>
-    <w:lsdException w:name="List Table 3 Accent 3" w:uiPriority="48"/>
-    <w:lsdException w:name="List Table 4 Accent 3" w:uiPriority="49"/>
-    <w:lsdException w:name="List Table 5 Dark Accent 3" w:uiPriority="50"/>
-    <w:lsdException w:name="List Table 6 Colorful Accent 3" w:uiPriority="51"/>
-    <w:lsdException w:name="List Table 7 Colorful Accent 3" w:uiPriority="52"/>
-    <w:lsdException w:name="List Table 1 Light Accent 4" w:uiPriority="46"/>
-    <w:lsdException w:name="List Table 2 Accent 4" w:uiPriority="47"/>
-    <w:lsdException w:name="List Table 3 Accent 4" w:uiPriority="48"/>
-    <w:lsdException w:name="List Table 4 Accent 4" w:uiPriority="49"/>
-    <w:lsdException w:name="List Table 5 Dark Accent 4" w:uiPriority="50"/>
-    <w:lsdException w:name="List Table 6 Colorful Accent 4" w:uiPriority="51"/>
-    <w:lsdException w:name="List Table 7 Colorful Accent 4" w:uiPriority="52"/>
-    <w:lsdException w:name="List Table 1 Light Accent 5" w:uiPriority="46"/>
-    <w:lsdException w:name="List Table 2 Accent 5" w:uiPriority="47"/>
-    <w:lsdException w:name="List Table 3 Accent 5" w:uiPriority="48"/>
-    <w:lsdException w:name="List Table 4 Accent 5" w:uiPriority="49"/>
-    <w:lsdException w:name="List Table 5 Dark Accent 5" w:uiPriority="50"/>
-    <w:lsdException w:name="List Table 6 Colorful Accent 5" w:uiPriority="51"/>
-    <w:lsdException w:name="List Table 7 Colorful Accent 5" w:uiPriority="52"/>
-    <w:lsdException w:name="List Table 1 Light Accent 6" w:uiPriority="46"/>
-    <w:lsdException w:name="List Table 2 Accent 6" w:uiPriority="47"/>
-    <w:lsdException w:name="List Table 3 Accent 6" w:uiPriority="48"/>
-    <w:lsdException w:name="List Table 4 Accent 6" w:uiPriority="49"/>
-    <w:lsdException w:name="List Table 5 Dark Accent 6" w:uiPriority="50"/>
-    <w:lsdException w:name="List Table 6 Colorful Accent 6" w:uiPriority="51"/>
-    <w:lsdException w:name="List Table 7 Colorful Accent 6" w:uiPriority="52"/>
-    <w:lsdException w:name="Mention" w:semiHidden="1" w:unhideWhenUsed="1"/>
-    <w:lsdException w:name="Smart Hyperlink" w:semiHidden="1" w:unhideWhenUsed="1"/>
-    <w:lsdException w:name="Hashtag" w:semiHidden="1" w:unhideWhenUsed="1"/>
-    <w:lsdException w:name="Unresolved Mention" w:semiHidden="1" w:unhideWhenUsed="1"/>
-    <w:lsdException w:name="Smart Link" w:semiHidden="1" w:unhideWhenUsed="1"/>
-  </w:latentStyles>
-  <w:style w:type="paragraph" w:default="1" w:styleId="Normal">
-    <w:name w:val="Normal"/>
-    <w:qFormat/>
-  </w:style>
-  <w:style w:type="character" w:default="1" w:styleId="DefaultParagraphFont">
-    <w:name w:val="Default Paragraph Font"/>
-    <w:uiPriority w:val="1"/>
-    <w:semiHidden/>
-    <w:unhideWhenUsed/>
-  </w:style>
-  <w:style w:type="table" w:default="1" w:styleId="TableNormal">
-    <w:name w:val="Normal Table"/>
-    <w:uiPriority w:val="99"/>
-    <w:semiHidden/>
-    <w:unhideWhenUsed/>
+  <w:style w:type="table" w:styleId="TableGrid">
+    <w:name w:val="Table Grid"/>
+    <w:basedOn w:val="TableNormal"/>
+    <w:uiPriority w:val="39"/>
+    <w:rsid w:val="0062276A"/>
+    <w:pPr>
+      <w:spacing w:after="0" w:line="240" w:lineRule="auto"/>
+    </w:pPr>
     <w:tblPr>
-      <w:tblInd w:w="0" w:type="dxa"/>
-      <w:tblCellMar>
-        <w:top w:w="0" w:type="dxa"/>
-        <w:left w:w="108" w:type="dxa"/>
-        <w:bottom w:w="0" w:type="dxa"/>
-        <w:right w:w="108" w:type="dxa"/>
-      </w:tblCellMar>
+      <w:tblBorders>
+        <w:top w:val="single" w:sz="4" w:space="0" w:color="auto"/>
+        <w:left w:val="single" w:sz="4" w:space="0" w:color="auto"/>
+        <w:bottom w:val="single" w:sz="4" w:space="0" w:color="auto"/>
+        <w:right w:val="single" w:sz="4" w:space="0" w:color="auto"/>
+        <w:insideH w:val="single" w:sz="4" w:space="0" w:color="auto"/>
+        <w:insideV w:val="single" w:sz="4" w:space="0" w:color="auto"/>
+      </w:tblBorders>
     </w:tblPr>
   </w:style>
-  <w:style w:type="numbering" w:default="1" w:styleId="NoList">
-    <w:name w:val="No List"/>
-    <w:uiPriority w:val="99"/>
-    <w:semiHidden/>
-    <w:unhideWhenUsed/>
-  </w:style>
-  <w:style w:type="character" w:styleId="PlaceholderText">
-    <w:name w:val="Placeholder Text"/>
-    <w:basedOn w:val="DefaultParagraphFont"/>
-    <w:uiPriority w:val="99"/>
-    <w:semiHidden/>
-    <w:rPr>
-      <w:color w:val="808080"/>
-    </w:rPr>
-  </w:style>
-  <w:style w:type="paragraph" w:customStyle="1" w:styleId="E50EBC09E417438CB8AA5BB7AAE1017C">
-    <w:name w:val="E50EBC09E417438CB8AA5BB7AAE1017C"/>
-  </w:style>
-  <w:style w:type="paragraph" w:customStyle="1" w:styleId="AC7FA7CB34A64FB280DDB685D9E847A2">
-    <w:name w:val="AC7FA7CB34A64FB280DDB685D9E847A2"/>
+  <w:style w:type="table" w:styleId="GridTable4-Accent1">
+    <w:name w:val="Grid Table 4 Accent 1"/>
+    <w:basedOn w:val="TableNormal"/>
+    <w:uiPriority w:val="49"/>
+    <w:rsid w:val="0062276A"/>
+    <w:pPr>
+      <w:spacing w:after="0" w:line="240" w:lineRule="auto"/>
+    </w:pPr>
+    <w:tblPr>
+      <w:tblStyleRowBandSize w:val="1"/>
+      <w:tblStyleColBandSize w:val="1"/>
+      <w:tblBorders>
+        <w:top w:val="single" w:sz="4" w:space="0" w:color="8EAADB" w:themeColor="accent1" w:themeTint="99"/>
+        <w:left w:val="single" w:sz="4" w:space="0" w:color="8EAADB" w:themeColor="accent1" w:themeTint="99"/>
+        <w:bottom w:val="single" w:sz="4" w:space="0" w:color="8EAADB" w:themeColor="accent1" w:themeTint="99"/>
+        <w:right w:val="single" w:sz="4" w:space="0" w:color="8EAADB" w:themeColor="accent1" w:themeTint="99"/>
+        <w:insideH w:val="single" w:sz="4" w:space="0" w:color="8EAADB" w:themeColor="accent1" w:themeTint="99"/>
+        <w:insideV w:val="single" w:sz="4" w:space="0" w:color="8EAADB" w:themeColor="accent1" w:themeTint="99"/>
+      </w:tblBorders>
+    </w:tblPr>
+    <w:tblStylePr w:type="firstRow">
+      <w:rPr>
+        <w:b/>
+        <w:bCs/>
+        <w:color w:val="FFFFFF" w:themeColor="background1"/>
+      </w:rPr>
+      <w:tblPr/>
+      <w:tcPr>
+        <w:tcBorders>
+          <w:top w:val="single" w:sz="4" w:space="0" w:color="4472C4" w:themeColor="accent1"/>
+          <w:left w:val="single" w:sz="4" w:space="0" w:color="4472C4" w:themeColor="accent1"/>
+          <w:bottom w:val="single" w:sz="4" w:space="0" w:color="4472C4" w:themeColor="accent1"/>
+          <w:right w:val="single" w:sz="4" w:space="0" w:color="4472C4" w:themeColor="accent1"/>
+          <w:insideH w:val="nil"/>
+          <w:insideV w:val="nil"/>
+        </w:tcBorders>
+        <w:shd w:val="clear" w:color="auto" w:fill="4472C4" w:themeFill="accent1"/>
+      </w:tcPr>
+    </w:tblStylePr>
+    <w:tblStylePr w:type="lastRow">
+      <w:rPr>
+        <w:b/>
+        <w:bCs/>
+      </w:rPr>
+      <w:tblPr/>
+      <w:tcPr>
+        <w:tcBorders>
+          <w:top w:val="double" w:sz="4" w:space="0" w:color="4472C4" w:themeColor="accent1"/>
+        </w:tcBorders>
+      </w:tcPr>
+    </w:tblStylePr>
+    <w:tblStylePr w:type="firstCol">
+      <w:rPr>
+        <w:b/>
+        <w:bCs/>
+      </w:rPr>
+    </w:tblStylePr>
+    <w:tblStylePr w:type="lastCol">
+      <w:rPr>
+        <w:b/>
+        <w:bCs/>
+      </w:rPr>
+    </w:tblStylePr>
+    <w:tblStylePr w:type="band1Vert">
+      <w:tblPr/>
+      <w:tcPr>
+        <w:shd w:val="clear" w:color="auto" w:fill="D9E2F3" w:themeFill="accent1" w:themeFillTint="33"/>
+      </w:tcPr>
+    </w:tblStylePr>
+    <w:tblStylePr w:type="band1Horz">
+      <w:tblPr/>
+      <w:tcPr>
+        <w:shd w:val="clear" w:color="auto" w:fill="D9E2F3" w:themeFill="accent1" w:themeFillTint="33"/>
+      </w:tcPr>
+    </w:tblStylePr>
   </w:style>
 </w:styles>
-</file>
-
-<file path=word/glossary/webSettings.xml><?xml version="1.0" encoding="utf-8"?>
-<w:webSettings xmlns:mc="http://schemas.openxmlformats.org/markup-compatibility/2006" xmlns:r="http://schemas.openxmlformats.org/officeDocument/2006/relationships" xmlns:w="http://schemas.openxmlformats.org/wordprocessingml/2006/main" xmlns:w14="http://schemas.microsoft.com/office/word/2010/wordml" xmlns:w15="http://schemas.microsoft.com/office/word/2012/wordml" xmlns:w16cex="http://schemas.microsoft.com/office/word/2018/wordml/cex" xmlns:w16cid="http://schemas.microsoft.com/office/word/2016/wordml/cid" xmlns:w16="http://schemas.microsoft.com/office/word/2018/wordml" xmlns:w16sdtdh="http://schemas.microsoft.com/office/word/2020/wordml/sdtdatahash" xmlns:w16se="http://schemas.microsoft.com/office/word/2015/wordml/symex" mc:Ignorable="w14 w15 w16se w16cid w16 w16cex w16sdtdh">
-  <w:optimizeForBrowser/>
-  <w:allowPNG/>
-</w:webSettings>
 </file>
 
 <file path=word/theme/theme1.xml><?xml version="1.0" encoding="utf-8"?>

</xml_diff>